<commit_message>
change sth in models
</commit_message>
<xml_diff>
--- a/ticketing.docx
+++ b/ticketing.docx
@@ -395,7 +395,6 @@
     <w:p>
       <w:pPr>
         <w:rPr>
-          <w:rFonts w:hint="cs"/>
           <w:rtl/>
           <w:lang w:bidi="fa-IR"/>
         </w:rPr>
@@ -5742,6 +5741,7 @@
       </w:pPr>
       <w:r>
         <w:rPr>
+          <w:noProof/>
           <w:rtl/>
           <w:lang w:bidi="fa-IR"/>
         </w:rPr>
@@ -5791,6 +5791,7 @@
       </w:pPr>
       <w:r>
         <w:rPr>
+          <w:noProof/>
           <w:rtl/>
           <w:lang w:bidi="fa-IR"/>
         </w:rPr>
@@ -6031,7 +6032,6 @@
     <w:p>
       <w:pPr>
         <w:rPr>
-          <w:rFonts w:hint="cs"/>
           <w:rtl/>
           <w:lang w:bidi="fa-IR"/>
         </w:rPr>
@@ -8409,8 +8409,1373 @@
     <w:p>
       <w:pPr>
         <w:rPr>
-          <w:rFonts w:hint="cs"/>
-          <w:rtl/>
+          <w:rtl/>
+          <w:lang w:bidi="fa-IR"/>
+        </w:rPr>
+      </w:pPr>
+      <w:r>
+        <w:rPr>
+          <w:rFonts w:hint="cs"/>
+          <w:rtl/>
+          <w:lang w:bidi="fa-IR"/>
+        </w:rPr>
+        <w:t>برای اعمال محدودیت برای ترکیب دوتا فیلد باید از روش زیر استفاده کنیم</w:t>
+      </w:r>
+    </w:p>
+    <w:p>
+      <w:pPr>
+        <w:shd w:val="clear" w:color="auto" w:fill="23272E"/>
+        <w:bidi w:val="0"/>
+        <w:spacing w:after="0" w:line="285" w:lineRule="atLeast"/>
+        <w:rPr>
+          <w:rFonts w:eastAsia="Times New Roman" w:cs="Times New Roman"/>
+          <w:color w:val="ABB2BF"/>
+          <w:kern w:val="0"/>
+          <w:sz w:val="21"/>
+          <w:szCs w:val="21"/>
+          <w14:ligatures w14:val="none"/>
+        </w:rPr>
+      </w:pPr>
+      <w:r>
+        <w:rPr>
+          <w:rFonts w:eastAsia="Times New Roman" w:cs="Times New Roman"/>
+          <w:color w:val="C678DD"/>
+          <w:kern w:val="0"/>
+          <w:sz w:val="21"/>
+          <w:szCs w:val="21"/>
+          <w14:ligatures w14:val="none"/>
+        </w:rPr>
+        <w:t>class</w:t>
+      </w:r>
+      <w:r>
+        <w:rPr>
+          <w:rFonts w:eastAsia="Times New Roman" w:cs="Times New Roman"/>
+          <w:color w:val="ABB2BF"/>
+          <w:kern w:val="0"/>
+          <w:sz w:val="21"/>
+          <w:szCs w:val="21"/>
+          <w14:ligatures w14:val="none"/>
+        </w:rPr>
+        <w:t xml:space="preserve"> </w:t>
+      </w:r>
+      <w:proofErr w:type="spellStart"/>
+      <w:r>
+        <w:rPr>
+          <w:rFonts w:eastAsia="Times New Roman" w:cs="Times New Roman"/>
+          <w:color w:val="E5C07B"/>
+          <w:kern w:val="0"/>
+          <w:sz w:val="21"/>
+          <w:szCs w:val="21"/>
+          <w14:ligatures w14:val="none"/>
+        </w:rPr>
+        <w:t>SeatModel</w:t>
+      </w:r>
+      <w:proofErr w:type="spellEnd"/>
+      <w:r>
+        <w:rPr>
+          <w:rFonts w:eastAsia="Times New Roman" w:cs="Times New Roman"/>
+          <w:color w:val="ABB2BF"/>
+          <w:kern w:val="0"/>
+          <w:sz w:val="21"/>
+          <w:szCs w:val="21"/>
+          <w14:ligatures w14:val="none"/>
+        </w:rPr>
+        <w:t>(</w:t>
+      </w:r>
+      <w:proofErr w:type="spellStart"/>
+      <w:proofErr w:type="gramStart"/>
+      <w:r>
+        <w:rPr>
+          <w:rFonts w:eastAsia="Times New Roman" w:cs="Times New Roman"/>
+          <w:color w:val="E5C07B"/>
+          <w:kern w:val="0"/>
+          <w:sz w:val="21"/>
+          <w:szCs w:val="21"/>
+          <w14:ligatures w14:val="none"/>
+        </w:rPr>
+        <w:t>models</w:t>
+      </w:r>
+      <w:r>
+        <w:rPr>
+          <w:rFonts w:eastAsia="Times New Roman" w:cs="Times New Roman"/>
+          <w:color w:val="ABB2BF"/>
+          <w:kern w:val="0"/>
+          <w:sz w:val="21"/>
+          <w:szCs w:val="21"/>
+          <w14:ligatures w14:val="none"/>
+        </w:rPr>
+        <w:t>.</w:t>
+      </w:r>
+      <w:r>
+        <w:rPr>
+          <w:rFonts w:eastAsia="Times New Roman" w:cs="Times New Roman"/>
+          <w:color w:val="E5C07B"/>
+          <w:kern w:val="0"/>
+          <w:sz w:val="21"/>
+          <w:szCs w:val="21"/>
+          <w14:ligatures w14:val="none"/>
+        </w:rPr>
+        <w:t>Model</w:t>
+      </w:r>
+      <w:proofErr w:type="spellEnd"/>
+      <w:proofErr w:type="gramEnd"/>
+      <w:r>
+        <w:rPr>
+          <w:rFonts w:eastAsia="Times New Roman" w:cs="Times New Roman"/>
+          <w:color w:val="ABB2BF"/>
+          <w:kern w:val="0"/>
+          <w:sz w:val="21"/>
+          <w:szCs w:val="21"/>
+          <w14:ligatures w14:val="none"/>
+        </w:rPr>
+        <w:t>):</w:t>
+      </w:r>
+    </w:p>
+    <w:p>
+      <w:pPr>
+        <w:shd w:val="clear" w:color="auto" w:fill="23272E"/>
+        <w:bidi w:val="0"/>
+        <w:spacing w:after="0" w:line="285" w:lineRule="atLeast"/>
+        <w:rPr>
+          <w:rFonts w:eastAsia="Times New Roman" w:cs="Times New Roman"/>
+          <w:color w:val="ABB2BF"/>
+          <w:kern w:val="0"/>
+          <w:sz w:val="21"/>
+          <w:szCs w:val="21"/>
+          <w14:ligatures w14:val="none"/>
+        </w:rPr>
+      </w:pPr>
+      <w:r>
+        <w:rPr>
+          <w:rFonts w:eastAsia="Times New Roman" w:cs="Times New Roman"/>
+          <w:color w:val="ABB2BF"/>
+          <w:kern w:val="0"/>
+          <w:sz w:val="21"/>
+          <w:szCs w:val="21"/>
+          <w14:ligatures w14:val="none"/>
+        </w:rPr>
+        <w:t xml:space="preserve">    </w:t>
+      </w:r>
+      <w:r>
+        <w:rPr>
+          <w:rFonts w:eastAsia="Times New Roman" w:cs="Times New Roman"/>
+          <w:color w:val="E06C75"/>
+          <w:kern w:val="0"/>
+          <w:sz w:val="21"/>
+          <w:szCs w:val="21"/>
+          <w14:ligatures w14:val="none"/>
+        </w:rPr>
+        <w:t>number</w:t>
+      </w:r>
+      <w:r>
+        <w:rPr>
+          <w:rFonts w:eastAsia="Times New Roman" w:cs="Times New Roman"/>
+          <w:color w:val="ABB2BF"/>
+          <w:kern w:val="0"/>
+          <w:sz w:val="21"/>
+          <w:szCs w:val="21"/>
+          <w14:ligatures w14:val="none"/>
+        </w:rPr>
+        <w:t xml:space="preserve"> </w:t>
+      </w:r>
+      <w:r>
+        <w:rPr>
+          <w:rFonts w:eastAsia="Times New Roman" w:cs="Times New Roman"/>
+          <w:color w:val="56B6C2"/>
+          <w:kern w:val="0"/>
+          <w:sz w:val="21"/>
+          <w:szCs w:val="21"/>
+          <w14:ligatures w14:val="none"/>
+        </w:rPr>
+        <w:t>=</w:t>
+      </w:r>
+      <w:r>
+        <w:rPr>
+          <w:rFonts w:eastAsia="Times New Roman" w:cs="Times New Roman"/>
+          <w:color w:val="ABB2BF"/>
+          <w:kern w:val="0"/>
+          <w:sz w:val="21"/>
+          <w:szCs w:val="21"/>
+          <w14:ligatures w14:val="none"/>
+        </w:rPr>
+        <w:t xml:space="preserve"> </w:t>
+      </w:r>
+      <w:proofErr w:type="spellStart"/>
+      <w:proofErr w:type="gramStart"/>
+      <w:r>
+        <w:rPr>
+          <w:rFonts w:eastAsia="Times New Roman" w:cs="Times New Roman"/>
+          <w:color w:val="E5C07B"/>
+          <w:kern w:val="0"/>
+          <w:sz w:val="21"/>
+          <w:szCs w:val="21"/>
+          <w14:ligatures w14:val="none"/>
+        </w:rPr>
+        <w:t>models</w:t>
+      </w:r>
+      <w:r>
+        <w:rPr>
+          <w:rFonts w:eastAsia="Times New Roman" w:cs="Times New Roman"/>
+          <w:color w:val="ABB2BF"/>
+          <w:kern w:val="0"/>
+          <w:sz w:val="21"/>
+          <w:szCs w:val="21"/>
+          <w14:ligatures w14:val="none"/>
+        </w:rPr>
+        <w:t>.</w:t>
+      </w:r>
+      <w:r>
+        <w:rPr>
+          <w:rFonts w:eastAsia="Times New Roman" w:cs="Times New Roman"/>
+          <w:color w:val="E5C07B"/>
+          <w:kern w:val="0"/>
+          <w:sz w:val="21"/>
+          <w:szCs w:val="21"/>
+          <w14:ligatures w14:val="none"/>
+        </w:rPr>
+        <w:t>PositiveIntegerField</w:t>
+      </w:r>
+      <w:proofErr w:type="spellEnd"/>
+      <w:proofErr w:type="gramEnd"/>
+      <w:r>
+        <w:rPr>
+          <w:rFonts w:eastAsia="Times New Roman" w:cs="Times New Roman"/>
+          <w:color w:val="ABB2BF"/>
+          <w:kern w:val="0"/>
+          <w:sz w:val="21"/>
+          <w:szCs w:val="21"/>
+          <w14:ligatures w14:val="none"/>
+        </w:rPr>
+        <w:t>()</w:t>
+      </w:r>
+    </w:p>
+    <w:p>
+      <w:pPr>
+        <w:shd w:val="clear" w:color="auto" w:fill="23272E"/>
+        <w:bidi w:val="0"/>
+        <w:spacing w:after="0" w:line="285" w:lineRule="atLeast"/>
+        <w:rPr>
+          <w:rFonts w:eastAsia="Times New Roman" w:cs="Times New Roman"/>
+          <w:color w:val="ABB2BF"/>
+          <w:kern w:val="0"/>
+          <w:sz w:val="21"/>
+          <w:szCs w:val="21"/>
+          <w14:ligatures w14:val="none"/>
+        </w:rPr>
+      </w:pPr>
+      <w:r>
+        <w:rPr>
+          <w:rFonts w:eastAsia="Times New Roman" w:cs="Times New Roman"/>
+          <w:color w:val="ABB2BF"/>
+          <w:kern w:val="0"/>
+          <w:sz w:val="21"/>
+          <w:szCs w:val="21"/>
+          <w14:ligatures w14:val="none"/>
+        </w:rPr>
+        <w:t xml:space="preserve">    </w:t>
+      </w:r>
+      <w:r>
+        <w:rPr>
+          <w:rFonts w:eastAsia="Times New Roman" w:cs="Times New Roman"/>
+          <w:color w:val="E06C75"/>
+          <w:kern w:val="0"/>
+          <w:sz w:val="21"/>
+          <w:szCs w:val="21"/>
+          <w14:ligatures w14:val="none"/>
+        </w:rPr>
+        <w:t>vehicle</w:t>
+      </w:r>
+      <w:r>
+        <w:rPr>
+          <w:rFonts w:eastAsia="Times New Roman" w:cs="Times New Roman"/>
+          <w:color w:val="ABB2BF"/>
+          <w:kern w:val="0"/>
+          <w:sz w:val="21"/>
+          <w:szCs w:val="21"/>
+          <w14:ligatures w14:val="none"/>
+        </w:rPr>
+        <w:t xml:space="preserve"> </w:t>
+      </w:r>
+      <w:r>
+        <w:rPr>
+          <w:rFonts w:eastAsia="Times New Roman" w:cs="Times New Roman"/>
+          <w:color w:val="56B6C2"/>
+          <w:kern w:val="0"/>
+          <w:sz w:val="21"/>
+          <w:szCs w:val="21"/>
+          <w14:ligatures w14:val="none"/>
+        </w:rPr>
+        <w:t>=</w:t>
+      </w:r>
+      <w:r>
+        <w:rPr>
+          <w:rFonts w:eastAsia="Times New Roman" w:cs="Times New Roman"/>
+          <w:color w:val="ABB2BF"/>
+          <w:kern w:val="0"/>
+          <w:sz w:val="21"/>
+          <w:szCs w:val="21"/>
+          <w14:ligatures w14:val="none"/>
+        </w:rPr>
+        <w:t xml:space="preserve"> </w:t>
+      </w:r>
+      <w:proofErr w:type="spellStart"/>
+      <w:proofErr w:type="gramStart"/>
+      <w:r>
+        <w:rPr>
+          <w:rFonts w:eastAsia="Times New Roman" w:cs="Times New Roman"/>
+          <w:color w:val="E5C07B"/>
+          <w:kern w:val="0"/>
+          <w:sz w:val="21"/>
+          <w:szCs w:val="21"/>
+          <w14:ligatures w14:val="none"/>
+        </w:rPr>
+        <w:t>models</w:t>
+      </w:r>
+      <w:r>
+        <w:rPr>
+          <w:rFonts w:eastAsia="Times New Roman" w:cs="Times New Roman"/>
+          <w:color w:val="ABB2BF"/>
+          <w:kern w:val="0"/>
+          <w:sz w:val="21"/>
+          <w:szCs w:val="21"/>
+          <w14:ligatures w14:val="none"/>
+        </w:rPr>
+        <w:t>.</w:t>
+      </w:r>
+      <w:r>
+        <w:rPr>
+          <w:rFonts w:eastAsia="Times New Roman" w:cs="Times New Roman"/>
+          <w:color w:val="E5C07B"/>
+          <w:kern w:val="0"/>
+          <w:sz w:val="21"/>
+          <w:szCs w:val="21"/>
+          <w14:ligatures w14:val="none"/>
+        </w:rPr>
+        <w:t>ForeignKey</w:t>
+      </w:r>
+      <w:proofErr w:type="spellEnd"/>
+      <w:proofErr w:type="gramEnd"/>
+      <w:r>
+        <w:rPr>
+          <w:rFonts w:eastAsia="Times New Roman" w:cs="Times New Roman"/>
+          <w:color w:val="ABB2BF"/>
+          <w:kern w:val="0"/>
+          <w:sz w:val="21"/>
+          <w:szCs w:val="21"/>
+          <w14:ligatures w14:val="none"/>
+        </w:rPr>
+        <w:t>(</w:t>
+      </w:r>
+      <w:r>
+        <w:rPr>
+          <w:rFonts w:eastAsia="Times New Roman" w:cs="Times New Roman"/>
+          <w:color w:val="98C379"/>
+          <w:kern w:val="0"/>
+          <w:sz w:val="21"/>
+          <w:szCs w:val="21"/>
+          <w14:ligatures w14:val="none"/>
+        </w:rPr>
+        <w:t>"</w:t>
+      </w:r>
+      <w:proofErr w:type="spellStart"/>
+      <w:r>
+        <w:rPr>
+          <w:rFonts w:eastAsia="Times New Roman" w:cs="Times New Roman"/>
+          <w:color w:val="98C379"/>
+          <w:kern w:val="0"/>
+          <w:sz w:val="21"/>
+          <w:szCs w:val="21"/>
+          <w14:ligatures w14:val="none"/>
+        </w:rPr>
+        <w:t>VehicleModel</w:t>
+      </w:r>
+      <w:proofErr w:type="spellEnd"/>
+      <w:r>
+        <w:rPr>
+          <w:rFonts w:eastAsia="Times New Roman" w:cs="Times New Roman"/>
+          <w:color w:val="98C379"/>
+          <w:kern w:val="0"/>
+          <w:sz w:val="21"/>
+          <w:szCs w:val="21"/>
+          <w14:ligatures w14:val="none"/>
+        </w:rPr>
+        <w:t>"</w:t>
+      </w:r>
+      <w:r>
+        <w:rPr>
+          <w:rFonts w:eastAsia="Times New Roman" w:cs="Times New Roman"/>
+          <w:color w:val="ABB2BF"/>
+          <w:kern w:val="0"/>
+          <w:sz w:val="21"/>
+          <w:szCs w:val="21"/>
+          <w14:ligatures w14:val="none"/>
+        </w:rPr>
+        <w:t xml:space="preserve">, </w:t>
+      </w:r>
+      <w:proofErr w:type="spellStart"/>
+      <w:r>
+        <w:rPr>
+          <w:rFonts w:eastAsia="Times New Roman" w:cs="Times New Roman"/>
+          <w:color w:val="E06C75"/>
+          <w:kern w:val="0"/>
+          <w:sz w:val="21"/>
+          <w:szCs w:val="21"/>
+          <w14:ligatures w14:val="none"/>
+        </w:rPr>
+        <w:t>on_delete</w:t>
+      </w:r>
+      <w:proofErr w:type="spellEnd"/>
+      <w:r>
+        <w:rPr>
+          <w:rFonts w:eastAsia="Times New Roman" w:cs="Times New Roman"/>
+          <w:color w:val="56B6C2"/>
+          <w:kern w:val="0"/>
+          <w:sz w:val="21"/>
+          <w:szCs w:val="21"/>
+          <w14:ligatures w14:val="none"/>
+        </w:rPr>
+        <w:t>=</w:t>
+      </w:r>
+      <w:proofErr w:type="spellStart"/>
+      <w:r>
+        <w:rPr>
+          <w:rFonts w:eastAsia="Times New Roman" w:cs="Times New Roman"/>
+          <w:color w:val="E5C07B"/>
+          <w:kern w:val="0"/>
+          <w:sz w:val="21"/>
+          <w:szCs w:val="21"/>
+          <w14:ligatures w14:val="none"/>
+        </w:rPr>
+        <w:t>models</w:t>
+      </w:r>
+      <w:r>
+        <w:rPr>
+          <w:rFonts w:eastAsia="Times New Roman" w:cs="Times New Roman"/>
+          <w:color w:val="ABB2BF"/>
+          <w:kern w:val="0"/>
+          <w:sz w:val="21"/>
+          <w:szCs w:val="21"/>
+          <w14:ligatures w14:val="none"/>
+        </w:rPr>
+        <w:t>.</w:t>
+      </w:r>
+      <w:r>
+        <w:rPr>
+          <w:rFonts w:eastAsia="Times New Roman" w:cs="Times New Roman"/>
+          <w:color w:val="61AFEF"/>
+          <w:kern w:val="0"/>
+          <w:sz w:val="21"/>
+          <w:szCs w:val="21"/>
+          <w14:ligatures w14:val="none"/>
+        </w:rPr>
+        <w:t>CASCADE</w:t>
+      </w:r>
+      <w:proofErr w:type="spellEnd"/>
+      <w:r>
+        <w:rPr>
+          <w:rFonts w:eastAsia="Times New Roman" w:cs="Times New Roman"/>
+          <w:color w:val="ABB2BF"/>
+          <w:kern w:val="0"/>
+          <w:sz w:val="21"/>
+          <w:szCs w:val="21"/>
+          <w14:ligatures w14:val="none"/>
+        </w:rPr>
+        <w:t>)</w:t>
+      </w:r>
+    </w:p>
+    <w:p>
+      <w:pPr>
+        <w:shd w:val="clear" w:color="auto" w:fill="23272E"/>
+        <w:bidi w:val="0"/>
+        <w:spacing w:after="0" w:line="285" w:lineRule="atLeast"/>
+        <w:rPr>
+          <w:rFonts w:eastAsia="Times New Roman" w:cs="Times New Roman"/>
+          <w:color w:val="ABB2BF"/>
+          <w:kern w:val="0"/>
+          <w:sz w:val="21"/>
+          <w:szCs w:val="21"/>
+          <w14:ligatures w14:val="none"/>
+        </w:rPr>
+      </w:pPr>
+    </w:p>
+    <w:p>
+      <w:pPr>
+        <w:shd w:val="clear" w:color="auto" w:fill="23272E"/>
+        <w:bidi w:val="0"/>
+        <w:spacing w:after="0" w:line="285" w:lineRule="atLeast"/>
+        <w:rPr>
+          <w:rFonts w:eastAsia="Times New Roman" w:cs="Times New Roman"/>
+          <w:color w:val="ABB2BF"/>
+          <w:kern w:val="0"/>
+          <w:sz w:val="21"/>
+          <w:szCs w:val="21"/>
+          <w14:ligatures w14:val="none"/>
+        </w:rPr>
+      </w:pPr>
+      <w:r>
+        <w:rPr>
+          <w:rFonts w:eastAsia="Times New Roman" w:cs="Times New Roman"/>
+          <w:color w:val="ABB2BF"/>
+          <w:kern w:val="0"/>
+          <w:sz w:val="21"/>
+          <w:szCs w:val="21"/>
+          <w14:ligatures w14:val="none"/>
+        </w:rPr>
+        <w:t xml:space="preserve">    </w:t>
+      </w:r>
+      <w:r>
+        <w:rPr>
+          <w:rFonts w:eastAsia="Times New Roman" w:cs="Times New Roman"/>
+          <w:color w:val="C678DD"/>
+          <w:kern w:val="0"/>
+          <w:sz w:val="21"/>
+          <w:szCs w:val="21"/>
+          <w14:ligatures w14:val="none"/>
+        </w:rPr>
+        <w:t>class</w:t>
+      </w:r>
+      <w:r>
+        <w:rPr>
+          <w:rFonts w:eastAsia="Times New Roman" w:cs="Times New Roman"/>
+          <w:color w:val="ABB2BF"/>
+          <w:kern w:val="0"/>
+          <w:sz w:val="21"/>
+          <w:szCs w:val="21"/>
+          <w14:ligatures w14:val="none"/>
+        </w:rPr>
+        <w:t xml:space="preserve"> </w:t>
+      </w:r>
+      <w:r>
+        <w:rPr>
+          <w:rFonts w:eastAsia="Times New Roman" w:cs="Times New Roman"/>
+          <w:color w:val="E5C07B"/>
+          <w:kern w:val="0"/>
+          <w:sz w:val="21"/>
+          <w:szCs w:val="21"/>
+          <w14:ligatures w14:val="none"/>
+        </w:rPr>
+        <w:t>Meta</w:t>
+      </w:r>
+      <w:r>
+        <w:rPr>
+          <w:rFonts w:eastAsia="Times New Roman" w:cs="Times New Roman"/>
+          <w:color w:val="ABB2BF"/>
+          <w:kern w:val="0"/>
+          <w:sz w:val="21"/>
+          <w:szCs w:val="21"/>
+          <w14:ligatures w14:val="none"/>
+        </w:rPr>
+        <w:t>:</w:t>
+      </w:r>
+    </w:p>
+    <w:p>
+      <w:pPr>
+        <w:shd w:val="clear" w:color="auto" w:fill="23272E"/>
+        <w:bidi w:val="0"/>
+        <w:spacing w:after="0" w:line="285" w:lineRule="atLeast"/>
+        <w:rPr>
+          <w:rFonts w:eastAsia="Times New Roman" w:cs="Times New Roman"/>
+          <w:color w:val="ABB2BF"/>
+          <w:kern w:val="0"/>
+          <w:sz w:val="21"/>
+          <w:szCs w:val="21"/>
+          <w14:ligatures w14:val="none"/>
+        </w:rPr>
+      </w:pPr>
+      <w:r>
+        <w:rPr>
+          <w:rFonts w:eastAsia="Times New Roman" w:cs="Times New Roman"/>
+          <w:color w:val="ABB2BF"/>
+          <w:kern w:val="0"/>
+          <w:sz w:val="21"/>
+          <w:szCs w:val="21"/>
+          <w14:ligatures w14:val="none"/>
+        </w:rPr>
+        <w:t xml:space="preserve">        </w:t>
+      </w:r>
+      <w:r>
+        <w:rPr>
+          <w:rFonts w:eastAsia="Times New Roman" w:cs="Times New Roman"/>
+          <w:color w:val="E06C75"/>
+          <w:kern w:val="0"/>
+          <w:sz w:val="21"/>
+          <w:szCs w:val="21"/>
+          <w14:ligatures w14:val="none"/>
+        </w:rPr>
+        <w:t>constraints</w:t>
+      </w:r>
+      <w:r>
+        <w:rPr>
+          <w:rFonts w:eastAsia="Times New Roman" w:cs="Times New Roman"/>
+          <w:color w:val="ABB2BF"/>
+          <w:kern w:val="0"/>
+          <w:sz w:val="21"/>
+          <w:szCs w:val="21"/>
+          <w14:ligatures w14:val="none"/>
+        </w:rPr>
+        <w:t xml:space="preserve"> </w:t>
+      </w:r>
+      <w:r>
+        <w:rPr>
+          <w:rFonts w:eastAsia="Times New Roman" w:cs="Times New Roman"/>
+          <w:color w:val="56B6C2"/>
+          <w:kern w:val="0"/>
+          <w:sz w:val="21"/>
+          <w:szCs w:val="21"/>
+          <w14:ligatures w14:val="none"/>
+        </w:rPr>
+        <w:t>=</w:t>
+      </w:r>
+      <w:r>
+        <w:rPr>
+          <w:rFonts w:eastAsia="Times New Roman" w:cs="Times New Roman"/>
+          <w:color w:val="ABB2BF"/>
+          <w:kern w:val="0"/>
+          <w:sz w:val="21"/>
+          <w:szCs w:val="21"/>
+          <w14:ligatures w14:val="none"/>
+        </w:rPr>
+        <w:t xml:space="preserve"> [</w:t>
+      </w:r>
+    </w:p>
+    <w:p>
+      <w:pPr>
+        <w:shd w:val="clear" w:color="auto" w:fill="23272E"/>
+        <w:bidi w:val="0"/>
+        <w:spacing w:after="0" w:line="285" w:lineRule="atLeast"/>
+        <w:rPr>
+          <w:rFonts w:eastAsia="Times New Roman" w:cs="Times New Roman"/>
+          <w:color w:val="ABB2BF"/>
+          <w:kern w:val="0"/>
+          <w:sz w:val="21"/>
+          <w:szCs w:val="21"/>
+          <w14:ligatures w14:val="none"/>
+        </w:rPr>
+      </w:pPr>
+      <w:r>
+        <w:rPr>
+          <w:rFonts w:eastAsia="Times New Roman" w:cs="Times New Roman"/>
+          <w:color w:val="ABB2BF"/>
+          <w:kern w:val="0"/>
+          <w:sz w:val="21"/>
+          <w:szCs w:val="21"/>
+          <w14:ligatures w14:val="none"/>
+        </w:rPr>
+        <w:t xml:space="preserve">            </w:t>
+      </w:r>
+      <w:proofErr w:type="spellStart"/>
+      <w:proofErr w:type="gramStart"/>
+      <w:r>
+        <w:rPr>
+          <w:rFonts w:eastAsia="Times New Roman" w:cs="Times New Roman"/>
+          <w:color w:val="E5C07B"/>
+          <w:kern w:val="0"/>
+          <w:sz w:val="21"/>
+          <w:szCs w:val="21"/>
+          <w14:ligatures w14:val="none"/>
+        </w:rPr>
+        <w:t>models</w:t>
+      </w:r>
+      <w:r>
+        <w:rPr>
+          <w:rFonts w:eastAsia="Times New Roman" w:cs="Times New Roman"/>
+          <w:color w:val="ABB2BF"/>
+          <w:kern w:val="0"/>
+          <w:sz w:val="21"/>
+          <w:szCs w:val="21"/>
+          <w14:ligatures w14:val="none"/>
+        </w:rPr>
+        <w:t>.</w:t>
+      </w:r>
+      <w:r>
+        <w:rPr>
+          <w:rFonts w:eastAsia="Times New Roman" w:cs="Times New Roman"/>
+          <w:color w:val="E5C07B"/>
+          <w:kern w:val="0"/>
+          <w:sz w:val="21"/>
+          <w:szCs w:val="21"/>
+          <w14:ligatures w14:val="none"/>
+        </w:rPr>
+        <w:t>UniqueConstraint</w:t>
+      </w:r>
+      <w:proofErr w:type="spellEnd"/>
+      <w:proofErr w:type="gramEnd"/>
+      <w:r>
+        <w:rPr>
+          <w:rFonts w:eastAsia="Times New Roman" w:cs="Times New Roman"/>
+          <w:color w:val="ABB2BF"/>
+          <w:kern w:val="0"/>
+          <w:sz w:val="21"/>
+          <w:szCs w:val="21"/>
+          <w14:ligatures w14:val="none"/>
+        </w:rPr>
+        <w:t>(</w:t>
+      </w:r>
+    </w:p>
+    <w:p>
+      <w:pPr>
+        <w:shd w:val="clear" w:color="auto" w:fill="23272E"/>
+        <w:bidi w:val="0"/>
+        <w:spacing w:after="0" w:line="285" w:lineRule="atLeast"/>
+        <w:rPr>
+          <w:rFonts w:eastAsia="Times New Roman" w:cs="Times New Roman"/>
+          <w:color w:val="ABB2BF"/>
+          <w:kern w:val="0"/>
+          <w:sz w:val="21"/>
+          <w:szCs w:val="21"/>
+          <w14:ligatures w14:val="none"/>
+        </w:rPr>
+      </w:pPr>
+      <w:r>
+        <w:rPr>
+          <w:rFonts w:eastAsia="Times New Roman" w:cs="Times New Roman"/>
+          <w:color w:val="ABB2BF"/>
+          <w:kern w:val="0"/>
+          <w:sz w:val="21"/>
+          <w:szCs w:val="21"/>
+          <w14:ligatures w14:val="none"/>
+        </w:rPr>
+        <w:t xml:space="preserve">                </w:t>
+      </w:r>
+      <w:r>
+        <w:rPr>
+          <w:rFonts w:eastAsia="Times New Roman" w:cs="Times New Roman"/>
+          <w:color w:val="E06C75"/>
+          <w:kern w:val="0"/>
+          <w:sz w:val="21"/>
+          <w:szCs w:val="21"/>
+          <w14:ligatures w14:val="none"/>
+        </w:rPr>
+        <w:t>fields</w:t>
+      </w:r>
+      <w:proofErr w:type="gramStart"/>
+      <w:r>
+        <w:rPr>
+          <w:rFonts w:eastAsia="Times New Roman" w:cs="Times New Roman"/>
+          <w:color w:val="56B6C2"/>
+          <w:kern w:val="0"/>
+          <w:sz w:val="21"/>
+          <w:szCs w:val="21"/>
+          <w14:ligatures w14:val="none"/>
+        </w:rPr>
+        <w:t>=</w:t>
+      </w:r>
+      <w:r>
+        <w:rPr>
+          <w:rFonts w:eastAsia="Times New Roman" w:cs="Times New Roman"/>
+          <w:color w:val="ABB2BF"/>
+          <w:kern w:val="0"/>
+          <w:sz w:val="21"/>
+          <w:szCs w:val="21"/>
+          <w14:ligatures w14:val="none"/>
+        </w:rPr>
+        <w:t>[</w:t>
+      </w:r>
+      <w:proofErr w:type="gramEnd"/>
+      <w:r>
+        <w:rPr>
+          <w:rFonts w:eastAsia="Times New Roman" w:cs="Times New Roman"/>
+          <w:color w:val="98C379"/>
+          <w:kern w:val="0"/>
+          <w:sz w:val="21"/>
+          <w:szCs w:val="21"/>
+          <w14:ligatures w14:val="none"/>
+        </w:rPr>
+        <w:t>"vehicle"</w:t>
+      </w:r>
+      <w:r>
+        <w:rPr>
+          <w:rFonts w:eastAsia="Times New Roman" w:cs="Times New Roman"/>
+          <w:color w:val="ABB2BF"/>
+          <w:kern w:val="0"/>
+          <w:sz w:val="21"/>
+          <w:szCs w:val="21"/>
+          <w14:ligatures w14:val="none"/>
+        </w:rPr>
+        <w:t xml:space="preserve">, </w:t>
+      </w:r>
+      <w:r>
+        <w:rPr>
+          <w:rFonts w:eastAsia="Times New Roman" w:cs="Times New Roman"/>
+          <w:color w:val="98C379"/>
+          <w:kern w:val="0"/>
+          <w:sz w:val="21"/>
+          <w:szCs w:val="21"/>
+          <w14:ligatures w14:val="none"/>
+        </w:rPr>
+        <w:t>"number"</w:t>
+      </w:r>
+      <w:r>
+        <w:rPr>
+          <w:rFonts w:eastAsia="Times New Roman" w:cs="Times New Roman"/>
+          <w:color w:val="ABB2BF"/>
+          <w:kern w:val="0"/>
+          <w:sz w:val="21"/>
+          <w:szCs w:val="21"/>
+          <w14:ligatures w14:val="none"/>
+        </w:rPr>
+        <w:t>],</w:t>
+      </w:r>
+    </w:p>
+    <w:p>
+      <w:pPr>
+        <w:shd w:val="clear" w:color="auto" w:fill="23272E"/>
+        <w:bidi w:val="0"/>
+        <w:spacing w:after="0" w:line="285" w:lineRule="atLeast"/>
+        <w:rPr>
+          <w:rFonts w:eastAsia="Times New Roman" w:cs="Times New Roman"/>
+          <w:color w:val="ABB2BF"/>
+          <w:kern w:val="0"/>
+          <w:sz w:val="21"/>
+          <w:szCs w:val="21"/>
+          <w14:ligatures w14:val="none"/>
+        </w:rPr>
+      </w:pPr>
+      <w:r>
+        <w:rPr>
+          <w:rFonts w:eastAsia="Times New Roman" w:cs="Times New Roman"/>
+          <w:color w:val="ABB2BF"/>
+          <w:kern w:val="0"/>
+          <w:sz w:val="21"/>
+          <w:szCs w:val="21"/>
+          <w14:ligatures w14:val="none"/>
+        </w:rPr>
+        <w:t xml:space="preserve">                </w:t>
+      </w:r>
+      <w:r>
+        <w:rPr>
+          <w:rFonts w:eastAsia="Times New Roman" w:cs="Times New Roman"/>
+          <w:color w:val="E06C75"/>
+          <w:kern w:val="0"/>
+          <w:sz w:val="21"/>
+          <w:szCs w:val="21"/>
+          <w14:ligatures w14:val="none"/>
+        </w:rPr>
+        <w:t>name</w:t>
+      </w:r>
+      <w:r>
+        <w:rPr>
+          <w:rFonts w:eastAsia="Times New Roman" w:cs="Times New Roman"/>
+          <w:color w:val="ABB2BF"/>
+          <w:kern w:val="0"/>
+          <w:sz w:val="21"/>
+          <w:szCs w:val="21"/>
+          <w14:ligatures w14:val="none"/>
+        </w:rPr>
+        <w:t xml:space="preserve"> </w:t>
+      </w:r>
+      <w:r>
+        <w:rPr>
+          <w:rFonts w:eastAsia="Times New Roman" w:cs="Times New Roman"/>
+          <w:color w:val="56B6C2"/>
+          <w:kern w:val="0"/>
+          <w:sz w:val="21"/>
+          <w:szCs w:val="21"/>
+          <w14:ligatures w14:val="none"/>
+        </w:rPr>
+        <w:t>=</w:t>
+      </w:r>
+      <w:r>
+        <w:rPr>
+          <w:rFonts w:eastAsia="Times New Roman" w:cs="Times New Roman"/>
+          <w:color w:val="ABB2BF"/>
+          <w:kern w:val="0"/>
+          <w:sz w:val="21"/>
+          <w:szCs w:val="21"/>
+          <w14:ligatures w14:val="none"/>
+        </w:rPr>
+        <w:t xml:space="preserve"> </w:t>
+      </w:r>
+      <w:r>
+        <w:rPr>
+          <w:rFonts w:eastAsia="Times New Roman" w:cs="Times New Roman"/>
+          <w:color w:val="98C379"/>
+          <w:kern w:val="0"/>
+          <w:sz w:val="21"/>
+          <w:szCs w:val="21"/>
+          <w14:ligatures w14:val="none"/>
+        </w:rPr>
+        <w:t>"</w:t>
+      </w:r>
+      <w:proofErr w:type="spellStart"/>
+      <w:r>
+        <w:rPr>
+          <w:rFonts w:eastAsia="Times New Roman" w:cs="Times New Roman"/>
+          <w:color w:val="98C379"/>
+          <w:kern w:val="0"/>
+          <w:sz w:val="21"/>
+          <w:szCs w:val="21"/>
+          <w14:ligatures w14:val="none"/>
+        </w:rPr>
+        <w:t>unique_seat_number_per_vehicle</w:t>
+      </w:r>
+      <w:proofErr w:type="spellEnd"/>
+      <w:r>
+        <w:rPr>
+          <w:rFonts w:eastAsia="Times New Roman" w:cs="Times New Roman"/>
+          <w:color w:val="98C379"/>
+          <w:kern w:val="0"/>
+          <w:sz w:val="21"/>
+          <w:szCs w:val="21"/>
+          <w14:ligatures w14:val="none"/>
+        </w:rPr>
+        <w:t>"</w:t>
+      </w:r>
+    </w:p>
+    <w:p>
+      <w:pPr>
+        <w:shd w:val="clear" w:color="auto" w:fill="23272E"/>
+        <w:bidi w:val="0"/>
+        <w:spacing w:after="0" w:line="285" w:lineRule="atLeast"/>
+        <w:rPr>
+          <w:rFonts w:eastAsia="Times New Roman" w:cs="Times New Roman"/>
+          <w:color w:val="ABB2BF"/>
+          <w:kern w:val="0"/>
+          <w:sz w:val="21"/>
+          <w:szCs w:val="21"/>
+          <w14:ligatures w14:val="none"/>
+        </w:rPr>
+      </w:pPr>
+      <w:r>
+        <w:rPr>
+          <w:rFonts w:eastAsia="Times New Roman" w:cs="Times New Roman"/>
+          <w:color w:val="ABB2BF"/>
+          <w:kern w:val="0"/>
+          <w:sz w:val="21"/>
+          <w:szCs w:val="21"/>
+          <w14:ligatures w14:val="none"/>
+        </w:rPr>
+        <w:t>            )</w:t>
+      </w:r>
+    </w:p>
+    <w:p>
+      <w:pPr>
+        <w:shd w:val="clear" w:color="auto" w:fill="23272E"/>
+        <w:bidi w:val="0"/>
+        <w:spacing w:after="0" w:line="285" w:lineRule="atLeast"/>
+        <w:rPr>
+          <w:rFonts w:eastAsia="Times New Roman" w:cs="Times New Roman"/>
+          <w:color w:val="ABB2BF"/>
+          <w:kern w:val="0"/>
+          <w:sz w:val="21"/>
+          <w:szCs w:val="21"/>
+          <w14:ligatures w14:val="none"/>
+        </w:rPr>
+      </w:pPr>
+      <w:r>
+        <w:rPr>
+          <w:rFonts w:eastAsia="Times New Roman" w:cs="Times New Roman"/>
+          <w:color w:val="ABB2BF"/>
+          <w:kern w:val="0"/>
+          <w:sz w:val="21"/>
+          <w:szCs w:val="21"/>
+          <w14:ligatures w14:val="none"/>
+        </w:rPr>
+        <w:t>        ]</w:t>
+      </w:r>
+    </w:p>
+    <w:p>
+      <w:pPr>
+        <w:shd w:val="clear" w:color="auto" w:fill="23272E"/>
+        <w:bidi w:val="0"/>
+        <w:spacing w:after="0" w:line="285" w:lineRule="atLeast"/>
+        <w:rPr>
+          <w:rFonts w:eastAsia="Times New Roman" w:cs="Times New Roman"/>
+          <w:color w:val="ABB2BF"/>
+          <w:kern w:val="0"/>
+          <w:sz w:val="21"/>
+          <w:szCs w:val="21"/>
+          <w14:ligatures w14:val="none"/>
+        </w:rPr>
+      </w:pPr>
+      <w:r>
+        <w:rPr>
+          <w:rFonts w:eastAsia="Times New Roman" w:cs="Times New Roman"/>
+          <w:color w:val="ABB2BF"/>
+          <w:kern w:val="0"/>
+          <w:sz w:val="21"/>
+          <w:szCs w:val="21"/>
+          <w14:ligatures w14:val="none"/>
+        </w:rPr>
+        <w:t xml:space="preserve">    </w:t>
+      </w:r>
+      <w:r>
+        <w:rPr>
+          <w:rFonts w:eastAsia="Times New Roman" w:cs="Times New Roman"/>
+          <w:color w:val="C678DD"/>
+          <w:kern w:val="0"/>
+          <w:sz w:val="21"/>
+          <w:szCs w:val="21"/>
+          <w14:ligatures w14:val="none"/>
+        </w:rPr>
+        <w:t>def</w:t>
+      </w:r>
+      <w:r>
+        <w:rPr>
+          <w:rFonts w:eastAsia="Times New Roman" w:cs="Times New Roman"/>
+          <w:color w:val="ABB2BF"/>
+          <w:kern w:val="0"/>
+          <w:sz w:val="21"/>
+          <w:szCs w:val="21"/>
+          <w14:ligatures w14:val="none"/>
+        </w:rPr>
+        <w:t xml:space="preserve"> </w:t>
+      </w:r>
+      <w:r>
+        <w:rPr>
+          <w:rFonts w:eastAsia="Times New Roman" w:cs="Times New Roman"/>
+          <w:color w:val="56B6C2"/>
+          <w:kern w:val="0"/>
+          <w:sz w:val="21"/>
+          <w:szCs w:val="21"/>
+          <w14:ligatures w14:val="none"/>
+        </w:rPr>
+        <w:t>__str__</w:t>
+      </w:r>
+      <w:r>
+        <w:rPr>
+          <w:rFonts w:eastAsia="Times New Roman" w:cs="Times New Roman"/>
+          <w:color w:val="ABB2BF"/>
+          <w:kern w:val="0"/>
+          <w:sz w:val="21"/>
+          <w:szCs w:val="21"/>
+          <w14:ligatures w14:val="none"/>
+        </w:rPr>
+        <w:t>(</w:t>
+      </w:r>
+      <w:r>
+        <w:rPr>
+          <w:rFonts w:eastAsia="Times New Roman" w:cs="Times New Roman"/>
+          <w:color w:val="E5C07B"/>
+          <w:kern w:val="0"/>
+          <w:sz w:val="21"/>
+          <w:szCs w:val="21"/>
+          <w14:ligatures w14:val="none"/>
+        </w:rPr>
+        <w:t>self</w:t>
+      </w:r>
+      <w:r>
+        <w:rPr>
+          <w:rFonts w:eastAsia="Times New Roman" w:cs="Times New Roman"/>
+          <w:color w:val="ABB2BF"/>
+          <w:kern w:val="0"/>
+          <w:sz w:val="21"/>
+          <w:szCs w:val="21"/>
+          <w14:ligatures w14:val="none"/>
+        </w:rPr>
+        <w:t>):</w:t>
+      </w:r>
+    </w:p>
+    <w:p>
+      <w:pPr>
+        <w:shd w:val="clear" w:color="auto" w:fill="23272E"/>
+        <w:bidi w:val="0"/>
+        <w:spacing w:after="0" w:line="285" w:lineRule="atLeast"/>
+        <w:rPr>
+          <w:rFonts w:eastAsia="Times New Roman" w:cs="Times New Roman"/>
+          <w:color w:val="ABB2BF"/>
+          <w:kern w:val="0"/>
+          <w:sz w:val="21"/>
+          <w:szCs w:val="21"/>
+          <w14:ligatures w14:val="none"/>
+        </w:rPr>
+      </w:pPr>
+      <w:r>
+        <w:rPr>
+          <w:rFonts w:eastAsia="Times New Roman" w:cs="Times New Roman"/>
+          <w:color w:val="ABB2BF"/>
+          <w:kern w:val="0"/>
+          <w:sz w:val="21"/>
+          <w:szCs w:val="21"/>
+          <w14:ligatures w14:val="none"/>
+        </w:rPr>
+        <w:t xml:space="preserve">        </w:t>
+      </w:r>
+      <w:r>
+        <w:rPr>
+          <w:rFonts w:eastAsia="Times New Roman" w:cs="Times New Roman"/>
+          <w:color w:val="C678DD"/>
+          <w:kern w:val="0"/>
+          <w:sz w:val="21"/>
+          <w:szCs w:val="21"/>
+          <w14:ligatures w14:val="none"/>
+        </w:rPr>
+        <w:t>return</w:t>
+      </w:r>
+      <w:r>
+        <w:rPr>
+          <w:rFonts w:eastAsia="Times New Roman" w:cs="Times New Roman"/>
+          <w:color w:val="ABB2BF"/>
+          <w:kern w:val="0"/>
+          <w:sz w:val="21"/>
+          <w:szCs w:val="21"/>
+          <w14:ligatures w14:val="none"/>
+        </w:rPr>
+        <w:t xml:space="preserve"> </w:t>
+      </w:r>
+      <w:r>
+        <w:rPr>
+          <w:rFonts w:eastAsia="Times New Roman" w:cs="Times New Roman"/>
+          <w:color w:val="C678DD"/>
+          <w:kern w:val="0"/>
+          <w:sz w:val="21"/>
+          <w:szCs w:val="21"/>
+          <w14:ligatures w14:val="none"/>
+        </w:rPr>
+        <w:t>f</w:t>
+      </w:r>
+      <w:r>
+        <w:rPr>
+          <w:rFonts w:eastAsia="Times New Roman" w:cs="Times New Roman"/>
+          <w:color w:val="98C379"/>
+          <w:kern w:val="0"/>
+          <w:sz w:val="21"/>
+          <w:szCs w:val="21"/>
+          <w14:ligatures w14:val="none"/>
+        </w:rPr>
+        <w:t>"</w:t>
+      </w:r>
+      <w:r>
+        <w:rPr>
+          <w:rFonts w:eastAsia="Times New Roman" w:cs="Times New Roman"/>
+          <w:color w:val="D19A66"/>
+          <w:kern w:val="0"/>
+          <w:sz w:val="21"/>
+          <w:szCs w:val="21"/>
+          <w14:ligatures w14:val="none"/>
+        </w:rPr>
+        <w:t>{</w:t>
+      </w:r>
+      <w:proofErr w:type="spellStart"/>
+      <w:proofErr w:type="gramStart"/>
+      <w:r>
+        <w:rPr>
+          <w:rFonts w:eastAsia="Times New Roman" w:cs="Times New Roman"/>
+          <w:color w:val="E5C07B"/>
+          <w:kern w:val="0"/>
+          <w:sz w:val="21"/>
+          <w:szCs w:val="21"/>
+          <w14:ligatures w14:val="none"/>
+        </w:rPr>
+        <w:t>self</w:t>
+      </w:r>
+      <w:r>
+        <w:rPr>
+          <w:rFonts w:eastAsia="Times New Roman" w:cs="Times New Roman"/>
+          <w:color w:val="ABB2BF"/>
+          <w:kern w:val="0"/>
+          <w:sz w:val="21"/>
+          <w:szCs w:val="21"/>
+          <w14:ligatures w14:val="none"/>
+        </w:rPr>
+        <w:t>.</w:t>
+      </w:r>
+      <w:r>
+        <w:rPr>
+          <w:rFonts w:eastAsia="Times New Roman" w:cs="Times New Roman"/>
+          <w:color w:val="E06C75"/>
+          <w:kern w:val="0"/>
+          <w:sz w:val="21"/>
+          <w:szCs w:val="21"/>
+          <w14:ligatures w14:val="none"/>
+        </w:rPr>
+        <w:t>number</w:t>
+      </w:r>
+      <w:proofErr w:type="spellEnd"/>
+      <w:proofErr w:type="gramEnd"/>
+      <w:r>
+        <w:rPr>
+          <w:rFonts w:eastAsia="Times New Roman" w:cs="Times New Roman"/>
+          <w:color w:val="D19A66"/>
+          <w:kern w:val="0"/>
+          <w:sz w:val="21"/>
+          <w:szCs w:val="21"/>
+          <w14:ligatures w14:val="none"/>
+        </w:rPr>
+        <w:t>}</w:t>
+      </w:r>
+      <w:r>
+        <w:rPr>
+          <w:rFonts w:eastAsia="Times New Roman" w:cs="Times New Roman"/>
+          <w:color w:val="98C379"/>
+          <w:kern w:val="0"/>
+          <w:sz w:val="21"/>
+          <w:szCs w:val="21"/>
+          <w14:ligatures w14:val="none"/>
+        </w:rPr>
+        <w:t xml:space="preserve"> from </w:t>
+      </w:r>
+      <w:r>
+        <w:rPr>
+          <w:rFonts w:eastAsia="Times New Roman" w:cs="Times New Roman"/>
+          <w:color w:val="D19A66"/>
+          <w:kern w:val="0"/>
+          <w:sz w:val="21"/>
+          <w:szCs w:val="21"/>
+          <w14:ligatures w14:val="none"/>
+        </w:rPr>
+        <w:t>{</w:t>
+      </w:r>
+      <w:proofErr w:type="spellStart"/>
+      <w:r>
+        <w:rPr>
+          <w:rFonts w:eastAsia="Times New Roman" w:cs="Times New Roman"/>
+          <w:color w:val="E5C07B"/>
+          <w:kern w:val="0"/>
+          <w:sz w:val="21"/>
+          <w:szCs w:val="21"/>
+          <w14:ligatures w14:val="none"/>
+        </w:rPr>
+        <w:t>self</w:t>
+      </w:r>
+      <w:r>
+        <w:rPr>
+          <w:rFonts w:eastAsia="Times New Roman" w:cs="Times New Roman"/>
+          <w:color w:val="ABB2BF"/>
+          <w:kern w:val="0"/>
+          <w:sz w:val="21"/>
+          <w:szCs w:val="21"/>
+          <w14:ligatures w14:val="none"/>
+        </w:rPr>
+        <w:t>.</w:t>
+      </w:r>
+      <w:r>
+        <w:rPr>
+          <w:rFonts w:eastAsia="Times New Roman" w:cs="Times New Roman"/>
+          <w:color w:val="E06C75"/>
+          <w:kern w:val="0"/>
+          <w:sz w:val="21"/>
+          <w:szCs w:val="21"/>
+          <w14:ligatures w14:val="none"/>
+        </w:rPr>
+        <w:t>vehicle</w:t>
+      </w:r>
+      <w:r>
+        <w:rPr>
+          <w:rFonts w:eastAsia="Times New Roman" w:cs="Times New Roman"/>
+          <w:color w:val="ABB2BF"/>
+          <w:kern w:val="0"/>
+          <w:sz w:val="21"/>
+          <w:szCs w:val="21"/>
+          <w14:ligatures w14:val="none"/>
+        </w:rPr>
+        <w:t>.type</w:t>
+      </w:r>
+      <w:proofErr w:type="spellEnd"/>
+      <w:r>
+        <w:rPr>
+          <w:rFonts w:eastAsia="Times New Roman" w:cs="Times New Roman"/>
+          <w:color w:val="D19A66"/>
+          <w:kern w:val="0"/>
+          <w:sz w:val="21"/>
+          <w:szCs w:val="21"/>
+          <w14:ligatures w14:val="none"/>
+        </w:rPr>
+        <w:t>}</w:t>
+      </w:r>
+      <w:r>
+        <w:rPr>
+          <w:rFonts w:eastAsia="Times New Roman" w:cs="Times New Roman"/>
+          <w:color w:val="98C379"/>
+          <w:kern w:val="0"/>
+          <w:sz w:val="21"/>
+          <w:szCs w:val="21"/>
+          <w14:ligatures w14:val="none"/>
+        </w:rPr>
+        <w:t xml:space="preserve"> - </w:t>
+      </w:r>
+      <w:r>
+        <w:rPr>
+          <w:rFonts w:eastAsia="Times New Roman" w:cs="Times New Roman"/>
+          <w:color w:val="D19A66"/>
+          <w:kern w:val="0"/>
+          <w:sz w:val="21"/>
+          <w:szCs w:val="21"/>
+          <w14:ligatures w14:val="none"/>
+        </w:rPr>
+        <w:t>{</w:t>
+      </w:r>
+      <w:proofErr w:type="spellStart"/>
+      <w:r>
+        <w:rPr>
+          <w:rFonts w:eastAsia="Times New Roman" w:cs="Times New Roman"/>
+          <w:color w:val="E5C07B"/>
+          <w:kern w:val="0"/>
+          <w:sz w:val="21"/>
+          <w:szCs w:val="21"/>
+          <w14:ligatures w14:val="none"/>
+        </w:rPr>
+        <w:t>self</w:t>
+      </w:r>
+      <w:r>
+        <w:rPr>
+          <w:rFonts w:eastAsia="Times New Roman" w:cs="Times New Roman"/>
+          <w:color w:val="ABB2BF"/>
+          <w:kern w:val="0"/>
+          <w:sz w:val="21"/>
+          <w:szCs w:val="21"/>
+          <w14:ligatures w14:val="none"/>
+        </w:rPr>
+        <w:t>.</w:t>
+      </w:r>
+      <w:r>
+        <w:rPr>
+          <w:rFonts w:eastAsia="Times New Roman" w:cs="Times New Roman"/>
+          <w:color w:val="E06C75"/>
+          <w:kern w:val="0"/>
+          <w:sz w:val="21"/>
+          <w:szCs w:val="21"/>
+          <w14:ligatures w14:val="none"/>
+        </w:rPr>
+        <w:t>vehicle</w:t>
+      </w:r>
+      <w:r>
+        <w:rPr>
+          <w:rFonts w:eastAsia="Times New Roman" w:cs="Times New Roman"/>
+          <w:color w:val="ABB2BF"/>
+          <w:kern w:val="0"/>
+          <w:sz w:val="21"/>
+          <w:szCs w:val="21"/>
+          <w14:ligatures w14:val="none"/>
+        </w:rPr>
+        <w:t>.model</w:t>
+      </w:r>
+      <w:proofErr w:type="spellEnd"/>
+      <w:r>
+        <w:rPr>
+          <w:rFonts w:eastAsia="Times New Roman" w:cs="Times New Roman"/>
+          <w:color w:val="D19A66"/>
+          <w:kern w:val="0"/>
+          <w:sz w:val="21"/>
+          <w:szCs w:val="21"/>
+          <w14:ligatures w14:val="none"/>
+        </w:rPr>
+        <w:t>}</w:t>
+      </w:r>
+      <w:r>
+        <w:rPr>
+          <w:rFonts w:eastAsia="Times New Roman" w:cs="Times New Roman"/>
+          <w:color w:val="98C379"/>
+          <w:kern w:val="0"/>
+          <w:sz w:val="21"/>
+          <w:szCs w:val="21"/>
+          <w14:ligatures w14:val="none"/>
+        </w:rPr>
+        <w:t>"</w:t>
+      </w:r>
+    </w:p>
+    <w:p>
+      <w:pPr>
+        <w:rPr>
+          <w:rtl/>
+          <w:lang w:bidi="fa-IR"/>
+        </w:rPr>
+      </w:pPr>
+    </w:p>
+    <w:p>
+      <w:pPr>
+        <w:rPr>
+          <w:rFonts w:hint="cs"/>
           <w:lang w:bidi="fa-IR"/>
         </w:rPr>
       </w:pPr>

</xml_diff>

<commit_message>
create signup and login
</commit_message>
<xml_diff>
--- a/ticketing.docx
+++ b/ticketing.docx
@@ -2446,7 +2446,6 @@
         </w:rPr>
         <w:t>برای اینکه در طراحی‌های بعدی اشتباه نکنید، همیشه این دو سوال را از خودتان بپرسید:آیا این مفهوم خودش ویژگی‌های دیگری دارد؟اگر بله $\</w:t>
       </w:r>
-      <w:proofErr w:type="spellStart"/>
       <w:r>
         <w:rPr>
           <w:b/>
@@ -2455,7 +2454,6 @@
         </w:rPr>
         <w:t>rightarrow</w:t>
       </w:r>
-      <w:proofErr w:type="spellEnd"/>
       <w:r>
         <w:rPr>
           <w:b/>
@@ -2465,7 +2463,6 @@
         </w:rPr>
         <w:t>$ موجودیت است. (مثال: صندلی خودش وضعیت پر/خالی بودن دارد، پس موجودیت است).اگر خیر $\</w:t>
       </w:r>
-      <w:proofErr w:type="spellStart"/>
       <w:r>
         <w:rPr>
           <w:b/>
@@ -2474,7 +2471,6 @@
         </w:rPr>
         <w:t>rightarrow</w:t>
       </w:r>
-      <w:proofErr w:type="spellEnd"/>
       <w:r>
         <w:rPr>
           <w:b/>
@@ -2579,7 +2575,6 @@
         </w:rPr>
         <w:t xml:space="preserve"> </w:t>
       </w:r>
-      <w:proofErr w:type="spellStart"/>
       <w:r>
         <w:rPr>
           <w:rFonts w:eastAsia="Times New Roman" w:cs="Times New Roman"/>
@@ -2635,7 +2630,6 @@
         </w:rPr>
         <w:t>exceptions</w:t>
       </w:r>
-      <w:proofErr w:type="spellEnd"/>
       <w:r>
         <w:rPr>
           <w:rFonts w:eastAsia="Times New Roman" w:cs="Times New Roman"/>
@@ -2669,7 +2663,6 @@
         </w:rPr>
         <w:t xml:space="preserve"> </w:t>
       </w:r>
-      <w:proofErr w:type="spellStart"/>
       <w:r>
         <w:rPr>
           <w:rFonts w:eastAsia="Times New Roman" w:cs="Times New Roman"/>
@@ -2681,7 +2674,6 @@
         </w:rPr>
         <w:t>ValidationError</w:t>
       </w:r>
-      <w:proofErr w:type="spellEnd"/>
     </w:p>
     <w:p>
       <w:pPr>
@@ -2719,7 +2711,6 @@
         </w:rPr>
         <w:t xml:space="preserve"> </w:t>
       </w:r>
-      <w:proofErr w:type="spellStart"/>
       <w:r>
         <w:rPr>
           <w:rFonts w:eastAsia="Times New Roman" w:cs="Times New Roman"/>
@@ -2775,7 +2766,6 @@
         </w:rPr>
         <w:t>validators</w:t>
       </w:r>
-      <w:proofErr w:type="spellEnd"/>
       <w:r>
         <w:rPr>
           <w:rFonts w:eastAsia="Times New Roman" w:cs="Times New Roman"/>
@@ -2809,7 +2799,6 @@
         </w:rPr>
         <w:t xml:space="preserve"> </w:t>
       </w:r>
-      <w:proofErr w:type="spellStart"/>
       <w:r>
         <w:rPr>
           <w:rFonts w:eastAsia="Times New Roman" w:cs="Times New Roman"/>
@@ -2821,7 +2810,6 @@
         </w:rPr>
         <w:t>MinValueValidator</w:t>
       </w:r>
-      <w:proofErr w:type="spellEnd"/>
     </w:p>
     <w:p>
       <w:pPr>
@@ -2891,7 +2879,6 @@
         </w:rPr>
         <w:t xml:space="preserve"> </w:t>
       </w:r>
-      <w:proofErr w:type="spellStart"/>
       <w:r>
         <w:rPr>
           <w:rFonts w:eastAsia="Times New Roman" w:cs="Times New Roman"/>
@@ -2903,7 +2890,6 @@
         </w:rPr>
         <w:t>TripsModel</w:t>
       </w:r>
-      <w:proofErr w:type="spellEnd"/>
       <w:r>
         <w:rPr>
           <w:rFonts w:eastAsia="Times New Roman" w:cs="Times New Roman"/>
@@ -2915,7 +2901,6 @@
         </w:rPr>
         <w:t>(</w:t>
       </w:r>
-      <w:proofErr w:type="spellStart"/>
       <w:r>
         <w:rPr>
           <w:rFonts w:eastAsia="Times New Roman" w:cs="Times New Roman"/>
@@ -2949,7 +2934,6 @@
         </w:rPr>
         <w:t>Model</w:t>
       </w:r>
-      <w:proofErr w:type="spellEnd"/>
       <w:r>
         <w:rPr>
           <w:rFonts w:eastAsia="Times New Roman" w:cs="Times New Roman"/>
@@ -2987,7 +2971,6 @@
         </w:rPr>
         <w:t xml:space="preserve">    </w:t>
       </w:r>
-      <w:proofErr w:type="spellStart"/>
       <w:r>
         <w:rPr>
           <w:rFonts w:eastAsia="Times New Roman" w:cs="Times New Roman"/>
@@ -2999,7 +2982,6 @@
         </w:rPr>
         <w:t>origin_terminal</w:t>
       </w:r>
-      <w:proofErr w:type="spellEnd"/>
       <w:r>
         <w:rPr>
           <w:rFonts w:eastAsia="Times New Roman" w:cs="Times New Roman"/>
@@ -3033,7 +3015,6 @@
         </w:rPr>
         <w:t xml:space="preserve"> </w:t>
       </w:r>
-      <w:proofErr w:type="spellStart"/>
       <w:r>
         <w:rPr>
           <w:rFonts w:eastAsia="Times New Roman" w:cs="Times New Roman"/>
@@ -3067,7 +3048,6 @@
         </w:rPr>
         <w:t>ForeignKey</w:t>
       </w:r>
-      <w:proofErr w:type="spellEnd"/>
       <w:r>
         <w:rPr>
           <w:rFonts w:eastAsia="Times New Roman" w:cs="Times New Roman"/>
@@ -3088,31 +3068,7 @@
           <w:szCs w:val="21"/>
           <w14:ligatures w14:val="none"/>
         </w:rPr>
-        <w:t>"</w:t>
-      </w:r>
-      <w:proofErr w:type="spellStart"/>
-      <w:r>
-        <w:rPr>
-          <w:rFonts w:eastAsia="Times New Roman" w:cs="Times New Roman"/>
-          <w:color w:val="98C379"/>
-          <w:kern w:val="0"/>
-          <w:sz w:val="21"/>
-          <w:szCs w:val="21"/>
-          <w14:ligatures w14:val="none"/>
-        </w:rPr>
-        <w:t>TerminalModel</w:t>
-      </w:r>
-      <w:proofErr w:type="spellEnd"/>
-      <w:r>
-        <w:rPr>
-          <w:rFonts w:eastAsia="Times New Roman" w:cs="Times New Roman"/>
-          <w:color w:val="98C379"/>
-          <w:kern w:val="0"/>
-          <w:sz w:val="21"/>
-          <w:szCs w:val="21"/>
-          <w14:ligatures w14:val="none"/>
-        </w:rPr>
-        <w:t>"</w:t>
+        <w:t>"TerminalModel"</w:t>
       </w:r>
       <w:r>
         <w:rPr>
@@ -3125,7 +3081,6 @@
         </w:rPr>
         <w:t xml:space="preserve">, </w:t>
       </w:r>
-      <w:proofErr w:type="spellStart"/>
       <w:r>
         <w:rPr>
           <w:rFonts w:eastAsia="Times New Roman" w:cs="Times New Roman"/>
@@ -3137,7 +3092,6 @@
         </w:rPr>
         <w:t>on_delete</w:t>
       </w:r>
-      <w:proofErr w:type="spellEnd"/>
       <w:r>
         <w:rPr>
           <w:rFonts w:eastAsia="Times New Roman" w:cs="Times New Roman"/>
@@ -3149,7 +3103,6 @@
         </w:rPr>
         <w:t>=</w:t>
       </w:r>
-      <w:proofErr w:type="spellStart"/>
       <w:r>
         <w:rPr>
           <w:rFonts w:eastAsia="Times New Roman" w:cs="Times New Roman"/>
@@ -3183,7 +3136,6 @@
         </w:rPr>
         <w:t>CASCADE</w:t>
       </w:r>
-      <w:proofErr w:type="spellEnd"/>
       <w:r>
         <w:rPr>
           <w:rFonts w:eastAsia="Times New Roman" w:cs="Times New Roman"/>
@@ -3221,7 +3173,6 @@
         </w:rPr>
         <w:t xml:space="preserve">    </w:t>
       </w:r>
-      <w:proofErr w:type="spellStart"/>
       <w:r>
         <w:rPr>
           <w:rFonts w:eastAsia="Times New Roman" w:cs="Times New Roman"/>
@@ -3233,7 +3184,6 @@
         </w:rPr>
         <w:t>destination_terminal</w:t>
       </w:r>
-      <w:proofErr w:type="spellEnd"/>
       <w:r>
         <w:rPr>
           <w:rFonts w:eastAsia="Times New Roman" w:cs="Times New Roman"/>
@@ -3267,7 +3217,6 @@
         </w:rPr>
         <w:t xml:space="preserve"> </w:t>
       </w:r>
-      <w:proofErr w:type="spellStart"/>
       <w:r>
         <w:rPr>
           <w:rFonts w:eastAsia="Times New Roman" w:cs="Times New Roman"/>
@@ -3301,7 +3250,6 @@
         </w:rPr>
         <w:t>ForeignKey</w:t>
       </w:r>
-      <w:proofErr w:type="spellEnd"/>
       <w:r>
         <w:rPr>
           <w:rFonts w:eastAsia="Times New Roman" w:cs="Times New Roman"/>
@@ -3322,31 +3270,7 @@
           <w:szCs w:val="21"/>
           <w14:ligatures w14:val="none"/>
         </w:rPr>
-        <w:t>"</w:t>
-      </w:r>
-      <w:proofErr w:type="spellStart"/>
-      <w:r>
-        <w:rPr>
-          <w:rFonts w:eastAsia="Times New Roman" w:cs="Times New Roman"/>
-          <w:color w:val="98C379"/>
-          <w:kern w:val="0"/>
-          <w:sz w:val="21"/>
-          <w:szCs w:val="21"/>
-          <w14:ligatures w14:val="none"/>
-        </w:rPr>
-        <w:t>TerminalModel</w:t>
-      </w:r>
-      <w:proofErr w:type="spellEnd"/>
-      <w:r>
-        <w:rPr>
-          <w:rFonts w:eastAsia="Times New Roman" w:cs="Times New Roman"/>
-          <w:color w:val="98C379"/>
-          <w:kern w:val="0"/>
-          <w:sz w:val="21"/>
-          <w:szCs w:val="21"/>
-          <w14:ligatures w14:val="none"/>
-        </w:rPr>
-        <w:t>"</w:t>
+        <w:t>"TerminalModel"</w:t>
       </w:r>
       <w:r>
         <w:rPr>
@@ -3359,7 +3283,6 @@
         </w:rPr>
         <w:t xml:space="preserve">, </w:t>
       </w:r>
-      <w:proofErr w:type="spellStart"/>
       <w:r>
         <w:rPr>
           <w:rFonts w:eastAsia="Times New Roman" w:cs="Times New Roman"/>
@@ -3371,7 +3294,6 @@
         </w:rPr>
         <w:t>on_delete</w:t>
       </w:r>
-      <w:proofErr w:type="spellEnd"/>
       <w:r>
         <w:rPr>
           <w:rFonts w:eastAsia="Times New Roman" w:cs="Times New Roman"/>
@@ -3383,7 +3305,6 @@
         </w:rPr>
         <w:t>=</w:t>
       </w:r>
-      <w:proofErr w:type="spellStart"/>
       <w:r>
         <w:rPr>
           <w:rFonts w:eastAsia="Times New Roman" w:cs="Times New Roman"/>
@@ -3417,7 +3338,6 @@
         </w:rPr>
         <w:t>CASCADE</w:t>
       </w:r>
-      <w:proofErr w:type="spellEnd"/>
       <w:r>
         <w:rPr>
           <w:rFonts w:eastAsia="Times New Roman" w:cs="Times New Roman"/>
@@ -3470,7 +3390,6 @@
         </w:rPr>
         <w:t xml:space="preserve">    </w:t>
       </w:r>
-      <w:proofErr w:type="spellStart"/>
       <w:r>
         <w:rPr>
           <w:rFonts w:eastAsia="Times New Roman" w:cs="Times New Roman"/>
@@ -3482,7 +3401,6 @@
         </w:rPr>
         <w:t>start_datetime</w:t>
       </w:r>
-      <w:proofErr w:type="spellEnd"/>
       <w:r>
         <w:rPr>
           <w:rFonts w:eastAsia="Times New Roman" w:cs="Times New Roman"/>
@@ -3516,7 +3434,6 @@
         </w:rPr>
         <w:t xml:space="preserve"> </w:t>
       </w:r>
-      <w:proofErr w:type="spellStart"/>
       <w:r>
         <w:rPr>
           <w:rFonts w:eastAsia="Times New Roman" w:cs="Times New Roman"/>
@@ -3550,7 +3467,6 @@
         </w:rPr>
         <w:t>DateTimeField</w:t>
       </w:r>
-      <w:proofErr w:type="spellEnd"/>
       <w:r>
         <w:rPr>
           <w:rFonts w:eastAsia="Times New Roman" w:cs="Times New Roman"/>
@@ -3588,7 +3504,6 @@
         </w:rPr>
         <w:t xml:space="preserve">    </w:t>
       </w:r>
-      <w:proofErr w:type="spellStart"/>
       <w:r>
         <w:rPr>
           <w:rFonts w:eastAsia="Times New Roman" w:cs="Times New Roman"/>
@@ -3600,7 +3515,6 @@
         </w:rPr>
         <w:t>end_datetime</w:t>
       </w:r>
-      <w:proofErr w:type="spellEnd"/>
       <w:r>
         <w:rPr>
           <w:rFonts w:eastAsia="Times New Roman" w:cs="Times New Roman"/>
@@ -3634,7 +3548,6 @@
         </w:rPr>
         <w:t xml:space="preserve"> </w:t>
       </w:r>
-      <w:proofErr w:type="spellStart"/>
       <w:r>
         <w:rPr>
           <w:rFonts w:eastAsia="Times New Roman" w:cs="Times New Roman"/>
@@ -3668,7 +3581,6 @@
         </w:rPr>
         <w:t>DateTimeField</w:t>
       </w:r>
-      <w:proofErr w:type="spellEnd"/>
       <w:r>
         <w:rPr>
           <w:rFonts w:eastAsia="Times New Roman" w:cs="Times New Roman"/>
@@ -3765,7 +3677,6 @@
         </w:rPr>
         <w:t xml:space="preserve"> </w:t>
       </w:r>
-      <w:proofErr w:type="spellStart"/>
       <w:r>
         <w:rPr>
           <w:rFonts w:eastAsia="Times New Roman" w:cs="Times New Roman"/>
@@ -3799,7 +3710,6 @@
         </w:rPr>
         <w:t>DecimalField</w:t>
       </w:r>
-      <w:proofErr w:type="spellEnd"/>
       <w:r>
         <w:rPr>
           <w:rFonts w:eastAsia="Times New Roman" w:cs="Times New Roman"/>
@@ -3811,7 +3721,6 @@
         </w:rPr>
         <w:t>(</w:t>
       </w:r>
-      <w:proofErr w:type="spellStart"/>
       <w:r>
         <w:rPr>
           <w:rFonts w:eastAsia="Times New Roman" w:cs="Times New Roman"/>
@@ -3823,7 +3732,6 @@
         </w:rPr>
         <w:t>max_digits</w:t>
       </w:r>
-      <w:proofErr w:type="spellEnd"/>
       <w:r>
         <w:rPr>
           <w:rFonts w:eastAsia="Times New Roman" w:cs="Times New Roman"/>
@@ -3857,7 +3765,6 @@
         </w:rPr>
         <w:t xml:space="preserve">, </w:t>
       </w:r>
-      <w:proofErr w:type="spellStart"/>
       <w:r>
         <w:rPr>
           <w:rFonts w:eastAsia="Times New Roman" w:cs="Times New Roman"/>
@@ -3869,7 +3776,6 @@
         </w:rPr>
         <w:t>decimal_places</w:t>
       </w:r>
-      <w:proofErr w:type="spellEnd"/>
       <w:r>
         <w:rPr>
           <w:rFonts w:eastAsia="Times New Roman" w:cs="Times New Roman"/>
@@ -3936,7 +3842,6 @@
         </w:rPr>
         <w:t>[</w:t>
       </w:r>
-      <w:proofErr w:type="spellStart"/>
       <w:r>
         <w:rPr>
           <w:rFonts w:eastAsia="Times New Roman" w:cs="Times New Roman"/>
@@ -3948,7 +3853,6 @@
         </w:rPr>
         <w:t>MinValueValidator</w:t>
       </w:r>
-      <w:proofErr w:type="spellEnd"/>
       <w:r>
         <w:rPr>
           <w:rFonts w:eastAsia="Times New Roman" w:cs="Times New Roman"/>
@@ -4137,7 +4041,6 @@
         </w:rPr>
         <w:t xml:space="preserve"> </w:t>
       </w:r>
-      <w:proofErr w:type="spellStart"/>
       <w:r>
         <w:rPr>
           <w:rFonts w:eastAsia="Times New Roman" w:cs="Times New Roman"/>
@@ -4171,7 +4074,6 @@
         </w:rPr>
         <w:t>origin_terminal</w:t>
       </w:r>
-      <w:proofErr w:type="spellEnd"/>
       <w:r>
         <w:rPr>
           <w:rFonts w:eastAsia="Times New Roman" w:cs="Times New Roman"/>
@@ -4205,7 +4107,6 @@
         </w:rPr>
         <w:t xml:space="preserve"> </w:t>
       </w:r>
-      <w:proofErr w:type="spellStart"/>
       <w:r>
         <w:rPr>
           <w:rFonts w:eastAsia="Times New Roman" w:cs="Times New Roman"/>
@@ -4239,7 +4140,6 @@
         </w:rPr>
         <w:t>destination_terminal</w:t>
       </w:r>
-      <w:proofErr w:type="spellEnd"/>
       <w:r>
         <w:rPr>
           <w:rFonts w:eastAsia="Times New Roman" w:cs="Times New Roman"/>
@@ -4299,7 +4199,6 @@
         </w:rPr>
         <w:t xml:space="preserve"> </w:t>
       </w:r>
-      <w:proofErr w:type="spellStart"/>
       <w:r>
         <w:rPr>
           <w:rFonts w:eastAsia="Times New Roman" w:cs="Times New Roman"/>
@@ -4311,7 +4210,6 @@
         </w:rPr>
         <w:t>ValidationError</w:t>
       </w:r>
-      <w:proofErr w:type="spellEnd"/>
       <w:r>
         <w:rPr>
           <w:rFonts w:eastAsia="Times New Roman" w:cs="Times New Roman"/>
@@ -4358,9 +4256,19 @@
           <w:szCs w:val="21"/>
           <w14:ligatures w14:val="none"/>
         </w:rPr>
-        <w:t>"</w:t>
-      </w:r>
-      <w:proofErr w:type="spellStart"/>
+        <w:t>"destination_terminal"</w:t>
+      </w:r>
+      <w:r>
+        <w:rPr>
+          <w:rFonts w:eastAsia="Times New Roman" w:cs="Times New Roman"/>
+          <w:color w:val="ABB2BF"/>
+          <w:kern w:val="0"/>
+          <w:sz w:val="21"/>
+          <w:szCs w:val="21"/>
+          <w14:ligatures w14:val="none"/>
+        </w:rPr>
+        <w:t xml:space="preserve">: </w:t>
+      </w:r>
       <w:r>
         <w:rPr>
           <w:rFonts w:eastAsia="Times New Roman" w:cs="Times New Roman"/>
@@ -4370,65 +4278,7 @@
           <w:szCs w:val="21"/>
           <w14:ligatures w14:val="none"/>
         </w:rPr>
-        <w:t>destination_terminal</w:t>
-      </w:r>
-      <w:proofErr w:type="spellEnd"/>
-      <w:r>
-        <w:rPr>
-          <w:rFonts w:eastAsia="Times New Roman" w:cs="Times New Roman"/>
-          <w:color w:val="98C379"/>
-          <w:kern w:val="0"/>
-          <w:sz w:val="21"/>
-          <w:szCs w:val="21"/>
-          <w14:ligatures w14:val="none"/>
-        </w:rPr>
-        <w:t>"</w:t>
-      </w:r>
-      <w:r>
-        <w:rPr>
-          <w:rFonts w:eastAsia="Times New Roman" w:cs="Times New Roman"/>
-          <w:color w:val="ABB2BF"/>
-          <w:kern w:val="0"/>
-          <w:sz w:val="21"/>
-          <w:szCs w:val="21"/>
-          <w14:ligatures w14:val="none"/>
-        </w:rPr>
-        <w:t xml:space="preserve">: </w:t>
-      </w:r>
-      <w:r>
-        <w:rPr>
-          <w:rFonts w:eastAsia="Times New Roman" w:cs="Times New Roman"/>
-          <w:color w:val="98C379"/>
-          <w:kern w:val="0"/>
-          <w:sz w:val="21"/>
-          <w:szCs w:val="21"/>
-          <w14:ligatures w14:val="none"/>
-        </w:rPr>
-        <w:t xml:space="preserve">"origin and destination </w:t>
-      </w:r>
-      <w:proofErr w:type="spellStart"/>
-      <w:r>
-        <w:rPr>
-          <w:rFonts w:eastAsia="Times New Roman" w:cs="Times New Roman"/>
-          <w:color w:val="98C379"/>
-          <w:kern w:val="0"/>
-          <w:sz w:val="21"/>
-          <w:szCs w:val="21"/>
-          <w14:ligatures w14:val="none"/>
-        </w:rPr>
-        <w:t>can not</w:t>
-      </w:r>
-      <w:proofErr w:type="spellEnd"/>
-      <w:r>
-        <w:rPr>
-          <w:rFonts w:eastAsia="Times New Roman" w:cs="Times New Roman"/>
-          <w:color w:val="98C379"/>
-          <w:kern w:val="0"/>
-          <w:sz w:val="21"/>
-          <w:szCs w:val="21"/>
-          <w14:ligatures w14:val="none"/>
-        </w:rPr>
-        <w:t xml:space="preserve"> be same."</w:t>
+        <w:t>"origin and destination can not be same."</w:t>
       </w:r>
       <w:r>
         <w:rPr>
@@ -4515,7 +4365,6 @@
         </w:rPr>
         <w:t xml:space="preserve"> </w:t>
       </w:r>
-      <w:proofErr w:type="spellStart"/>
       <w:r>
         <w:rPr>
           <w:rFonts w:eastAsia="Times New Roman" w:cs="Times New Roman"/>
@@ -4549,7 +4398,6 @@
         </w:rPr>
         <w:t>end_datetime</w:t>
       </w:r>
-      <w:proofErr w:type="spellEnd"/>
       <w:r>
         <w:rPr>
           <w:rFonts w:eastAsia="Times New Roman" w:cs="Times New Roman"/>
@@ -4583,7 +4431,6 @@
         </w:rPr>
         <w:t xml:space="preserve"> </w:t>
       </w:r>
-      <w:proofErr w:type="spellStart"/>
       <w:r>
         <w:rPr>
           <w:rFonts w:eastAsia="Times New Roman" w:cs="Times New Roman"/>
@@ -4617,7 +4464,6 @@
         </w:rPr>
         <w:t>start_datetime</w:t>
       </w:r>
-      <w:proofErr w:type="spellEnd"/>
       <w:r>
         <w:rPr>
           <w:rFonts w:eastAsia="Times New Roman" w:cs="Times New Roman"/>
@@ -4677,7 +4523,6 @@
         </w:rPr>
         <w:t xml:space="preserve"> </w:t>
       </w:r>
-      <w:proofErr w:type="spellStart"/>
       <w:r>
         <w:rPr>
           <w:rFonts w:eastAsia="Times New Roman" w:cs="Times New Roman"/>
@@ -4689,7 +4534,6 @@
         </w:rPr>
         <w:t>ValidationError</w:t>
       </w:r>
-      <w:proofErr w:type="spellEnd"/>
       <w:r>
         <w:rPr>
           <w:rFonts w:eastAsia="Times New Roman" w:cs="Times New Roman"/>
@@ -4736,31 +4580,7 @@
           <w:szCs w:val="21"/>
           <w14:ligatures w14:val="none"/>
         </w:rPr>
-        <w:t>"</w:t>
-      </w:r>
-      <w:proofErr w:type="spellStart"/>
-      <w:r>
-        <w:rPr>
-          <w:rFonts w:eastAsia="Times New Roman" w:cs="Times New Roman"/>
-          <w:color w:val="98C379"/>
-          <w:kern w:val="0"/>
-          <w:sz w:val="21"/>
-          <w:szCs w:val="21"/>
-          <w14:ligatures w14:val="none"/>
-        </w:rPr>
-        <w:t>end_datetime</w:t>
-      </w:r>
-      <w:proofErr w:type="spellEnd"/>
-      <w:r>
-        <w:rPr>
-          <w:rFonts w:eastAsia="Times New Roman" w:cs="Times New Roman"/>
-          <w:color w:val="98C379"/>
-          <w:kern w:val="0"/>
-          <w:sz w:val="21"/>
-          <w:szCs w:val="21"/>
-          <w14:ligatures w14:val="none"/>
-        </w:rPr>
-        <w:t>"</w:t>
+        <w:t>"end_datetime"</w:t>
       </w:r>
       <w:r>
         <w:rPr>
@@ -4939,7 +4759,6 @@
         </w:rPr>
         <w:t>, *</w:t>
       </w:r>
-      <w:proofErr w:type="spellStart"/>
       <w:r>
         <w:rPr>
           <w:rFonts w:eastAsia="Times New Roman" w:cs="Times New Roman"/>
@@ -4951,7 +4770,6 @@
         </w:rPr>
         <w:t>args</w:t>
       </w:r>
-      <w:proofErr w:type="spellEnd"/>
       <w:r>
         <w:rPr>
           <w:rFonts w:eastAsia="Times New Roman" w:cs="Times New Roman"/>
@@ -4963,7 +4781,6 @@
         </w:rPr>
         <w:t>, **</w:t>
       </w:r>
-      <w:proofErr w:type="spellStart"/>
       <w:r>
         <w:rPr>
           <w:rFonts w:eastAsia="Times New Roman" w:cs="Times New Roman"/>
@@ -4975,7 +4792,6 @@
         </w:rPr>
         <w:t>kwargs</w:t>
       </w:r>
-      <w:proofErr w:type="spellEnd"/>
       <w:r>
         <w:rPr>
           <w:rFonts w:eastAsia="Times New Roman" w:cs="Times New Roman"/>
@@ -5013,7 +4829,6 @@
         </w:rPr>
         <w:t xml:space="preserve">        </w:t>
       </w:r>
-      <w:proofErr w:type="spellStart"/>
       <w:r>
         <w:rPr>
           <w:rFonts w:eastAsia="Times New Roman" w:cs="Times New Roman"/>
@@ -5047,7 +4862,6 @@
         </w:rPr>
         <w:t>full_clean</w:t>
       </w:r>
-      <w:proofErr w:type="spellEnd"/>
       <w:r>
         <w:rPr>
           <w:rFonts w:eastAsia="Times New Roman" w:cs="Times New Roman"/>
@@ -5129,7 +4943,6 @@
         </w:rPr>
         <w:t>(*</w:t>
       </w:r>
-      <w:proofErr w:type="spellStart"/>
       <w:r>
         <w:rPr>
           <w:rFonts w:eastAsia="Times New Roman" w:cs="Times New Roman"/>
@@ -5141,7 +4954,6 @@
         </w:rPr>
         <w:t>args</w:t>
       </w:r>
-      <w:proofErr w:type="spellEnd"/>
       <w:r>
         <w:rPr>
           <w:rFonts w:eastAsia="Times New Roman" w:cs="Times New Roman"/>
@@ -5153,7 +4965,6 @@
         </w:rPr>
         <w:t>, **</w:t>
       </w:r>
-      <w:proofErr w:type="spellStart"/>
       <w:r>
         <w:rPr>
           <w:rFonts w:eastAsia="Times New Roman" w:cs="Times New Roman"/>
@@ -5165,7 +4976,6 @@
         </w:rPr>
         <w:t>kwargs</w:t>
       </w:r>
-      <w:proofErr w:type="spellEnd"/>
       <w:r>
         <w:rPr>
           <w:rFonts w:eastAsia="Times New Roman" w:cs="Times New Roman"/>
@@ -5296,7 +5106,6 @@
         </w:rPr>
         <w:t xml:space="preserve"> </w:t>
       </w:r>
-      <w:proofErr w:type="spellStart"/>
       <w:r>
         <w:rPr>
           <w:rFonts w:eastAsia="Times New Roman" w:cs="Times New Roman"/>
@@ -5330,7 +5139,6 @@
         </w:rPr>
         <w:t>DecimalField</w:t>
       </w:r>
-      <w:proofErr w:type="spellEnd"/>
       <w:r>
         <w:rPr>
           <w:rFonts w:eastAsia="Times New Roman" w:cs="Times New Roman"/>
@@ -5342,7 +5150,6 @@
         </w:rPr>
         <w:t>(</w:t>
       </w:r>
-      <w:proofErr w:type="spellStart"/>
       <w:r>
         <w:rPr>
           <w:rFonts w:eastAsia="Times New Roman" w:cs="Times New Roman"/>
@@ -5354,7 +5161,6 @@
         </w:rPr>
         <w:t>max_digits</w:t>
       </w:r>
-      <w:proofErr w:type="spellEnd"/>
       <w:r>
         <w:rPr>
           <w:rFonts w:eastAsia="Times New Roman" w:cs="Times New Roman"/>
@@ -5388,7 +5194,6 @@
         </w:rPr>
         <w:t xml:space="preserve">, </w:t>
       </w:r>
-      <w:proofErr w:type="spellStart"/>
       <w:r>
         <w:rPr>
           <w:rFonts w:eastAsia="Times New Roman" w:cs="Times New Roman"/>
@@ -5400,7 +5205,6 @@
         </w:rPr>
         <w:t>decimal_places</w:t>
       </w:r>
-      <w:proofErr w:type="spellEnd"/>
       <w:r>
         <w:rPr>
           <w:rFonts w:eastAsia="Times New Roman" w:cs="Times New Roman"/>
@@ -5467,7 +5271,6 @@
         </w:rPr>
         <w:t>[</w:t>
       </w:r>
-      <w:proofErr w:type="spellStart"/>
       <w:r>
         <w:rPr>
           <w:rFonts w:eastAsia="Times New Roman" w:cs="Times New Roman"/>
@@ -5479,7 +5282,6 @@
         </w:rPr>
         <w:t>MinValueValidator</w:t>
       </w:r>
-      <w:proofErr w:type="spellEnd"/>
       <w:r>
         <w:rPr>
           <w:rFonts w:eastAsia="Times New Roman" w:cs="Times New Roman"/>
@@ -5565,14 +5367,12 @@
         </w:rPr>
         <w:t xml:space="preserve"> چیه؟ یک خطا( </w:t>
       </w:r>
-      <w:proofErr w:type="spellStart"/>
       <w:r>
         <w:rPr>
           <w:lang w:bidi="fa-IR"/>
         </w:rPr>
         <w:t>exeption</w:t>
       </w:r>
-      <w:proofErr w:type="spellEnd"/>
       <w:r>
         <w:rPr>
           <w:rFonts w:hint="cs"/>
@@ -5840,14 +5640,12 @@
         </w:rPr>
         <w:t xml:space="preserve"> چون ممکنه مدل از هر جایی به جز </w:t>
       </w:r>
-      <w:proofErr w:type="spellStart"/>
       <w:r>
         <w:rPr>
           <w:lang w:bidi="fa-IR"/>
         </w:rPr>
         <w:t>modelForm</w:t>
       </w:r>
-      <w:proofErr w:type="spellEnd"/>
       <w:r>
         <w:rPr>
           <w:rFonts w:hint="cs"/>
@@ -5856,19 +5654,11 @@
         </w:rPr>
         <w:t xml:space="preserve"> (ینی </w:t>
       </w:r>
-      <w:proofErr w:type="spellStart"/>
-      <w:r>
-        <w:rPr>
-          <w:lang w:bidi="fa-IR"/>
-        </w:rPr>
-        <w:t>form.is_valid</w:t>
-      </w:r>
-      <w:proofErr w:type="spellEnd"/>
-      <w:r>
-        <w:rPr>
-          <w:lang w:bidi="fa-IR"/>
-        </w:rPr>
-        <w:t>()</w:t>
+      <w:r>
+        <w:rPr>
+          <w:lang w:bidi="fa-IR"/>
+        </w:rPr>
+        <w:t>form.is_valid()</w:t>
       </w:r>
       <w:r>
         <w:rPr>
@@ -5900,19 +5690,11 @@
           <w:lang w:bidi="fa-IR"/>
         </w:rPr>
       </w:pPr>
-      <w:proofErr w:type="spellStart"/>
-      <w:r>
-        <w:rPr>
-          <w:lang w:bidi="fa-IR"/>
-        </w:rPr>
-        <w:t>tripsModel.objects.create</w:t>
-      </w:r>
-      <w:proofErr w:type="spellEnd"/>
-      <w:r>
-        <w:rPr>
-          <w:lang w:bidi="fa-IR"/>
-        </w:rPr>
-        <w:t>(…)</w:t>
+      <w:r>
+        <w:rPr>
+          <w:lang w:bidi="fa-IR"/>
+        </w:rPr>
+        <w:t>tripsModel.objects.create(…)</w:t>
       </w:r>
       <w:r>
         <w:rPr>
@@ -6106,7 +5888,6 @@
         </w:rPr>
         <w:t>, *</w:t>
       </w:r>
-      <w:proofErr w:type="spellStart"/>
       <w:r>
         <w:rPr>
           <w:rFonts w:eastAsia="Times New Roman" w:cs="Times New Roman"/>
@@ -6118,7 +5899,6 @@
         </w:rPr>
         <w:t>args</w:t>
       </w:r>
-      <w:proofErr w:type="spellEnd"/>
       <w:r>
         <w:rPr>
           <w:rFonts w:eastAsia="Times New Roman" w:cs="Times New Roman"/>
@@ -6130,7 +5910,6 @@
         </w:rPr>
         <w:t>, **</w:t>
       </w:r>
-      <w:proofErr w:type="spellStart"/>
       <w:r>
         <w:rPr>
           <w:rFonts w:eastAsia="Times New Roman" w:cs="Times New Roman"/>
@@ -6142,7 +5921,6 @@
         </w:rPr>
         <w:t>kwargs</w:t>
       </w:r>
-      <w:proofErr w:type="spellEnd"/>
       <w:r>
         <w:rPr>
           <w:rFonts w:eastAsia="Times New Roman" w:cs="Times New Roman"/>
@@ -6180,7 +5958,6 @@
         </w:rPr>
         <w:t xml:space="preserve">        </w:t>
       </w:r>
-      <w:proofErr w:type="spellStart"/>
       <w:r>
         <w:rPr>
           <w:rFonts w:eastAsia="Times New Roman" w:cs="Times New Roman"/>
@@ -6214,7 +5991,6 @@
         </w:rPr>
         <w:t>full_clean</w:t>
       </w:r>
-      <w:proofErr w:type="spellEnd"/>
       <w:r>
         <w:rPr>
           <w:rFonts w:eastAsia="Times New Roman" w:cs="Times New Roman"/>
@@ -6296,7 +6072,6 @@
         </w:rPr>
         <w:t>(*</w:t>
       </w:r>
-      <w:proofErr w:type="spellStart"/>
       <w:r>
         <w:rPr>
           <w:rFonts w:eastAsia="Times New Roman" w:cs="Times New Roman"/>
@@ -6308,7 +6083,6 @@
         </w:rPr>
         <w:t>args</w:t>
       </w:r>
-      <w:proofErr w:type="spellEnd"/>
       <w:r>
         <w:rPr>
           <w:rFonts w:eastAsia="Times New Roman" w:cs="Times New Roman"/>
@@ -6320,7 +6094,6 @@
         </w:rPr>
         <w:t>, **</w:t>
       </w:r>
-      <w:proofErr w:type="spellStart"/>
       <w:r>
         <w:rPr>
           <w:rFonts w:eastAsia="Times New Roman" w:cs="Times New Roman"/>
@@ -6332,7 +6105,6 @@
         </w:rPr>
         <w:t>kwargs</w:t>
       </w:r>
-      <w:proofErr w:type="spellEnd"/>
       <w:r>
         <w:rPr>
           <w:rFonts w:eastAsia="Times New Roman" w:cs="Times New Roman"/>
@@ -6368,11 +6140,9 @@
         </w:rPr>
         <w:t xml:space="preserve">فرق بین </w:t>
       </w:r>
-      <w:proofErr w:type="spellStart"/>
       <w:r>
         <w:t>ValidationError</w:t>
       </w:r>
-      <w:proofErr w:type="spellEnd"/>
       <w:r>
         <w:rPr>
           <w:rFonts w:hint="cs"/>
@@ -6380,11 +6150,9 @@
         </w:rPr>
         <w:t xml:space="preserve"> و </w:t>
       </w:r>
-      <w:proofErr w:type="spellStart"/>
       <w:r>
         <w:t>ValueError</w:t>
       </w:r>
-      <w:proofErr w:type="spellEnd"/>
       <w:r>
         <w:rPr>
           <w:rFonts w:hint="cs"/>
@@ -6395,12 +6163,10 @@
       </w:r>
     </w:p>
     <w:p>
-      <w:proofErr w:type="spellStart"/>
       <w:r>
         <w:lastRenderedPageBreak/>
         <w:t>ValueError</w:t>
       </w:r>
-      <w:proofErr w:type="spellEnd"/>
       <w:r>
         <w:rPr>
           <w:rFonts w:hint="cs"/>
@@ -6476,7 +6242,6 @@
         </w:rPr>
         <w:t xml:space="preserve"> </w:t>
       </w:r>
-      <w:proofErr w:type="spellStart"/>
       <w:r>
         <w:rPr>
           <w:rFonts w:eastAsia="Times New Roman" w:cs="Times New Roman"/>
@@ -6488,7 +6253,6 @@
         </w:rPr>
         <w:t>UserModel</w:t>
       </w:r>
-      <w:proofErr w:type="spellEnd"/>
       <w:r>
         <w:rPr>
           <w:rFonts w:eastAsia="Times New Roman" w:cs="Times New Roman"/>
@@ -6500,7 +6264,6 @@
         </w:rPr>
         <w:t>(</w:t>
       </w:r>
-      <w:proofErr w:type="spellStart"/>
       <w:r>
         <w:rPr>
           <w:rFonts w:eastAsia="Times New Roman" w:cs="Times New Roman"/>
@@ -6512,7 +6275,6 @@
         </w:rPr>
         <w:t>AbstractUser</w:t>
       </w:r>
-      <w:proofErr w:type="spellEnd"/>
       <w:r>
         <w:rPr>
           <w:rFonts w:eastAsia="Times New Roman" w:cs="Times New Roman"/>
@@ -6572,7 +6334,6 @@
         </w:rPr>
         <w:t xml:space="preserve"> </w:t>
       </w:r>
-      <w:proofErr w:type="spellStart"/>
       <w:r>
         <w:rPr>
           <w:rFonts w:eastAsia="Times New Roman" w:cs="Times New Roman"/>
@@ -6584,7 +6345,6 @@
         </w:rPr>
         <w:t>GnderChoices</w:t>
       </w:r>
-      <w:proofErr w:type="spellEnd"/>
       <w:r>
         <w:rPr>
           <w:rFonts w:eastAsia="Times New Roman" w:cs="Times New Roman"/>
@@ -6596,7 +6356,6 @@
         </w:rPr>
         <w:t>(</w:t>
       </w:r>
-      <w:proofErr w:type="spellStart"/>
       <w:r>
         <w:rPr>
           <w:rFonts w:eastAsia="Times New Roman" w:cs="Times New Roman"/>
@@ -6630,7 +6389,6 @@
         </w:rPr>
         <w:t>TextChoices</w:t>
       </w:r>
-      <w:proofErr w:type="spellEnd"/>
       <w:r>
         <w:rPr>
           <w:rFonts w:eastAsia="Times New Roman" w:cs="Times New Roman"/>
@@ -6874,7 +6632,6 @@
         </w:rPr>
         <w:t xml:space="preserve">    </w:t>
       </w:r>
-      <w:proofErr w:type="spellStart"/>
       <w:r>
         <w:rPr>
           <w:rFonts w:eastAsia="Times New Roman" w:cs="Times New Roman"/>
@@ -6886,7 +6643,6 @@
         </w:rPr>
         <w:t>phone_number</w:t>
       </w:r>
-      <w:proofErr w:type="spellEnd"/>
       <w:r>
         <w:rPr>
           <w:rFonts w:eastAsia="Times New Roman" w:cs="Times New Roman"/>
@@ -6920,7 +6676,6 @@
         </w:rPr>
         <w:t xml:space="preserve"> </w:t>
       </w:r>
-      <w:proofErr w:type="spellStart"/>
       <w:r>
         <w:rPr>
           <w:rFonts w:eastAsia="Times New Roman" w:cs="Times New Roman"/>
@@ -6954,7 +6709,6 @@
         </w:rPr>
         <w:t>CharField</w:t>
       </w:r>
-      <w:proofErr w:type="spellEnd"/>
       <w:r>
         <w:rPr>
           <w:rFonts w:eastAsia="Times New Roman" w:cs="Times New Roman"/>
@@ -6966,7 +6720,6 @@
         </w:rPr>
         <w:t>(</w:t>
       </w:r>
-      <w:proofErr w:type="spellStart"/>
       <w:r>
         <w:rPr>
           <w:rFonts w:eastAsia="Times New Roman" w:cs="Times New Roman"/>
@@ -6978,7 +6731,6 @@
         </w:rPr>
         <w:t>max_length</w:t>
       </w:r>
-      <w:proofErr w:type="spellEnd"/>
       <w:r>
         <w:rPr>
           <w:rFonts w:eastAsia="Times New Roman" w:cs="Times New Roman"/>
@@ -7133,7 +6885,6 @@
         </w:rPr>
         <w:t>[</w:t>
       </w:r>
-      <w:proofErr w:type="spellStart"/>
       <w:r>
         <w:rPr>
           <w:rFonts w:eastAsia="Times New Roman" w:cs="Times New Roman"/>
@@ -7145,7 +6896,6 @@
         </w:rPr>
         <w:t>MinValueValidator</w:t>
       </w:r>
-      <w:proofErr w:type="spellEnd"/>
       <w:r>
         <w:rPr>
           <w:rFonts w:eastAsia="Times New Roman" w:cs="Times New Roman"/>
@@ -7324,7 +7074,6 @@
         </w:rPr>
         <w:t xml:space="preserve"> </w:t>
       </w:r>
-      <w:proofErr w:type="spellStart"/>
       <w:r>
         <w:rPr>
           <w:rFonts w:eastAsia="Times New Roman" w:cs="Times New Roman"/>
@@ -7358,7 +7107,6 @@
         </w:rPr>
         <w:t>CharField</w:t>
       </w:r>
-      <w:proofErr w:type="spellEnd"/>
       <w:r>
         <w:rPr>
           <w:rFonts w:eastAsia="Times New Roman" w:cs="Times New Roman"/>
@@ -7370,7 +7118,6 @@
         </w:rPr>
         <w:t>(</w:t>
       </w:r>
-      <w:proofErr w:type="spellStart"/>
       <w:r>
         <w:rPr>
           <w:rFonts w:eastAsia="Times New Roman" w:cs="Times New Roman"/>
@@ -7382,7 +7129,6 @@
         </w:rPr>
         <w:t>max_length</w:t>
       </w:r>
-      <w:proofErr w:type="spellEnd"/>
       <w:r>
         <w:rPr>
           <w:rFonts w:eastAsia="Times New Roman" w:cs="Times New Roman"/>
@@ -7438,7 +7184,6 @@
         </w:rPr>
         <w:t>=</w:t>
       </w:r>
-      <w:proofErr w:type="spellStart"/>
       <w:r>
         <w:rPr>
           <w:rFonts w:eastAsia="Times New Roman" w:cs="Times New Roman"/>
@@ -7472,7 +7217,6 @@
         </w:rPr>
         <w:t>choices</w:t>
       </w:r>
-      <w:proofErr w:type="spellEnd"/>
       <w:r>
         <w:rPr>
           <w:rFonts w:eastAsia="Times New Roman" w:cs="Times New Roman"/>
@@ -7747,9 +7491,19 @@
           <w:szCs w:val="21"/>
           <w14:ligatures w14:val="none"/>
         </w:rPr>
-        <w:t>"</w:t>
-      </w:r>
-      <w:proofErr w:type="spellStart"/>
+        <w:t>"first_name"</w:t>
+      </w:r>
+      <w:r>
+        <w:rPr>
+          <w:rFonts w:eastAsia="Times New Roman" w:cs="Times New Roman"/>
+          <w:color w:val="ABB2BF"/>
+          <w:kern w:val="0"/>
+          <w:sz w:val="21"/>
+          <w:szCs w:val="21"/>
+          <w14:ligatures w14:val="none"/>
+        </w:rPr>
+        <w:t xml:space="preserve">, </w:t>
+      </w:r>
       <w:r>
         <w:rPr>
           <w:rFonts w:eastAsia="Times New Roman" w:cs="Times New Roman"/>
@@ -7759,65 +7513,7 @@
           <w:szCs w:val="21"/>
           <w14:ligatures w14:val="none"/>
         </w:rPr>
-        <w:t>first_name</w:t>
-      </w:r>
-      <w:proofErr w:type="spellEnd"/>
-      <w:r>
-        <w:rPr>
-          <w:rFonts w:eastAsia="Times New Roman" w:cs="Times New Roman"/>
-          <w:color w:val="98C379"/>
-          <w:kern w:val="0"/>
-          <w:sz w:val="21"/>
-          <w:szCs w:val="21"/>
-          <w14:ligatures w14:val="none"/>
-        </w:rPr>
-        <w:t>"</w:t>
-      </w:r>
-      <w:r>
-        <w:rPr>
-          <w:rFonts w:eastAsia="Times New Roman" w:cs="Times New Roman"/>
-          <w:color w:val="ABB2BF"/>
-          <w:kern w:val="0"/>
-          <w:sz w:val="21"/>
-          <w:szCs w:val="21"/>
-          <w14:ligatures w14:val="none"/>
-        </w:rPr>
-        <w:t xml:space="preserve">, </w:t>
-      </w:r>
-      <w:r>
-        <w:rPr>
-          <w:rFonts w:eastAsia="Times New Roman" w:cs="Times New Roman"/>
-          <w:color w:val="98C379"/>
-          <w:kern w:val="0"/>
-          <w:sz w:val="21"/>
-          <w:szCs w:val="21"/>
-          <w14:ligatures w14:val="none"/>
-        </w:rPr>
-        <w:t>"</w:t>
-      </w:r>
-      <w:proofErr w:type="spellStart"/>
-      <w:r>
-        <w:rPr>
-          <w:rFonts w:eastAsia="Times New Roman" w:cs="Times New Roman"/>
-          <w:color w:val="98C379"/>
-          <w:kern w:val="0"/>
-          <w:sz w:val="21"/>
-          <w:szCs w:val="21"/>
-          <w14:ligatures w14:val="none"/>
-        </w:rPr>
-        <w:t>last_name</w:t>
-      </w:r>
-      <w:proofErr w:type="spellEnd"/>
-      <w:r>
-        <w:rPr>
-          <w:rFonts w:eastAsia="Times New Roman" w:cs="Times New Roman"/>
-          <w:color w:val="98C379"/>
-          <w:kern w:val="0"/>
-          <w:sz w:val="21"/>
-          <w:szCs w:val="21"/>
-          <w14:ligatures w14:val="none"/>
-        </w:rPr>
-        <w:t>"</w:t>
+        <w:t>"last_name"</w:t>
       </w:r>
       <w:r>
         <w:rPr>
@@ -8018,7 +7714,6 @@
         </w:rPr>
         <w:t>{</w:t>
       </w:r>
-      <w:proofErr w:type="spellStart"/>
       <w:r>
         <w:rPr>
           <w:rFonts w:eastAsia="Times New Roman" w:cs="Times New Roman"/>
@@ -8052,7 +7747,6 @@
         </w:rPr>
         <w:t>username</w:t>
       </w:r>
-      <w:proofErr w:type="spellEnd"/>
       <w:r>
         <w:rPr>
           <w:rFonts w:eastAsia="Times New Roman" w:cs="Times New Roman"/>
@@ -8086,7 +7780,6 @@
         </w:rPr>
         <w:t>{</w:t>
       </w:r>
-      <w:proofErr w:type="spellStart"/>
       <w:r>
         <w:rPr>
           <w:rFonts w:eastAsia="Times New Roman" w:cs="Times New Roman"/>
@@ -8120,7 +7813,6 @@
         </w:rPr>
         <w:t>first_name</w:t>
       </w:r>
-      <w:proofErr w:type="spellEnd"/>
       <w:r>
         <w:rPr>
           <w:rFonts w:eastAsia="Times New Roman" w:cs="Times New Roman"/>
@@ -8154,7 +7846,6 @@
         </w:rPr>
         <w:t>{</w:t>
       </w:r>
-      <w:proofErr w:type="spellStart"/>
       <w:r>
         <w:rPr>
           <w:rFonts w:eastAsia="Times New Roman" w:cs="Times New Roman"/>
@@ -8188,7 +7879,6 @@
         </w:rPr>
         <w:t>last_name</w:t>
       </w:r>
-      <w:proofErr w:type="spellEnd"/>
       <w:r>
         <w:rPr>
           <w:rFonts w:eastAsia="Times New Roman" w:cs="Times New Roman"/>
@@ -8342,7 +8032,6 @@
         </w:rPr>
         <w:t xml:space="preserve"> </w:t>
       </w:r>
-      <w:proofErr w:type="spellStart"/>
       <w:r>
         <w:rPr>
           <w:rFonts w:eastAsia="Times New Roman" w:cs="Times New Roman"/>
@@ -8354,7 +8043,6 @@
         </w:rPr>
         <w:t>SeatModel</w:t>
       </w:r>
-      <w:proofErr w:type="spellEnd"/>
       <w:r>
         <w:rPr>
           <w:rFonts w:eastAsia="Times New Roman" w:cs="Times New Roman"/>
@@ -8366,7 +8054,6 @@
         </w:rPr>
         <w:t>(</w:t>
       </w:r>
-      <w:proofErr w:type="spellStart"/>
       <w:r>
         <w:rPr>
           <w:rFonts w:eastAsia="Times New Roman" w:cs="Times New Roman"/>
@@ -8400,7 +8087,6 @@
         </w:rPr>
         <w:t>Model</w:t>
       </w:r>
-      <w:proofErr w:type="spellEnd"/>
       <w:r>
         <w:rPr>
           <w:rFonts w:eastAsia="Times New Roman" w:cs="Times New Roman"/>
@@ -8482,7 +8168,6 @@
         </w:rPr>
         <w:t xml:space="preserve"> </w:t>
       </w:r>
-      <w:proofErr w:type="spellStart"/>
       <w:r>
         <w:rPr>
           <w:rFonts w:eastAsia="Times New Roman" w:cs="Times New Roman"/>
@@ -8516,7 +8201,6 @@
         </w:rPr>
         <w:t>PositiveIntegerField</w:t>
       </w:r>
-      <w:proofErr w:type="spellEnd"/>
       <w:r>
         <w:rPr>
           <w:rFonts w:eastAsia="Times New Roman" w:cs="Times New Roman"/>
@@ -8598,7 +8282,6 @@
         </w:rPr>
         <w:t xml:space="preserve"> </w:t>
       </w:r>
-      <w:proofErr w:type="spellStart"/>
       <w:r>
         <w:rPr>
           <w:rFonts w:eastAsia="Times New Roman" w:cs="Times New Roman"/>
@@ -8632,7 +8315,6 @@
         </w:rPr>
         <w:t>ForeignKey</w:t>
       </w:r>
-      <w:proofErr w:type="spellEnd"/>
       <w:r>
         <w:rPr>
           <w:rFonts w:eastAsia="Times New Roman" w:cs="Times New Roman"/>
@@ -8653,31 +8335,7 @@
           <w:szCs w:val="21"/>
           <w14:ligatures w14:val="none"/>
         </w:rPr>
-        <w:t>"</w:t>
-      </w:r>
-      <w:proofErr w:type="spellStart"/>
-      <w:r>
-        <w:rPr>
-          <w:rFonts w:eastAsia="Times New Roman" w:cs="Times New Roman"/>
-          <w:color w:val="98C379"/>
-          <w:kern w:val="0"/>
-          <w:sz w:val="21"/>
-          <w:szCs w:val="21"/>
-          <w14:ligatures w14:val="none"/>
-        </w:rPr>
-        <w:t>VehicleModel</w:t>
-      </w:r>
-      <w:proofErr w:type="spellEnd"/>
-      <w:r>
-        <w:rPr>
-          <w:rFonts w:eastAsia="Times New Roman" w:cs="Times New Roman"/>
-          <w:color w:val="98C379"/>
-          <w:kern w:val="0"/>
-          <w:sz w:val="21"/>
-          <w:szCs w:val="21"/>
-          <w14:ligatures w14:val="none"/>
-        </w:rPr>
-        <w:t>"</w:t>
+        <w:t>"VehicleModel"</w:t>
       </w:r>
       <w:r>
         <w:rPr>
@@ -8690,7 +8348,6 @@
         </w:rPr>
         <w:t xml:space="preserve">, </w:t>
       </w:r>
-      <w:proofErr w:type="spellStart"/>
       <w:r>
         <w:rPr>
           <w:rFonts w:eastAsia="Times New Roman" w:cs="Times New Roman"/>
@@ -8702,7 +8359,6 @@
         </w:rPr>
         <w:t>on_delete</w:t>
       </w:r>
-      <w:proofErr w:type="spellEnd"/>
       <w:r>
         <w:rPr>
           <w:rFonts w:eastAsia="Times New Roman" w:cs="Times New Roman"/>
@@ -8714,7 +8370,6 @@
         </w:rPr>
         <w:t>=</w:t>
       </w:r>
-      <w:proofErr w:type="spellStart"/>
       <w:r>
         <w:rPr>
           <w:rFonts w:eastAsia="Times New Roman" w:cs="Times New Roman"/>
@@ -8748,7 +8403,6 @@
         </w:rPr>
         <w:t>CASCADE</w:t>
       </w:r>
-      <w:proofErr w:type="spellEnd"/>
       <w:r>
         <w:rPr>
           <w:rFonts w:eastAsia="Times New Roman" w:cs="Times New Roman"/>
@@ -8941,7 +8595,6 @@
         </w:rPr>
         <w:t xml:space="preserve">            </w:t>
       </w:r>
-      <w:proofErr w:type="spellStart"/>
       <w:r>
         <w:rPr>
           <w:rFonts w:eastAsia="Times New Roman" w:cs="Times New Roman"/>
@@ -8975,7 +8628,6 @@
         </w:rPr>
         <w:t>UniqueConstraint</w:t>
       </w:r>
-      <w:proofErr w:type="spellEnd"/>
       <w:r>
         <w:rPr>
           <w:rFonts w:eastAsia="Times New Roman" w:cs="Times New Roman"/>
@@ -9169,31 +8821,7 @@
           <w:szCs w:val="21"/>
           <w14:ligatures w14:val="none"/>
         </w:rPr>
-        <w:t>"</w:t>
-      </w:r>
-      <w:proofErr w:type="spellStart"/>
-      <w:r>
-        <w:rPr>
-          <w:rFonts w:eastAsia="Times New Roman" w:cs="Times New Roman"/>
-          <w:color w:val="98C379"/>
-          <w:kern w:val="0"/>
-          <w:sz w:val="21"/>
-          <w:szCs w:val="21"/>
-          <w14:ligatures w14:val="none"/>
-        </w:rPr>
-        <w:t>unique_seat_number_per_vehicle</w:t>
-      </w:r>
-      <w:proofErr w:type="spellEnd"/>
-      <w:r>
-        <w:rPr>
-          <w:rFonts w:eastAsia="Times New Roman" w:cs="Times New Roman"/>
-          <w:color w:val="98C379"/>
-          <w:kern w:val="0"/>
-          <w:sz w:val="21"/>
-          <w:szCs w:val="21"/>
-          <w14:ligatures w14:val="none"/>
-        </w:rPr>
-        <w:t>"</w:t>
+        <w:t>"unique_seat_number_per_vehicle"</w:t>
       </w:r>
     </w:p>
     <w:p>
@@ -9420,7 +9048,6 @@
         </w:rPr>
         <w:t>{</w:t>
       </w:r>
-      <w:proofErr w:type="spellStart"/>
       <w:r>
         <w:rPr>
           <w:rFonts w:eastAsia="Times New Roman" w:cs="Times New Roman"/>
@@ -9454,7 +9081,6 @@
         </w:rPr>
         <w:t>number</w:t>
       </w:r>
-      <w:proofErr w:type="spellEnd"/>
       <w:r>
         <w:rPr>
           <w:rFonts w:eastAsia="Times New Roman" w:cs="Times New Roman"/>
@@ -9488,7 +9114,6 @@
         </w:rPr>
         <w:t>{</w:t>
       </w:r>
-      <w:proofErr w:type="spellStart"/>
       <w:r>
         <w:rPr>
           <w:rFonts w:eastAsia="Times New Roman" w:cs="Times New Roman"/>
@@ -9533,7 +9158,6 @@
         </w:rPr>
         <w:t>.type</w:t>
       </w:r>
-      <w:proofErr w:type="spellEnd"/>
       <w:r>
         <w:rPr>
           <w:rFonts w:eastAsia="Times New Roman" w:cs="Times New Roman"/>
@@ -9567,7 +9191,6 @@
         </w:rPr>
         <w:t>{</w:t>
       </w:r>
-      <w:proofErr w:type="spellStart"/>
       <w:r>
         <w:rPr>
           <w:rFonts w:eastAsia="Times New Roman" w:cs="Times New Roman"/>
@@ -9612,7 +9235,6 @@
         </w:rPr>
         <w:t>.model</w:t>
       </w:r>
-      <w:proofErr w:type="spellEnd"/>
       <w:r>
         <w:rPr>
           <w:rFonts w:eastAsia="Times New Roman" w:cs="Times New Roman"/>
@@ -9671,7 +9293,6 @@
     <w:p>
       <w:pPr>
         <w:rPr>
-          <w:rFonts w:hint="cs"/>
           <w:rtl/>
           <w:lang w:bidi="fa-IR"/>
         </w:rPr>
@@ -9749,7 +9370,6 @@
         </w:rPr>
         <w:t xml:space="preserve"> </w:t>
       </w:r>
-      <w:proofErr w:type="spellStart"/>
       <w:r>
         <w:rPr>
           <w:rFonts w:eastAsia="Times New Roman" w:cs="Times New Roman"/>
@@ -9761,7 +9381,6 @@
         </w:rPr>
         <w:t>VehicleModel</w:t>
       </w:r>
-      <w:proofErr w:type="spellEnd"/>
       <w:r>
         <w:rPr>
           <w:rFonts w:eastAsia="Times New Roman" w:cs="Times New Roman"/>
@@ -9773,7 +9392,6 @@
         </w:rPr>
         <w:t>(</w:t>
       </w:r>
-      <w:proofErr w:type="spellStart"/>
       <w:r>
         <w:rPr>
           <w:rFonts w:eastAsia="Times New Roman" w:cs="Times New Roman"/>
@@ -9807,7 +9425,6 @@
         </w:rPr>
         <w:t>Model</w:t>
       </w:r>
-      <w:proofErr w:type="spellEnd"/>
       <w:r>
         <w:rPr>
           <w:rFonts w:eastAsia="Times New Roman" w:cs="Times New Roman"/>
@@ -9867,7 +9484,6 @@
         </w:rPr>
         <w:t xml:space="preserve"> </w:t>
       </w:r>
-      <w:proofErr w:type="spellStart"/>
       <w:r>
         <w:rPr>
           <w:rFonts w:eastAsia="Times New Roman" w:cs="Times New Roman"/>
@@ -9879,7 +9495,6 @@
         </w:rPr>
         <w:t>VehicleTypeStatus</w:t>
       </w:r>
-      <w:proofErr w:type="spellEnd"/>
       <w:r>
         <w:rPr>
           <w:rFonts w:eastAsia="Times New Roman" w:cs="Times New Roman"/>
@@ -9891,7 +9506,6 @@
         </w:rPr>
         <w:t>(</w:t>
       </w:r>
-      <w:proofErr w:type="spellStart"/>
       <w:r>
         <w:rPr>
           <w:rFonts w:eastAsia="Times New Roman" w:cs="Times New Roman"/>
@@ -9925,7 +9539,6 @@
         </w:rPr>
         <w:t>TextChoices</w:t>
       </w:r>
-      <w:proofErr w:type="spellEnd"/>
       <w:r>
         <w:rPr>
           <w:rFonts w:eastAsia="Times New Roman" w:cs="Times New Roman"/>
@@ -10316,7 +9929,6 @@
         </w:rPr>
         <w:t xml:space="preserve"> </w:t>
       </w:r>
-      <w:proofErr w:type="spellStart"/>
       <w:r>
         <w:rPr>
           <w:rFonts w:eastAsia="Times New Roman" w:cs="Times New Roman"/>
@@ -10350,7 +9962,6 @@
         </w:rPr>
         <w:t>CharField</w:t>
       </w:r>
-      <w:proofErr w:type="spellEnd"/>
       <w:r>
         <w:rPr>
           <w:rFonts w:eastAsia="Times New Roman" w:cs="Times New Roman"/>
@@ -10362,7 +9973,6 @@
         </w:rPr>
         <w:t>(</w:t>
       </w:r>
-      <w:proofErr w:type="spellStart"/>
       <w:r>
         <w:rPr>
           <w:rFonts w:eastAsia="Times New Roman" w:cs="Times New Roman"/>
@@ -10374,7 +9984,6 @@
         </w:rPr>
         <w:t>max_length</w:t>
       </w:r>
-      <w:proofErr w:type="spellEnd"/>
       <w:r>
         <w:rPr>
           <w:rFonts w:eastAsia="Times New Roman" w:cs="Times New Roman"/>
@@ -10566,7 +10175,6 @@
         </w:rPr>
         <w:t xml:space="preserve"> </w:t>
       </w:r>
-      <w:proofErr w:type="spellStart"/>
       <w:r>
         <w:rPr>
           <w:rFonts w:eastAsia="Times New Roman" w:cs="Times New Roman"/>
@@ -10600,7 +10208,6 @@
         </w:rPr>
         <w:t>PositiveIntegerField</w:t>
       </w:r>
-      <w:proofErr w:type="spellEnd"/>
       <w:r>
         <w:rPr>
           <w:rFonts w:eastAsia="Times New Roman" w:cs="Times New Roman"/>
@@ -10770,7 +10377,6 @@
         </w:rPr>
         <w:t xml:space="preserve"> </w:t>
       </w:r>
-      <w:proofErr w:type="spellStart"/>
       <w:r>
         <w:rPr>
           <w:rFonts w:eastAsia="Times New Roman" w:cs="Times New Roman"/>
@@ -10804,7 +10410,6 @@
         </w:rPr>
         <w:t>CharField</w:t>
       </w:r>
-      <w:proofErr w:type="spellEnd"/>
       <w:r>
         <w:rPr>
           <w:rFonts w:eastAsia="Times New Roman" w:cs="Times New Roman"/>
@@ -10816,7 +10421,6 @@
         </w:rPr>
         <w:t>(</w:t>
       </w:r>
-      <w:proofErr w:type="spellStart"/>
       <w:r>
         <w:rPr>
           <w:rFonts w:eastAsia="Times New Roman" w:cs="Times New Roman"/>
@@ -10828,7 +10432,6 @@
         </w:rPr>
         <w:t>max_length</w:t>
       </w:r>
-      <w:proofErr w:type="spellEnd"/>
       <w:r>
         <w:rPr>
           <w:rFonts w:eastAsia="Times New Roman" w:cs="Times New Roman"/>
@@ -10884,7 +10487,6 @@
         </w:rPr>
         <w:t>=</w:t>
       </w:r>
-      <w:proofErr w:type="spellStart"/>
       <w:r>
         <w:rPr>
           <w:rFonts w:eastAsia="Times New Roman" w:cs="Times New Roman"/>
@@ -10918,7 +10520,6 @@
         </w:rPr>
         <w:t>choices</w:t>
       </w:r>
-      <w:proofErr w:type="spellEnd"/>
       <w:r>
         <w:rPr>
           <w:rFonts w:eastAsia="Times New Roman" w:cs="Times New Roman"/>
@@ -11206,7 +10807,6 @@
         </w:rPr>
         <w:t>{</w:t>
       </w:r>
-      <w:proofErr w:type="spellStart"/>
       <w:r>
         <w:rPr>
           <w:rFonts w:eastAsia="Times New Roman" w:cs="Times New Roman"/>
@@ -11240,7 +10840,6 @@
         </w:rPr>
         <w:t>type</w:t>
       </w:r>
-      <w:proofErr w:type="spellEnd"/>
       <w:r>
         <w:rPr>
           <w:rFonts w:eastAsia="Times New Roman" w:cs="Times New Roman"/>
@@ -11274,7 +10873,6 @@
         </w:rPr>
         <w:t>{</w:t>
       </w:r>
-      <w:proofErr w:type="spellStart"/>
       <w:r>
         <w:rPr>
           <w:rFonts w:eastAsia="Times New Roman" w:cs="Times New Roman"/>
@@ -11308,7 +10906,6 @@
         </w:rPr>
         <w:t>model</w:t>
       </w:r>
-      <w:proofErr w:type="spellEnd"/>
       <w:r>
         <w:rPr>
           <w:rFonts w:eastAsia="Times New Roman" w:cs="Times New Roman"/>
@@ -11375,7 +10972,6 @@
         </w:rPr>
         <w:t xml:space="preserve"> </w:t>
       </w:r>
-      <w:proofErr w:type="spellStart"/>
       <w:r>
         <w:rPr>
           <w:rFonts w:eastAsia="Times New Roman" w:cs="Times New Roman"/>
@@ -11387,7 +10983,6 @@
         </w:rPr>
         <w:t>SeatModel</w:t>
       </w:r>
-      <w:proofErr w:type="spellEnd"/>
       <w:r>
         <w:rPr>
           <w:rFonts w:eastAsia="Times New Roman" w:cs="Times New Roman"/>
@@ -11399,7 +10994,6 @@
         </w:rPr>
         <w:t>(</w:t>
       </w:r>
-      <w:proofErr w:type="spellStart"/>
       <w:r>
         <w:rPr>
           <w:rFonts w:eastAsia="Times New Roman" w:cs="Times New Roman"/>
@@ -11433,7 +11027,6 @@
         </w:rPr>
         <w:t>Model</w:t>
       </w:r>
-      <w:proofErr w:type="spellEnd"/>
       <w:r>
         <w:rPr>
           <w:rFonts w:eastAsia="Times New Roman" w:cs="Times New Roman"/>
@@ -11515,7 +11108,6 @@
         </w:rPr>
         <w:t xml:space="preserve"> </w:t>
       </w:r>
-      <w:proofErr w:type="spellStart"/>
       <w:r>
         <w:rPr>
           <w:rFonts w:eastAsia="Times New Roman" w:cs="Times New Roman"/>
@@ -11549,7 +11141,6 @@
         </w:rPr>
         <w:t>PositiveIntegerField</w:t>
       </w:r>
-      <w:proofErr w:type="spellEnd"/>
       <w:r>
         <w:rPr>
           <w:rFonts w:eastAsia="Times New Roman" w:cs="Times New Roman"/>
@@ -11631,7 +11222,6 @@
         </w:rPr>
         <w:t xml:space="preserve"> </w:t>
       </w:r>
-      <w:proofErr w:type="spellStart"/>
       <w:r>
         <w:rPr>
           <w:rFonts w:eastAsia="Times New Roman" w:cs="Times New Roman"/>
@@ -11665,7 +11255,6 @@
         </w:rPr>
         <w:t>ForeignKey</w:t>
       </w:r>
-      <w:proofErr w:type="spellEnd"/>
       <w:r>
         <w:rPr>
           <w:rFonts w:eastAsia="Times New Roman" w:cs="Times New Roman"/>
@@ -11686,31 +11275,7 @@
           <w:szCs w:val="21"/>
           <w14:ligatures w14:val="none"/>
         </w:rPr>
-        <w:t>"</w:t>
-      </w:r>
-      <w:proofErr w:type="spellStart"/>
-      <w:r>
-        <w:rPr>
-          <w:rFonts w:eastAsia="Times New Roman" w:cs="Times New Roman"/>
-          <w:color w:val="98C379"/>
-          <w:kern w:val="0"/>
-          <w:sz w:val="21"/>
-          <w:szCs w:val="21"/>
-          <w14:ligatures w14:val="none"/>
-        </w:rPr>
-        <w:t>VehicleModel</w:t>
-      </w:r>
-      <w:proofErr w:type="spellEnd"/>
-      <w:r>
-        <w:rPr>
-          <w:rFonts w:eastAsia="Times New Roman" w:cs="Times New Roman"/>
-          <w:color w:val="98C379"/>
-          <w:kern w:val="0"/>
-          <w:sz w:val="21"/>
-          <w:szCs w:val="21"/>
-          <w14:ligatures w14:val="none"/>
-        </w:rPr>
-        <w:t>"</w:t>
+        <w:t>"VehicleModel"</w:t>
       </w:r>
       <w:r>
         <w:rPr>
@@ -11723,7 +11288,6 @@
         </w:rPr>
         <w:t xml:space="preserve">, </w:t>
       </w:r>
-      <w:proofErr w:type="spellStart"/>
       <w:r>
         <w:rPr>
           <w:rFonts w:eastAsia="Times New Roman" w:cs="Times New Roman"/>
@@ -11735,7 +11299,6 @@
         </w:rPr>
         <w:t>on_delete</w:t>
       </w:r>
-      <w:proofErr w:type="spellEnd"/>
       <w:r>
         <w:rPr>
           <w:rFonts w:eastAsia="Times New Roman" w:cs="Times New Roman"/>
@@ -11747,7 +11310,6 @@
         </w:rPr>
         <w:t>=</w:t>
       </w:r>
-      <w:proofErr w:type="spellStart"/>
       <w:r>
         <w:rPr>
           <w:rFonts w:eastAsia="Times New Roman" w:cs="Times New Roman"/>
@@ -11781,7 +11343,6 @@
         </w:rPr>
         <w:t>CASCADE</w:t>
       </w:r>
-      <w:proofErr w:type="spellEnd"/>
       <w:r>
         <w:rPr>
           <w:rFonts w:eastAsia="Times New Roman" w:cs="Times New Roman"/>
@@ -11974,7 +11535,6 @@
         </w:rPr>
         <w:t xml:space="preserve">            </w:t>
       </w:r>
-      <w:proofErr w:type="spellStart"/>
       <w:r>
         <w:rPr>
           <w:rFonts w:eastAsia="Times New Roman" w:cs="Times New Roman"/>
@@ -12008,7 +11568,6 @@
         </w:rPr>
         <w:t>UniqueConstraint</w:t>
       </w:r>
-      <w:proofErr w:type="spellEnd"/>
       <w:r>
         <w:rPr>
           <w:rFonts w:eastAsia="Times New Roman" w:cs="Times New Roman"/>
@@ -12202,31 +11761,7 @@
           <w:szCs w:val="21"/>
           <w14:ligatures w14:val="none"/>
         </w:rPr>
-        <w:t>"</w:t>
-      </w:r>
-      <w:proofErr w:type="spellStart"/>
-      <w:r>
-        <w:rPr>
-          <w:rFonts w:eastAsia="Times New Roman" w:cs="Times New Roman"/>
-          <w:color w:val="98C379"/>
-          <w:kern w:val="0"/>
-          <w:sz w:val="21"/>
-          <w:szCs w:val="21"/>
-          <w14:ligatures w14:val="none"/>
-        </w:rPr>
-        <w:t>unique_seat_number_per_vehicle</w:t>
-      </w:r>
-      <w:proofErr w:type="spellEnd"/>
-      <w:r>
-        <w:rPr>
-          <w:rFonts w:eastAsia="Times New Roman" w:cs="Times New Roman"/>
-          <w:color w:val="98C379"/>
-          <w:kern w:val="0"/>
-          <w:sz w:val="21"/>
-          <w:szCs w:val="21"/>
-          <w14:ligatures w14:val="none"/>
-        </w:rPr>
-        <w:t>"</w:t>
+        <w:t>"unique_seat_number_per_vehicle"</w:t>
       </w:r>
     </w:p>
     <w:p>
@@ -12435,7 +11970,6 @@
         </w:rPr>
         <w:t xml:space="preserve"> </w:t>
       </w:r>
-      <w:proofErr w:type="spellStart"/>
       <w:r>
         <w:rPr>
           <w:rFonts w:eastAsia="Times New Roman" w:cs="Times New Roman"/>
@@ -12491,7 +12025,6 @@
         </w:rPr>
         <w:t>count</w:t>
       </w:r>
-      <w:proofErr w:type="spellEnd"/>
       <w:r>
         <w:rPr>
           <w:rFonts w:eastAsia="Times New Roman" w:cs="Times New Roman"/>
@@ -12525,7 +12058,6 @@
         </w:rPr>
         <w:t xml:space="preserve"> </w:t>
       </w:r>
-      <w:proofErr w:type="spellStart"/>
       <w:r>
         <w:rPr>
           <w:rFonts w:eastAsia="Times New Roman" w:cs="Times New Roman"/>
@@ -12568,19 +12100,7 @@
           <w:szCs w:val="21"/>
           <w14:ligatures w14:val="none"/>
         </w:rPr>
-        <w:t>.capacity</w:t>
-      </w:r>
-      <w:proofErr w:type="spellEnd"/>
-      <w:r>
-        <w:rPr>
-          <w:rFonts w:eastAsia="Times New Roman" w:cs="Times New Roman"/>
-          <w:color w:val="ABB2BF"/>
-          <w:kern w:val="0"/>
-          <w:sz w:val="21"/>
-          <w:szCs w:val="21"/>
-          <w14:ligatures w14:val="none"/>
-        </w:rPr>
-        <w:t>:</w:t>
+        <w:t>.capacity:</w:t>
       </w:r>
     </w:p>
     <w:p>
@@ -12630,7 +12150,6 @@
         </w:rPr>
         <w:t xml:space="preserve"> </w:t>
       </w:r>
-      <w:proofErr w:type="spellStart"/>
       <w:r>
         <w:rPr>
           <w:rFonts w:eastAsia="Times New Roman" w:cs="Times New Roman"/>
@@ -12642,7 +12161,6 @@
         </w:rPr>
         <w:t>ValidationError</w:t>
       </w:r>
-      <w:proofErr w:type="spellEnd"/>
       <w:r>
         <w:rPr>
           <w:rFonts w:eastAsia="Times New Roman" w:cs="Times New Roman"/>
@@ -12805,7 +12323,6 @@
         </w:rPr>
         <w:t>, *</w:t>
       </w:r>
-      <w:proofErr w:type="spellStart"/>
       <w:r>
         <w:rPr>
           <w:rFonts w:eastAsia="Times New Roman" w:cs="Times New Roman"/>
@@ -12817,7 +12334,6 @@
         </w:rPr>
         <w:t>args</w:t>
       </w:r>
-      <w:proofErr w:type="spellEnd"/>
       <w:r>
         <w:rPr>
           <w:rFonts w:eastAsia="Times New Roman" w:cs="Times New Roman"/>
@@ -12829,7 +12345,6 @@
         </w:rPr>
         <w:t>, **</w:t>
       </w:r>
-      <w:proofErr w:type="spellStart"/>
       <w:r>
         <w:rPr>
           <w:rFonts w:eastAsia="Times New Roman" w:cs="Times New Roman"/>
@@ -12841,7 +12356,6 @@
         </w:rPr>
         <w:t>kwargs</w:t>
       </w:r>
-      <w:proofErr w:type="spellEnd"/>
       <w:r>
         <w:rPr>
           <w:rFonts w:eastAsia="Times New Roman" w:cs="Times New Roman"/>
@@ -12879,7 +12393,6 @@
         </w:rPr>
         <w:t xml:space="preserve">        </w:t>
       </w:r>
-      <w:proofErr w:type="spellStart"/>
       <w:r>
         <w:rPr>
           <w:rFonts w:eastAsia="Times New Roman" w:cs="Times New Roman"/>
@@ -12913,7 +12426,6 @@
         </w:rPr>
         <w:t>full_clean</w:t>
       </w:r>
-      <w:proofErr w:type="spellEnd"/>
       <w:r>
         <w:rPr>
           <w:rFonts w:eastAsia="Times New Roman" w:cs="Times New Roman"/>
@@ -12995,7 +12507,6 @@
         </w:rPr>
         <w:t>(*</w:t>
       </w:r>
-      <w:proofErr w:type="spellStart"/>
       <w:r>
         <w:rPr>
           <w:rFonts w:eastAsia="Times New Roman" w:cs="Times New Roman"/>
@@ -13007,7 +12518,6 @@
         </w:rPr>
         <w:t>args</w:t>
       </w:r>
-      <w:proofErr w:type="spellEnd"/>
       <w:r>
         <w:rPr>
           <w:rFonts w:eastAsia="Times New Roman" w:cs="Times New Roman"/>
@@ -13019,7 +12529,6 @@
         </w:rPr>
         <w:t>, **</w:t>
       </w:r>
-      <w:proofErr w:type="spellStart"/>
       <w:r>
         <w:rPr>
           <w:rFonts w:eastAsia="Times New Roman" w:cs="Times New Roman"/>
@@ -13031,7 +12540,6 @@
         </w:rPr>
         <w:t>kwargs</w:t>
       </w:r>
-      <w:proofErr w:type="spellEnd"/>
       <w:r>
         <w:rPr>
           <w:rFonts w:eastAsia="Times New Roman" w:cs="Times New Roman"/>
@@ -13231,7 +12739,6 @@
         </w:rPr>
         <w:t>{</w:t>
       </w:r>
-      <w:proofErr w:type="spellStart"/>
       <w:r>
         <w:rPr>
           <w:rFonts w:eastAsia="Times New Roman" w:cs="Times New Roman"/>
@@ -13265,7 +12772,6 @@
         </w:rPr>
         <w:t>number</w:t>
       </w:r>
-      <w:proofErr w:type="spellEnd"/>
       <w:r>
         <w:rPr>
           <w:rFonts w:eastAsia="Times New Roman" w:cs="Times New Roman"/>
@@ -13299,7 +12805,6 @@
         </w:rPr>
         <w:t>{</w:t>
       </w:r>
-      <w:proofErr w:type="spellStart"/>
       <w:r>
         <w:rPr>
           <w:rFonts w:eastAsia="Times New Roman" w:cs="Times New Roman"/>
@@ -13344,7 +12849,6 @@
         </w:rPr>
         <w:t>.type</w:t>
       </w:r>
-      <w:proofErr w:type="spellEnd"/>
       <w:r>
         <w:rPr>
           <w:rFonts w:eastAsia="Times New Roman" w:cs="Times New Roman"/>
@@ -13378,7 +12882,6 @@
         </w:rPr>
         <w:t>{</w:t>
       </w:r>
-      <w:proofErr w:type="spellStart"/>
       <w:r>
         <w:rPr>
           <w:rFonts w:eastAsia="Times New Roman" w:cs="Times New Roman"/>
@@ -13423,7 +12926,6 @@
         </w:rPr>
         <w:t>.model</w:t>
       </w:r>
-      <w:proofErr w:type="spellEnd"/>
       <w:r>
         <w:rPr>
           <w:rFonts w:eastAsia="Times New Roman" w:cs="Times New Roman"/>
@@ -13466,7 +12968,6 @@
     <w:p>
       <w:pPr>
         <w:rPr>
-          <w:rFonts w:hint="cs"/>
           <w:rtl/>
           <w:lang w:bidi="fa-IR"/>
         </w:rPr>
@@ -13480,14 +12981,12 @@
         <w:lastRenderedPageBreak/>
         <w:t xml:space="preserve">در واقع از طریق </w:t>
       </w:r>
-      <w:proofErr w:type="spellStart"/>
       <w:r>
         <w:rPr>
           <w:lang w:bidi="fa-IR"/>
         </w:rPr>
         <w:t>self.vehicle</w:t>
       </w:r>
-      <w:proofErr w:type="spellEnd"/>
       <w:r>
         <w:rPr>
           <w:rFonts w:hint="cs"/>
@@ -13510,14 +13009,12 @@
         </w:rPr>
         <w:t xml:space="preserve"> ما چه وسیله ای داریم و دوباره با </w:t>
       </w:r>
-      <w:proofErr w:type="spellStart"/>
       <w:r>
         <w:rPr>
           <w:lang w:bidi="fa-IR"/>
         </w:rPr>
         <w:t>seatmodel_set</w:t>
       </w:r>
-      <w:proofErr w:type="spellEnd"/>
       <w:r>
         <w:rPr>
           <w:rFonts w:hint="cs"/>
@@ -13588,7 +13085,6 @@
         </w:rPr>
         <w:t xml:space="preserve"> </w:t>
       </w:r>
-      <w:proofErr w:type="spellStart"/>
       <w:r>
         <w:rPr>
           <w:rFonts w:eastAsia="Times New Roman" w:cs="Times New Roman"/>
@@ -13644,7 +13140,6 @@
         </w:rPr>
         <w:t>count</w:t>
       </w:r>
-      <w:proofErr w:type="spellEnd"/>
       <w:r>
         <w:rPr>
           <w:rFonts w:eastAsia="Times New Roman" w:cs="Times New Roman"/>
@@ -13678,7 +13173,6 @@
         </w:rPr>
         <w:t xml:space="preserve"> </w:t>
       </w:r>
-      <w:proofErr w:type="spellStart"/>
       <w:r>
         <w:rPr>
           <w:rFonts w:eastAsia="Times New Roman" w:cs="Times New Roman"/>
@@ -13721,19 +13215,7 @@
           <w:szCs w:val="21"/>
           <w14:ligatures w14:val="none"/>
         </w:rPr>
-        <w:t>.capacity</w:t>
-      </w:r>
-      <w:proofErr w:type="spellEnd"/>
-      <w:r>
-        <w:rPr>
-          <w:rFonts w:eastAsia="Times New Roman" w:cs="Times New Roman"/>
-          <w:color w:val="ABB2BF"/>
-          <w:kern w:val="0"/>
-          <w:sz w:val="21"/>
-          <w:szCs w:val="21"/>
-          <w14:ligatures w14:val="none"/>
-        </w:rPr>
-        <w:t>:</w:t>
+        <w:t>.capacity:</w:t>
       </w:r>
     </w:p>
     <w:p>
@@ -13795,7 +13277,6 @@
         </w:rPr>
         <w:t xml:space="preserve"> </w:t>
       </w:r>
-      <w:proofErr w:type="spellStart"/>
       <w:r>
         <w:rPr>
           <w:rFonts w:eastAsia="Times New Roman" w:cs="Times New Roman"/>
@@ -13807,7 +13288,6 @@
         </w:rPr>
         <w:t>SeatModel</w:t>
       </w:r>
-      <w:proofErr w:type="spellEnd"/>
       <w:r>
         <w:rPr>
           <w:rFonts w:eastAsia="Times New Roman" w:cs="Times New Roman"/>
@@ -13819,7 +13299,6 @@
         </w:rPr>
         <w:t>(</w:t>
       </w:r>
-      <w:proofErr w:type="spellStart"/>
       <w:r>
         <w:rPr>
           <w:rFonts w:eastAsia="Times New Roman" w:cs="Times New Roman"/>
@@ -13853,7 +13332,6 @@
         </w:rPr>
         <w:t>Model</w:t>
       </w:r>
-      <w:proofErr w:type="spellEnd"/>
       <w:r>
         <w:rPr>
           <w:rFonts w:eastAsia="Times New Roman" w:cs="Times New Roman"/>
@@ -13935,7 +13413,6 @@
         </w:rPr>
         <w:t xml:space="preserve"> </w:t>
       </w:r>
-      <w:proofErr w:type="spellStart"/>
       <w:r>
         <w:rPr>
           <w:rFonts w:eastAsia="Times New Roman" w:cs="Times New Roman"/>
@@ -13969,7 +13446,6 @@
         </w:rPr>
         <w:t>PositiveIntegerField</w:t>
       </w:r>
-      <w:proofErr w:type="spellEnd"/>
       <w:r>
         <w:rPr>
           <w:rFonts w:eastAsia="Times New Roman" w:cs="Times New Roman"/>
@@ -14051,7 +13527,6 @@
         </w:rPr>
         <w:t xml:space="preserve"> </w:t>
       </w:r>
-      <w:proofErr w:type="spellStart"/>
       <w:r>
         <w:rPr>
           <w:rFonts w:eastAsia="Times New Roman" w:cs="Times New Roman"/>
@@ -14085,7 +13560,6 @@
         </w:rPr>
         <w:t>ForeignKey</w:t>
       </w:r>
-      <w:proofErr w:type="spellEnd"/>
       <w:r>
         <w:rPr>
           <w:rFonts w:eastAsia="Times New Roman" w:cs="Times New Roman"/>
@@ -14106,31 +13580,7 @@
           <w:szCs w:val="21"/>
           <w14:ligatures w14:val="none"/>
         </w:rPr>
-        <w:t>"</w:t>
-      </w:r>
-      <w:proofErr w:type="spellStart"/>
-      <w:r>
-        <w:rPr>
-          <w:rFonts w:eastAsia="Times New Roman" w:cs="Times New Roman"/>
-          <w:color w:val="98C379"/>
-          <w:kern w:val="0"/>
-          <w:sz w:val="21"/>
-          <w:szCs w:val="21"/>
-          <w14:ligatures w14:val="none"/>
-        </w:rPr>
-        <w:t>VehicleModel</w:t>
-      </w:r>
-      <w:proofErr w:type="spellEnd"/>
-      <w:r>
-        <w:rPr>
-          <w:rFonts w:eastAsia="Times New Roman" w:cs="Times New Roman"/>
-          <w:color w:val="98C379"/>
-          <w:kern w:val="0"/>
-          <w:sz w:val="21"/>
-          <w:szCs w:val="21"/>
-          <w14:ligatures w14:val="none"/>
-        </w:rPr>
-        <w:t>"</w:t>
+        <w:t>"VehicleModel"</w:t>
       </w:r>
       <w:r>
         <w:rPr>
@@ -14143,7 +13593,6 @@
         </w:rPr>
         <w:t xml:space="preserve">, </w:t>
       </w:r>
-      <w:proofErr w:type="spellStart"/>
       <w:r>
         <w:rPr>
           <w:rFonts w:eastAsia="Times New Roman" w:cs="Times New Roman"/>
@@ -14155,7 +13604,6 @@
         </w:rPr>
         <w:t>on_delete</w:t>
       </w:r>
-      <w:proofErr w:type="spellEnd"/>
       <w:r>
         <w:rPr>
           <w:rFonts w:eastAsia="Times New Roman" w:cs="Times New Roman"/>
@@ -14167,7 +13615,6 @@
         </w:rPr>
         <w:t>=</w:t>
       </w:r>
-      <w:proofErr w:type="spellStart"/>
       <w:r>
         <w:rPr>
           <w:rFonts w:eastAsia="Times New Roman" w:cs="Times New Roman"/>
@@ -14201,7 +13648,6 @@
         </w:rPr>
         <w:t>CASCADE</w:t>
       </w:r>
-      <w:proofErr w:type="spellEnd"/>
       <w:r>
         <w:rPr>
           <w:rFonts w:eastAsia="Times New Roman" w:cs="Times New Roman"/>
@@ -14213,7 +13659,6 @@
         </w:rPr>
         <w:t xml:space="preserve">, </w:t>
       </w:r>
-      <w:proofErr w:type="spellStart"/>
       <w:r>
         <w:rPr>
           <w:rFonts w:eastAsia="Times New Roman" w:cs="Times New Roman"/>
@@ -14225,7 +13670,6 @@
         </w:rPr>
         <w:t>related_name</w:t>
       </w:r>
-      <w:proofErr w:type="spellEnd"/>
       <w:r>
         <w:rPr>
           <w:rFonts w:eastAsia="Times New Roman" w:cs="Times New Roman"/>
@@ -14440,7 +13884,6 @@
         </w:rPr>
         <w:t xml:space="preserve">            </w:t>
       </w:r>
-      <w:proofErr w:type="spellStart"/>
       <w:r>
         <w:rPr>
           <w:rFonts w:eastAsia="Times New Roman" w:cs="Times New Roman"/>
@@ -14474,7 +13917,6 @@
         </w:rPr>
         <w:t>UniqueConstraint</w:t>
       </w:r>
-      <w:proofErr w:type="spellEnd"/>
       <w:r>
         <w:rPr>
           <w:rFonts w:eastAsia="Times New Roman" w:cs="Times New Roman"/>
@@ -14668,31 +14110,7 @@
           <w:szCs w:val="21"/>
           <w14:ligatures w14:val="none"/>
         </w:rPr>
-        <w:t>"</w:t>
-      </w:r>
-      <w:proofErr w:type="spellStart"/>
-      <w:r>
-        <w:rPr>
-          <w:rFonts w:eastAsia="Times New Roman" w:cs="Times New Roman"/>
-          <w:color w:val="98C379"/>
-          <w:kern w:val="0"/>
-          <w:sz w:val="21"/>
-          <w:szCs w:val="21"/>
-          <w14:ligatures w14:val="none"/>
-        </w:rPr>
-        <w:t>unique_seat_number_per_vehicle</w:t>
-      </w:r>
-      <w:proofErr w:type="spellEnd"/>
-      <w:r>
-        <w:rPr>
-          <w:rFonts w:eastAsia="Times New Roman" w:cs="Times New Roman"/>
-          <w:color w:val="98C379"/>
-          <w:kern w:val="0"/>
-          <w:sz w:val="21"/>
-          <w:szCs w:val="21"/>
-          <w14:ligatures w14:val="none"/>
-        </w:rPr>
-        <w:t>"</w:t>
+        <w:t>"unique_seat_number_per_vehicle"</w:t>
       </w:r>
     </w:p>
     <w:p>
@@ -15190,7 +14608,6 @@
         </w:rPr>
         <w:t xml:space="preserve"> </w:t>
       </w:r>
-      <w:proofErr w:type="spellStart"/>
       <w:r>
         <w:rPr>
           <w:rFonts w:eastAsia="Times New Roman" w:cs="Times New Roman"/>
@@ -15246,7 +14663,6 @@
         </w:rPr>
         <w:t>count</w:t>
       </w:r>
-      <w:proofErr w:type="spellEnd"/>
       <w:r>
         <w:rPr>
           <w:rFonts w:eastAsia="Times New Roman" w:cs="Times New Roman"/>
@@ -15280,7 +14696,6 @@
         </w:rPr>
         <w:t xml:space="preserve"> </w:t>
       </w:r>
-      <w:proofErr w:type="spellStart"/>
       <w:r>
         <w:rPr>
           <w:rFonts w:eastAsia="Times New Roman" w:cs="Times New Roman"/>
@@ -15323,19 +14738,7 @@
           <w:szCs w:val="21"/>
           <w14:ligatures w14:val="none"/>
         </w:rPr>
-        <w:t>.capacity</w:t>
-      </w:r>
-      <w:proofErr w:type="spellEnd"/>
-      <w:r>
-        <w:rPr>
-          <w:rFonts w:eastAsia="Times New Roman" w:cs="Times New Roman"/>
-          <w:color w:val="ABB2BF"/>
-          <w:kern w:val="0"/>
-          <w:sz w:val="21"/>
-          <w:szCs w:val="21"/>
-          <w14:ligatures w14:val="none"/>
-        </w:rPr>
-        <w:t>:</w:t>
+        <w:t>.capacity:</w:t>
       </w:r>
     </w:p>
     <w:p>
@@ -15385,7 +14788,6 @@
         </w:rPr>
         <w:t xml:space="preserve"> </w:t>
       </w:r>
-      <w:proofErr w:type="spellStart"/>
       <w:r>
         <w:rPr>
           <w:rFonts w:eastAsia="Times New Roman" w:cs="Times New Roman"/>
@@ -15397,7 +14799,6 @@
         </w:rPr>
         <w:t>ValidationError</w:t>
       </w:r>
-      <w:proofErr w:type="spellEnd"/>
       <w:r>
         <w:rPr>
           <w:rFonts w:eastAsia="Times New Roman" w:cs="Times New Roman"/>
@@ -15645,7 +15046,6 @@
         </w:rPr>
         <w:t>, *</w:t>
       </w:r>
-      <w:proofErr w:type="spellStart"/>
       <w:r>
         <w:rPr>
           <w:rFonts w:eastAsia="Times New Roman" w:cs="Times New Roman"/>
@@ -15657,7 +15057,6 @@
         </w:rPr>
         <w:t>args</w:t>
       </w:r>
-      <w:proofErr w:type="spellEnd"/>
       <w:r>
         <w:rPr>
           <w:rFonts w:eastAsia="Times New Roman" w:cs="Times New Roman"/>
@@ -15669,7 +15068,6 @@
         </w:rPr>
         <w:t>, **</w:t>
       </w:r>
-      <w:proofErr w:type="spellStart"/>
       <w:r>
         <w:rPr>
           <w:rFonts w:eastAsia="Times New Roman" w:cs="Times New Roman"/>
@@ -15681,7 +15079,6 @@
         </w:rPr>
         <w:t>kwargs</w:t>
       </w:r>
-      <w:proofErr w:type="spellEnd"/>
       <w:r>
         <w:rPr>
           <w:rFonts w:eastAsia="Times New Roman" w:cs="Times New Roman"/>
@@ -15719,7 +15116,6 @@
         </w:rPr>
         <w:t xml:space="preserve">        </w:t>
       </w:r>
-      <w:proofErr w:type="spellStart"/>
       <w:r>
         <w:rPr>
           <w:rFonts w:eastAsia="Times New Roman" w:cs="Times New Roman"/>
@@ -15753,7 +15149,6 @@
         </w:rPr>
         <w:t>full_clean</w:t>
       </w:r>
-      <w:proofErr w:type="spellEnd"/>
       <w:r>
         <w:rPr>
           <w:rFonts w:eastAsia="Times New Roman" w:cs="Times New Roman"/>
@@ -15835,7 +15230,6 @@
         </w:rPr>
         <w:t>(*</w:t>
       </w:r>
-      <w:proofErr w:type="spellStart"/>
       <w:r>
         <w:rPr>
           <w:rFonts w:eastAsia="Times New Roman" w:cs="Times New Roman"/>
@@ -15847,7 +15241,6 @@
         </w:rPr>
         <w:t>args</w:t>
       </w:r>
-      <w:proofErr w:type="spellEnd"/>
       <w:r>
         <w:rPr>
           <w:rFonts w:eastAsia="Times New Roman" w:cs="Times New Roman"/>
@@ -15859,7 +15252,6 @@
         </w:rPr>
         <w:t>, **</w:t>
       </w:r>
-      <w:proofErr w:type="spellStart"/>
       <w:r>
         <w:rPr>
           <w:rFonts w:eastAsia="Times New Roman" w:cs="Times New Roman"/>
@@ -15871,7 +15263,6 @@
         </w:rPr>
         <w:t>kwargs</w:t>
       </w:r>
-      <w:proofErr w:type="spellEnd"/>
       <w:r>
         <w:rPr>
           <w:rFonts w:eastAsia="Times New Roman" w:cs="Times New Roman"/>
@@ -16071,7 +15462,6 @@
         </w:rPr>
         <w:t>{</w:t>
       </w:r>
-      <w:proofErr w:type="spellStart"/>
       <w:r>
         <w:rPr>
           <w:rFonts w:eastAsia="Times New Roman" w:cs="Times New Roman"/>
@@ -16105,7 +15495,6 @@
         </w:rPr>
         <w:t>number</w:t>
       </w:r>
-      <w:proofErr w:type="spellEnd"/>
       <w:r>
         <w:rPr>
           <w:rFonts w:eastAsia="Times New Roman" w:cs="Times New Roman"/>
@@ -16139,7 +15528,6 @@
         </w:rPr>
         <w:t>{</w:t>
       </w:r>
-      <w:proofErr w:type="spellStart"/>
       <w:r>
         <w:rPr>
           <w:rFonts w:eastAsia="Times New Roman" w:cs="Times New Roman"/>
@@ -16184,7 +15572,6 @@
         </w:rPr>
         <w:t>.type</w:t>
       </w:r>
-      <w:proofErr w:type="spellEnd"/>
       <w:r>
         <w:rPr>
           <w:rFonts w:eastAsia="Times New Roman" w:cs="Times New Roman"/>
@@ -16218,7 +15605,6 @@
         </w:rPr>
         <w:t>{</w:t>
       </w:r>
-      <w:proofErr w:type="spellStart"/>
       <w:r>
         <w:rPr>
           <w:rFonts w:eastAsia="Times New Roman" w:cs="Times New Roman"/>
@@ -16263,7 +15649,6 @@
         </w:rPr>
         <w:t>.model</w:t>
       </w:r>
-      <w:proofErr w:type="spellEnd"/>
       <w:r>
         <w:rPr>
           <w:rFonts w:eastAsia="Times New Roman" w:cs="Times New Roman"/>
@@ -16313,8 +15698,6 @@
     <w:p>
       <w:pPr>
         <w:rPr>
-          <w:rFonts w:hint="cs"/>
-          <w:rtl/>
           <w:lang w:bidi="fa-IR"/>
         </w:rPr>
       </w:pPr>
@@ -16733,6 +16116,1401 @@
           <w:lang w:bidi="fa-IR"/>
         </w:rPr>
         <w:t>.</w:t>
+      </w:r>
+    </w:p>
+    <w:p>
+      <w:pPr>
+        <w:rPr>
+          <w:rtl/>
+        </w:rPr>
+      </w:pPr>
+      <w:r>
+        <w:rPr>
+          <w:rFonts w:hint="cs"/>
+          <w:rtl/>
+          <w:lang w:bidi="fa-IR"/>
+        </w:rPr>
+        <w:t xml:space="preserve">نکته مهم: </w:t>
+      </w:r>
+      <w:r>
+        <w:t>MinValueValidator</w:t>
+      </w:r>
+      <w:r>
+        <w:rPr>
+          <w:rFonts w:hint="cs"/>
+          <w:rtl/>
+          <w:lang w:bidi="fa-IR"/>
+        </w:rPr>
+        <w:t xml:space="preserve"> که </w:t>
+      </w:r>
+      <w:r>
+        <w:rPr>
+          <w:lang w:bidi="fa-IR"/>
+        </w:rPr>
+        <w:t>validator</w:t>
+      </w:r>
+      <w:r>
+        <w:rPr>
+          <w:rFonts w:hint="cs"/>
+          <w:rtl/>
+          <w:lang w:bidi="fa-IR"/>
+        </w:rPr>
+        <w:t xml:space="preserve"> است برای اعداد استفاده میشه برای </w:t>
+      </w:r>
+      <w:r>
+        <w:rPr>
+          <w:lang w:bidi="fa-IR"/>
+        </w:rPr>
+        <w:t>charfield</w:t>
+      </w:r>
+      <w:r>
+        <w:rPr>
+          <w:rFonts w:hint="cs"/>
+          <w:rtl/>
+          <w:lang w:bidi="fa-IR"/>
+        </w:rPr>
+        <w:t xml:space="preserve"> باید از </w:t>
+      </w:r>
+      <w:r>
+        <w:t>MinLengthValidator</w:t>
+      </w:r>
+      <w:r>
+        <w:rPr>
+          <w:rFonts w:hint="cs"/>
+          <w:rtl/>
+        </w:rPr>
+        <w:t xml:space="preserve"> استفاده کنیم</w:t>
+      </w:r>
+    </w:p>
+    <w:p>
+      <w:pPr>
+        <w:rPr>
+          <w:rtl/>
+        </w:rPr>
+      </w:pPr>
+    </w:p>
+    <w:p>
+      <w:pPr>
+        <w:rPr>
+          <w:rtl/>
+        </w:rPr>
+      </w:pPr>
+      <w:r>
+        <w:rPr>
+          <w:rFonts w:hint="cs"/>
+          <w:rtl/>
+        </w:rPr>
+        <w:t xml:space="preserve">وقتی میخوایم یوزر بسازیم و این رو مینویسیم </w:t>
+      </w:r>
+      <w:r>
+        <w:rPr>
+          <w:rStyle w:val="11"/>
+        </w:rPr>
+        <w:t>UserModel</w:t>
+      </w:r>
+      <w:r>
+        <w:rPr>
+          <w:rStyle w:val="v"/>
+        </w:rPr>
+        <w:t>.</w:t>
+      </w:r>
+      <w:r>
+        <w:t>objects</w:t>
+      </w:r>
+      <w:r>
+        <w:rPr>
+          <w:rStyle w:val="v"/>
+        </w:rPr>
+        <w:t>.</w:t>
+      </w:r>
+      <w:r>
+        <w:t>create_user</w:t>
+      </w:r>
+    </w:p>
+    <w:p>
+      <w:r>
+        <w:rPr>
+          <w:rFonts w:hint="cs"/>
+          <w:rtl/>
+        </w:rPr>
+        <w:t xml:space="preserve">در </w:t>
+      </w:r>
+      <w:r>
+        <w:t>create_user</w:t>
+      </w:r>
+      <w:r>
+        <w:rPr>
+          <w:rFonts w:hint="cs"/>
+          <w:rtl/>
+        </w:rPr>
+        <w:t xml:space="preserve"> خودش میاد پسورد رو هش میکنه با </w:t>
+      </w:r>
+      <w:r>
+        <w:t>set_user</w:t>
+      </w:r>
+    </w:p>
+    <w:p/>
+    <w:p>
+      <w:pPr>
+        <w:rPr>
+          <w:rtl/>
+          <w:lang w:bidi="fa-IR"/>
+        </w:rPr>
+      </w:pPr>
+      <w:r>
+        <w:rPr>
+          <w:lang w:bidi="fa-IR"/>
+        </w:rPr>
+        <w:t>Serializer</w:t>
+      </w:r>
+      <w:r>
+        <w:rPr>
+          <w:rFonts w:hint="cs"/>
+          <w:rtl/>
+          <w:lang w:bidi="fa-IR"/>
+        </w:rPr>
+        <w:t xml:space="preserve"> سه تا وظیفه اصلی داره</w:t>
+      </w:r>
+    </w:p>
+    <w:p>
+      <w:pPr>
+        <w:rPr>
+          <w:lang w:bidi="fa-IR"/>
+        </w:rPr>
+      </w:pPr>
+      <w:r>
+        <w:rPr>
+          <w:rFonts w:hint="cs"/>
+          <w:rtl/>
+          <w:lang w:bidi="fa-IR"/>
+        </w:rPr>
+        <w:t>1-</w:t>
+      </w:r>
+      <w:r>
+        <w:rPr>
+          <w:lang w:bidi="fa-IR"/>
+        </w:rPr>
+        <w:t>validation</w:t>
+      </w:r>
+    </w:p>
+    <w:p>
+      <w:pPr>
+        <w:rPr>
+          <w:rtl/>
+          <w:lang w:bidi="fa-IR"/>
+        </w:rPr>
+      </w:pPr>
+      <w:r>
+        <w:rPr>
+          <w:rFonts w:hint="cs"/>
+          <w:rtl/>
+          <w:lang w:bidi="fa-IR"/>
+        </w:rPr>
+        <w:t>2-تبدیل داده ها مصلا جیسون به مدل</w:t>
+      </w:r>
+    </w:p>
+    <w:p>
+      <w:pPr>
+        <w:rPr>
+          <w:lang w:bidi="fa-IR"/>
+        </w:rPr>
+      </w:pPr>
+      <w:r>
+        <w:rPr>
+          <w:rFonts w:hint="cs"/>
+          <w:rtl/>
+          <w:lang w:bidi="fa-IR"/>
+        </w:rPr>
+        <w:t xml:space="preserve">3-ساخت یا ویرایش مدل با </w:t>
+      </w:r>
+      <w:r>
+        <w:rPr>
+          <w:lang w:bidi="fa-IR"/>
+        </w:rPr>
+        <w:t>create, update</w:t>
+      </w:r>
+    </w:p>
+    <w:p>
+      <w:pPr>
+        <w:rPr>
+          <w:rtl/>
+          <w:lang w:bidi="fa-IR"/>
+        </w:rPr>
+      </w:pPr>
+      <w:r>
+        <w:rPr>
+          <w:rFonts w:hint="cs"/>
+          <w:rtl/>
+          <w:lang w:bidi="fa-IR"/>
+        </w:rPr>
+        <w:t xml:space="preserve">جنگو به صورت پیش فرض برای همه داده ها </w:t>
+      </w:r>
+      <w:r>
+        <w:rPr>
+          <w:lang w:bidi="fa-IR"/>
+        </w:rPr>
+        <w:t>validation</w:t>
+      </w:r>
+      <w:r>
+        <w:rPr>
+          <w:rFonts w:hint="cs"/>
+          <w:rtl/>
+          <w:lang w:bidi="fa-IR"/>
+        </w:rPr>
+        <w:t xml:space="preserve"> داره </w:t>
+      </w:r>
+    </w:p>
+    <w:p>
+      <w:pPr>
+        <w:rPr>
+          <w:rtl/>
+          <w:lang w:bidi="fa-IR"/>
+        </w:rPr>
+      </w:pPr>
+      <w:r>
+        <w:rPr>
+          <w:rFonts w:hint="eastAsia"/>
+          <w:rtl/>
+          <w:lang w:bidi="fa-IR"/>
+        </w:rPr>
+        <w:t>پس</w:t>
+      </w:r>
+      <w:r>
+        <w:rPr>
+          <w:rtl/>
+          <w:lang w:bidi="fa-IR"/>
+        </w:rPr>
+        <w:t xml:space="preserve"> </w:t>
+      </w:r>
+      <w:r>
+        <w:rPr>
+          <w:rFonts w:hint="eastAsia"/>
+          <w:rtl/>
+          <w:lang w:bidi="fa-IR"/>
+        </w:rPr>
+        <w:t>ما</w:t>
+      </w:r>
+      <w:r>
+        <w:rPr>
+          <w:rtl/>
+          <w:lang w:bidi="fa-IR"/>
+        </w:rPr>
+        <w:t xml:space="preserve"> </w:t>
+      </w:r>
+      <w:r>
+        <w:rPr>
+          <w:rFonts w:hint="eastAsia"/>
+          <w:rtl/>
+          <w:lang w:bidi="fa-IR"/>
+        </w:rPr>
+        <w:t>ک</w:t>
+      </w:r>
+      <w:r>
+        <w:rPr>
+          <w:rFonts w:hint="cs"/>
+          <w:rtl/>
+          <w:lang w:bidi="fa-IR"/>
+        </w:rPr>
+        <w:t>ی</w:t>
+      </w:r>
+      <w:r>
+        <w:rPr>
+          <w:rtl/>
+          <w:lang w:bidi="fa-IR"/>
+        </w:rPr>
+        <w:t xml:space="preserve"> </w:t>
+      </w:r>
+      <w:r>
+        <w:rPr>
+          <w:lang w:bidi="fa-IR"/>
+        </w:rPr>
+        <w:t>Validation</w:t>
+      </w:r>
+      <w:r>
+        <w:rPr>
+          <w:rtl/>
+          <w:lang w:bidi="fa-IR"/>
+        </w:rPr>
+        <w:t xml:space="preserve"> </w:t>
+      </w:r>
+      <w:r>
+        <w:rPr>
+          <w:rFonts w:hint="eastAsia"/>
+          <w:rtl/>
+          <w:lang w:bidi="fa-IR"/>
+        </w:rPr>
+        <w:t>م</w:t>
+      </w:r>
+      <w:r>
+        <w:rPr>
+          <w:rFonts w:hint="cs"/>
+          <w:rtl/>
+          <w:lang w:bidi="fa-IR"/>
+        </w:rPr>
+        <w:t>ی‌</w:t>
+      </w:r>
+      <w:r>
+        <w:rPr>
+          <w:rFonts w:hint="eastAsia"/>
+          <w:rtl/>
+          <w:lang w:bidi="fa-IR"/>
+        </w:rPr>
+        <w:t>نو</w:t>
+      </w:r>
+      <w:r>
+        <w:rPr>
+          <w:rFonts w:hint="cs"/>
+          <w:rtl/>
+          <w:lang w:bidi="fa-IR"/>
+        </w:rPr>
+        <w:t>ی</w:t>
+      </w:r>
+      <w:r>
+        <w:rPr>
+          <w:rFonts w:hint="eastAsia"/>
+          <w:rtl/>
+          <w:lang w:bidi="fa-IR"/>
+        </w:rPr>
+        <w:t>س</w:t>
+      </w:r>
+      <w:r>
+        <w:rPr>
+          <w:rFonts w:hint="cs"/>
+          <w:rtl/>
+          <w:lang w:bidi="fa-IR"/>
+        </w:rPr>
+        <w:t>ی</w:t>
+      </w:r>
+      <w:r>
+        <w:rPr>
+          <w:rFonts w:hint="eastAsia"/>
+          <w:rtl/>
+          <w:lang w:bidi="fa-IR"/>
+        </w:rPr>
+        <w:t>م؟</w:t>
+      </w:r>
+    </w:p>
+    <w:p>
+      <w:pPr>
+        <w:rPr>
+          <w:lang w:bidi="fa-IR"/>
+        </w:rPr>
+      </w:pPr>
+      <w:r>
+        <w:rPr>
+          <w:rFonts w:hint="eastAsia"/>
+          <w:rtl/>
+          <w:lang w:bidi="fa-IR"/>
+        </w:rPr>
+        <w:t>وقت</w:t>
+      </w:r>
+      <w:r>
+        <w:rPr>
+          <w:rFonts w:hint="cs"/>
+          <w:rtl/>
+          <w:lang w:bidi="fa-IR"/>
+        </w:rPr>
+        <w:t>ی</w:t>
+      </w:r>
+      <w:r>
+        <w:rPr>
+          <w:rtl/>
+          <w:lang w:bidi="fa-IR"/>
+        </w:rPr>
+        <w:t xml:space="preserve"> </w:t>
+      </w:r>
+      <w:r>
+        <w:rPr>
+          <w:rFonts w:hint="eastAsia"/>
+          <w:rtl/>
+          <w:lang w:bidi="fa-IR"/>
+        </w:rPr>
+        <w:t>قانون</w:t>
+      </w:r>
+      <w:r>
+        <w:rPr>
+          <w:rFonts w:hint="cs"/>
+          <w:rtl/>
+          <w:lang w:bidi="fa-IR"/>
+        </w:rPr>
+        <w:t>ی</w:t>
+      </w:r>
+      <w:r>
+        <w:rPr>
+          <w:rtl/>
+          <w:lang w:bidi="fa-IR"/>
+        </w:rPr>
+        <w:t xml:space="preserve"> </w:t>
+      </w:r>
+      <w:r>
+        <w:rPr>
+          <w:rFonts w:hint="eastAsia"/>
+          <w:rtl/>
+          <w:lang w:bidi="fa-IR"/>
+        </w:rPr>
+        <w:t>وجود</w:t>
+      </w:r>
+      <w:r>
+        <w:rPr>
+          <w:rtl/>
+          <w:lang w:bidi="fa-IR"/>
+        </w:rPr>
+        <w:t xml:space="preserve"> </w:t>
+      </w:r>
+      <w:r>
+        <w:rPr>
+          <w:rFonts w:hint="eastAsia"/>
+          <w:rtl/>
+          <w:lang w:bidi="fa-IR"/>
+        </w:rPr>
+        <w:t>دارد</w:t>
+      </w:r>
+      <w:r>
+        <w:rPr>
+          <w:rtl/>
+          <w:lang w:bidi="fa-IR"/>
+        </w:rPr>
+        <w:t xml:space="preserve"> </w:t>
+      </w:r>
+      <w:r>
+        <w:rPr>
+          <w:rFonts w:hint="eastAsia"/>
+          <w:rtl/>
+          <w:lang w:bidi="fa-IR"/>
+        </w:rPr>
+        <w:t>که</w:t>
+      </w:r>
+      <w:r>
+        <w:rPr>
+          <w:rtl/>
+          <w:lang w:bidi="fa-IR"/>
+        </w:rPr>
+        <w:t xml:space="preserve"> </w:t>
+      </w:r>
+      <w:r>
+        <w:rPr>
+          <w:rFonts w:hint="eastAsia"/>
+          <w:rtl/>
+          <w:lang w:bidi="fa-IR"/>
+        </w:rPr>
+        <w:t>در</w:t>
+      </w:r>
+      <w:r>
+        <w:rPr>
+          <w:rtl/>
+          <w:lang w:bidi="fa-IR"/>
+        </w:rPr>
+        <w:t xml:space="preserve"> </w:t>
+      </w:r>
+      <w:r>
+        <w:rPr>
+          <w:rFonts w:hint="eastAsia"/>
+          <w:rtl/>
+          <w:lang w:bidi="fa-IR"/>
+        </w:rPr>
+        <w:t>مدل</w:t>
+      </w:r>
+      <w:r>
+        <w:rPr>
+          <w:rtl/>
+          <w:lang w:bidi="fa-IR"/>
+        </w:rPr>
+        <w:t xml:space="preserve"> </w:t>
+      </w:r>
+      <w:r>
+        <w:rPr>
+          <w:rFonts w:hint="eastAsia"/>
+          <w:rtl/>
+          <w:lang w:bidi="fa-IR"/>
+        </w:rPr>
+        <w:t>به</w:t>
+      </w:r>
+      <w:r>
+        <w:rPr>
+          <w:rtl/>
+          <w:lang w:bidi="fa-IR"/>
+        </w:rPr>
+        <w:t xml:space="preserve"> </w:t>
+      </w:r>
+      <w:r>
+        <w:rPr>
+          <w:rFonts w:hint="eastAsia"/>
+          <w:rtl/>
+          <w:lang w:bidi="fa-IR"/>
+        </w:rPr>
+        <w:t>صورت</w:t>
+      </w:r>
+      <w:r>
+        <w:rPr>
+          <w:rtl/>
+          <w:lang w:bidi="fa-IR"/>
+        </w:rPr>
+        <w:t xml:space="preserve"> </w:t>
+      </w:r>
+      <w:r>
+        <w:rPr>
+          <w:rFonts w:hint="eastAsia"/>
+          <w:rtl/>
+          <w:lang w:bidi="fa-IR"/>
+        </w:rPr>
+        <w:t>مستق</w:t>
+      </w:r>
+      <w:r>
+        <w:rPr>
+          <w:rFonts w:hint="cs"/>
+          <w:rtl/>
+          <w:lang w:bidi="fa-IR"/>
+        </w:rPr>
+        <w:t>ی</w:t>
+      </w:r>
+      <w:r>
+        <w:rPr>
+          <w:rFonts w:hint="eastAsia"/>
+          <w:rtl/>
+          <w:lang w:bidi="fa-IR"/>
+        </w:rPr>
+        <w:t>م</w:t>
+      </w:r>
+      <w:r>
+        <w:rPr>
+          <w:rtl/>
+          <w:lang w:bidi="fa-IR"/>
+        </w:rPr>
+        <w:t xml:space="preserve"> </w:t>
+      </w:r>
+      <w:r>
+        <w:rPr>
+          <w:rFonts w:hint="eastAsia"/>
+          <w:rtl/>
+          <w:lang w:bidi="fa-IR"/>
+        </w:rPr>
+        <w:t>قابل</w:t>
+      </w:r>
+      <w:r>
+        <w:rPr>
+          <w:rtl/>
+          <w:lang w:bidi="fa-IR"/>
+        </w:rPr>
+        <w:t xml:space="preserve"> </w:t>
+      </w:r>
+      <w:r>
+        <w:rPr>
+          <w:rFonts w:hint="eastAsia"/>
+          <w:rtl/>
+          <w:lang w:bidi="fa-IR"/>
+        </w:rPr>
+        <w:t>ب</w:t>
+      </w:r>
+      <w:r>
+        <w:rPr>
+          <w:rFonts w:hint="cs"/>
+          <w:rtl/>
+          <w:lang w:bidi="fa-IR"/>
+        </w:rPr>
+        <w:t>ی</w:t>
+      </w:r>
+      <w:r>
+        <w:rPr>
+          <w:rFonts w:hint="eastAsia"/>
+          <w:rtl/>
+          <w:lang w:bidi="fa-IR"/>
+        </w:rPr>
+        <w:t>ان</w:t>
+      </w:r>
+      <w:r>
+        <w:rPr>
+          <w:rtl/>
+          <w:lang w:bidi="fa-IR"/>
+        </w:rPr>
+        <w:t xml:space="preserve"> </w:t>
+      </w:r>
+      <w:r>
+        <w:rPr>
+          <w:rFonts w:hint="eastAsia"/>
+          <w:rtl/>
+          <w:lang w:bidi="fa-IR"/>
+        </w:rPr>
+        <w:t>ن</w:t>
+      </w:r>
+      <w:r>
+        <w:rPr>
+          <w:rFonts w:hint="cs"/>
+          <w:rtl/>
+          <w:lang w:bidi="fa-IR"/>
+        </w:rPr>
+        <w:t>ی</w:t>
+      </w:r>
+      <w:r>
+        <w:rPr>
+          <w:rFonts w:hint="eastAsia"/>
+          <w:rtl/>
+          <w:lang w:bidi="fa-IR"/>
+        </w:rPr>
+        <w:t>ست</w:t>
+      </w:r>
+      <w:r>
+        <w:rPr>
+          <w:rtl/>
+          <w:lang w:bidi="fa-IR"/>
+        </w:rPr>
+        <w:t>.</w:t>
+      </w:r>
+      <w:r>
+        <w:rPr>
+          <w:rFonts w:hint="cs"/>
+          <w:rtl/>
+          <w:lang w:bidi="fa-IR"/>
+        </w:rPr>
+        <w:t xml:space="preserve"> مثلا رمزعبور شامل یک حرف بزرگ باشه</w:t>
+      </w:r>
+    </w:p>
+    <w:p>
+      <w:pPr>
+        <w:rPr>
+          <w:rtl/>
+          <w:lang w:bidi="fa-IR"/>
+        </w:rPr>
+      </w:pPr>
+      <w:r>
+        <w:rPr>
+          <w:rFonts w:hint="cs"/>
+          <w:rtl/>
+          <w:lang w:bidi="fa-IR"/>
+        </w:rPr>
+        <w:t>کد زیر داره چیکار میکنه؟</w:t>
+      </w:r>
+    </w:p>
+    <w:p>
+      <w:pPr>
+        <w:shd w:val="clear" w:color="auto" w:fill="23272E"/>
+        <w:bidi w:val="0"/>
+        <w:spacing w:after="0" w:line="285" w:lineRule="atLeast"/>
+        <w:rPr>
+          <w:rFonts w:eastAsia="Times New Roman" w:cs="Times New Roman"/>
+          <w:color w:val="ABB2BF"/>
+          <w:kern w:val="0"/>
+          <w:sz w:val="21"/>
+          <w:szCs w:val="21"/>
+          <w14:ligatures w14:val="none"/>
+        </w:rPr>
+      </w:pPr>
+      <w:r>
+        <w:rPr>
+          <w:rFonts w:eastAsia="Times New Roman" w:cs="Times New Roman"/>
+          <w:color w:val="ABB2BF"/>
+          <w:kern w:val="0"/>
+          <w:sz w:val="21"/>
+          <w:szCs w:val="21"/>
+          <w14:ligatures w14:val="none"/>
+        </w:rPr>
+        <w:t xml:space="preserve">    </w:t>
+      </w:r>
+      <w:r>
+        <w:rPr>
+          <w:rFonts w:eastAsia="Times New Roman" w:cs="Times New Roman"/>
+          <w:color w:val="C678DD"/>
+          <w:kern w:val="0"/>
+          <w:sz w:val="21"/>
+          <w:szCs w:val="21"/>
+          <w14:ligatures w14:val="none"/>
+        </w:rPr>
+        <w:t>def</w:t>
+      </w:r>
+      <w:r>
+        <w:rPr>
+          <w:rFonts w:eastAsia="Times New Roman" w:cs="Times New Roman"/>
+          <w:color w:val="ABB2BF"/>
+          <w:kern w:val="0"/>
+          <w:sz w:val="21"/>
+          <w:szCs w:val="21"/>
+          <w14:ligatures w14:val="none"/>
+        </w:rPr>
+        <w:t xml:space="preserve"> </w:t>
+      </w:r>
+      <w:r>
+        <w:rPr>
+          <w:rFonts w:eastAsia="Times New Roman" w:cs="Times New Roman"/>
+          <w:color w:val="61AFEF"/>
+          <w:kern w:val="0"/>
+          <w:sz w:val="21"/>
+          <w:szCs w:val="21"/>
+          <w14:ligatures w14:val="none"/>
+        </w:rPr>
+        <w:t>validate</w:t>
+      </w:r>
+      <w:r>
+        <w:rPr>
+          <w:rFonts w:eastAsia="Times New Roman" w:cs="Times New Roman"/>
+          <w:color w:val="ABB2BF"/>
+          <w:kern w:val="0"/>
+          <w:sz w:val="21"/>
+          <w:szCs w:val="21"/>
+          <w14:ligatures w14:val="none"/>
+        </w:rPr>
+        <w:t>(</w:t>
+      </w:r>
+      <w:r>
+        <w:rPr>
+          <w:rFonts w:eastAsia="Times New Roman" w:cs="Times New Roman"/>
+          <w:color w:val="E5C07B"/>
+          <w:kern w:val="0"/>
+          <w:sz w:val="21"/>
+          <w:szCs w:val="21"/>
+          <w14:ligatures w14:val="none"/>
+        </w:rPr>
+        <w:t>self</w:t>
+      </w:r>
+      <w:r>
+        <w:rPr>
+          <w:rFonts w:eastAsia="Times New Roman" w:cs="Times New Roman"/>
+          <w:color w:val="ABB2BF"/>
+          <w:kern w:val="0"/>
+          <w:sz w:val="21"/>
+          <w:szCs w:val="21"/>
+          <w14:ligatures w14:val="none"/>
+        </w:rPr>
+        <w:t xml:space="preserve">, </w:t>
+      </w:r>
+      <w:r>
+        <w:rPr>
+          <w:rFonts w:eastAsia="Times New Roman" w:cs="Times New Roman"/>
+          <w:color w:val="E06C75"/>
+          <w:kern w:val="0"/>
+          <w:sz w:val="21"/>
+          <w:szCs w:val="21"/>
+          <w14:ligatures w14:val="none"/>
+        </w:rPr>
+        <w:t>attrs</w:t>
+      </w:r>
+      <w:r>
+        <w:rPr>
+          <w:rFonts w:eastAsia="Times New Roman" w:cs="Times New Roman"/>
+          <w:color w:val="ABB2BF"/>
+          <w:kern w:val="0"/>
+          <w:sz w:val="21"/>
+          <w:szCs w:val="21"/>
+          <w14:ligatures w14:val="none"/>
+        </w:rPr>
+        <w:t>):</w:t>
+      </w:r>
+    </w:p>
+    <w:p>
+      <w:pPr>
+        <w:shd w:val="clear" w:color="auto" w:fill="23272E"/>
+        <w:bidi w:val="0"/>
+        <w:spacing w:after="0" w:line="285" w:lineRule="atLeast"/>
+        <w:rPr>
+          <w:rFonts w:eastAsia="Times New Roman" w:cs="Times New Roman"/>
+          <w:color w:val="ABB2BF"/>
+          <w:kern w:val="0"/>
+          <w:sz w:val="21"/>
+          <w:szCs w:val="21"/>
+          <w14:ligatures w14:val="none"/>
+        </w:rPr>
+      </w:pPr>
+      <w:r>
+        <w:rPr>
+          <w:rFonts w:eastAsia="Times New Roman" w:cs="Times New Roman"/>
+          <w:color w:val="ABB2BF"/>
+          <w:kern w:val="0"/>
+          <w:sz w:val="21"/>
+          <w:szCs w:val="21"/>
+          <w14:ligatures w14:val="none"/>
+        </w:rPr>
+        <w:t xml:space="preserve">        </w:t>
+      </w:r>
+      <w:r>
+        <w:rPr>
+          <w:rFonts w:eastAsia="Times New Roman" w:cs="Times New Roman"/>
+          <w:color w:val="C678DD"/>
+          <w:kern w:val="0"/>
+          <w:sz w:val="21"/>
+          <w:szCs w:val="21"/>
+          <w14:ligatures w14:val="none"/>
+        </w:rPr>
+        <w:t>if</w:t>
+      </w:r>
+      <w:r>
+        <w:rPr>
+          <w:rFonts w:eastAsia="Times New Roman" w:cs="Times New Roman"/>
+          <w:color w:val="ABB2BF"/>
+          <w:kern w:val="0"/>
+          <w:sz w:val="21"/>
+          <w:szCs w:val="21"/>
+          <w14:ligatures w14:val="none"/>
+        </w:rPr>
+        <w:t xml:space="preserve"> </w:t>
+      </w:r>
+      <w:r>
+        <w:rPr>
+          <w:rFonts w:eastAsia="Times New Roman" w:cs="Times New Roman"/>
+          <w:color w:val="E06C75"/>
+          <w:kern w:val="0"/>
+          <w:sz w:val="21"/>
+          <w:szCs w:val="21"/>
+          <w14:ligatures w14:val="none"/>
+        </w:rPr>
+        <w:t>attrs</w:t>
+      </w:r>
+      <w:r>
+        <w:rPr>
+          <w:rFonts w:eastAsia="Times New Roman" w:cs="Times New Roman"/>
+          <w:color w:val="ABB2BF"/>
+          <w:kern w:val="0"/>
+          <w:sz w:val="21"/>
+          <w:szCs w:val="21"/>
+          <w14:ligatures w14:val="none"/>
+        </w:rPr>
+        <w:t>[</w:t>
+      </w:r>
+      <w:r>
+        <w:rPr>
+          <w:rFonts w:eastAsia="Times New Roman" w:cs="Times New Roman"/>
+          <w:color w:val="98C379"/>
+          <w:kern w:val="0"/>
+          <w:sz w:val="21"/>
+          <w:szCs w:val="21"/>
+          <w14:ligatures w14:val="none"/>
+        </w:rPr>
+        <w:t>"first_name"</w:t>
+      </w:r>
+      <w:r>
+        <w:rPr>
+          <w:rFonts w:eastAsia="Times New Roman" w:cs="Times New Roman"/>
+          <w:color w:val="ABB2BF"/>
+          <w:kern w:val="0"/>
+          <w:sz w:val="21"/>
+          <w:szCs w:val="21"/>
+          <w14:ligatures w14:val="none"/>
+        </w:rPr>
+        <w:t xml:space="preserve">] </w:t>
+      </w:r>
+      <w:r>
+        <w:rPr>
+          <w:rFonts w:eastAsia="Times New Roman" w:cs="Times New Roman"/>
+          <w:color w:val="56B6C2"/>
+          <w:kern w:val="0"/>
+          <w:sz w:val="21"/>
+          <w:szCs w:val="21"/>
+          <w14:ligatures w14:val="none"/>
+        </w:rPr>
+        <w:t>==</w:t>
+      </w:r>
+      <w:r>
+        <w:rPr>
+          <w:rFonts w:eastAsia="Times New Roman" w:cs="Times New Roman"/>
+          <w:color w:val="ABB2BF"/>
+          <w:kern w:val="0"/>
+          <w:sz w:val="21"/>
+          <w:szCs w:val="21"/>
+          <w14:ligatures w14:val="none"/>
+        </w:rPr>
+        <w:t xml:space="preserve"> </w:t>
+      </w:r>
+      <w:r>
+        <w:rPr>
+          <w:rFonts w:eastAsia="Times New Roman" w:cs="Times New Roman"/>
+          <w:color w:val="E06C75"/>
+          <w:kern w:val="0"/>
+          <w:sz w:val="21"/>
+          <w:szCs w:val="21"/>
+          <w14:ligatures w14:val="none"/>
+        </w:rPr>
+        <w:t>attrs</w:t>
+      </w:r>
+      <w:r>
+        <w:rPr>
+          <w:rFonts w:eastAsia="Times New Roman" w:cs="Times New Roman"/>
+          <w:color w:val="ABB2BF"/>
+          <w:kern w:val="0"/>
+          <w:sz w:val="21"/>
+          <w:szCs w:val="21"/>
+          <w14:ligatures w14:val="none"/>
+        </w:rPr>
+        <w:t>[</w:t>
+      </w:r>
+      <w:r>
+        <w:rPr>
+          <w:rFonts w:eastAsia="Times New Roman" w:cs="Times New Roman"/>
+          <w:color w:val="98C379"/>
+          <w:kern w:val="0"/>
+          <w:sz w:val="21"/>
+          <w:szCs w:val="21"/>
+          <w14:ligatures w14:val="none"/>
+        </w:rPr>
+        <w:t>"last_name"</w:t>
+      </w:r>
+      <w:r>
+        <w:rPr>
+          <w:rFonts w:eastAsia="Times New Roman" w:cs="Times New Roman"/>
+          <w:color w:val="ABB2BF"/>
+          <w:kern w:val="0"/>
+          <w:sz w:val="21"/>
+          <w:szCs w:val="21"/>
+          <w14:ligatures w14:val="none"/>
+        </w:rPr>
+        <w:t>]:</w:t>
+      </w:r>
+    </w:p>
+    <w:p>
+      <w:pPr>
+        <w:shd w:val="clear" w:color="auto" w:fill="23272E"/>
+        <w:bidi w:val="0"/>
+        <w:spacing w:after="0" w:line="285" w:lineRule="atLeast"/>
+        <w:rPr>
+          <w:rFonts w:eastAsia="Times New Roman" w:cs="Times New Roman"/>
+          <w:color w:val="ABB2BF"/>
+          <w:kern w:val="0"/>
+          <w:sz w:val="21"/>
+          <w:szCs w:val="21"/>
+          <w14:ligatures w14:val="none"/>
+        </w:rPr>
+      </w:pPr>
+      <w:r>
+        <w:rPr>
+          <w:rFonts w:eastAsia="Times New Roman" w:cs="Times New Roman"/>
+          <w:color w:val="ABB2BF"/>
+          <w:kern w:val="0"/>
+          <w:sz w:val="21"/>
+          <w:szCs w:val="21"/>
+          <w14:ligatures w14:val="none"/>
+        </w:rPr>
+        <w:t xml:space="preserve">            </w:t>
+      </w:r>
+      <w:r>
+        <w:rPr>
+          <w:rFonts w:eastAsia="Times New Roman" w:cs="Times New Roman"/>
+          <w:color w:val="C678DD"/>
+          <w:kern w:val="0"/>
+          <w:sz w:val="21"/>
+          <w:szCs w:val="21"/>
+          <w14:ligatures w14:val="none"/>
+        </w:rPr>
+        <w:t>raise</w:t>
+      </w:r>
+      <w:r>
+        <w:rPr>
+          <w:rFonts w:eastAsia="Times New Roman" w:cs="Times New Roman"/>
+          <w:color w:val="ABB2BF"/>
+          <w:kern w:val="0"/>
+          <w:sz w:val="21"/>
+          <w:szCs w:val="21"/>
+          <w14:ligatures w14:val="none"/>
+        </w:rPr>
+        <w:t xml:space="preserve"> </w:t>
+      </w:r>
+      <w:r>
+        <w:rPr>
+          <w:rFonts w:eastAsia="Times New Roman" w:cs="Times New Roman"/>
+          <w:color w:val="E5C07B"/>
+          <w:kern w:val="0"/>
+          <w:sz w:val="21"/>
+          <w:szCs w:val="21"/>
+          <w14:ligatures w14:val="none"/>
+        </w:rPr>
+        <w:t>ValidationError</w:t>
+      </w:r>
+      <w:r>
+        <w:rPr>
+          <w:rFonts w:eastAsia="Times New Roman" w:cs="Times New Roman"/>
+          <w:color w:val="ABB2BF"/>
+          <w:kern w:val="0"/>
+          <w:sz w:val="21"/>
+          <w:szCs w:val="21"/>
+          <w14:ligatures w14:val="none"/>
+        </w:rPr>
+        <w:t>({</w:t>
+      </w:r>
+      <w:r>
+        <w:rPr>
+          <w:rFonts w:eastAsia="Times New Roman" w:cs="Times New Roman"/>
+          <w:color w:val="98C379"/>
+          <w:kern w:val="0"/>
+          <w:sz w:val="21"/>
+          <w:szCs w:val="21"/>
+          <w14:ligatures w14:val="none"/>
+        </w:rPr>
+        <w:t>"last_name"</w:t>
+      </w:r>
+      <w:r>
+        <w:rPr>
+          <w:rFonts w:eastAsia="Times New Roman" w:cs="Times New Roman"/>
+          <w:color w:val="ABB2BF"/>
+          <w:kern w:val="0"/>
+          <w:sz w:val="21"/>
+          <w:szCs w:val="21"/>
+          <w14:ligatures w14:val="none"/>
+        </w:rPr>
+        <w:t xml:space="preserve">: </w:t>
+      </w:r>
+      <w:r>
+        <w:rPr>
+          <w:rFonts w:eastAsia="Times New Roman" w:cs="Times New Roman"/>
+          <w:color w:val="98C379"/>
+          <w:kern w:val="0"/>
+          <w:sz w:val="21"/>
+          <w:szCs w:val="21"/>
+          <w14:ligatures w14:val="none"/>
+        </w:rPr>
+        <w:t>"first name and last name should not be the same."</w:t>
+      </w:r>
+      <w:r>
+        <w:rPr>
+          <w:rFonts w:eastAsia="Times New Roman" w:cs="Times New Roman"/>
+          <w:color w:val="ABB2BF"/>
+          <w:kern w:val="0"/>
+          <w:sz w:val="21"/>
+          <w:szCs w:val="21"/>
+          <w14:ligatures w14:val="none"/>
+        </w:rPr>
+        <w:t xml:space="preserve">}) </w:t>
+      </w:r>
+    </w:p>
+    <w:p>
+      <w:pPr>
+        <w:shd w:val="clear" w:color="auto" w:fill="23272E"/>
+        <w:bidi w:val="0"/>
+        <w:spacing w:after="0" w:line="285" w:lineRule="atLeast"/>
+        <w:rPr>
+          <w:rFonts w:eastAsia="Times New Roman" w:cs="Times New Roman"/>
+          <w:color w:val="ABB2BF"/>
+          <w:kern w:val="0"/>
+          <w:sz w:val="21"/>
+          <w:szCs w:val="21"/>
+          <w14:ligatures w14:val="none"/>
+        </w:rPr>
+      </w:pPr>
+      <w:r>
+        <w:rPr>
+          <w:rFonts w:eastAsia="Times New Roman" w:cs="Times New Roman"/>
+          <w:color w:val="ABB2BF"/>
+          <w:kern w:val="0"/>
+          <w:sz w:val="21"/>
+          <w:szCs w:val="21"/>
+          <w14:ligatures w14:val="none"/>
+        </w:rPr>
+        <w:t xml:space="preserve">        </w:t>
+      </w:r>
+      <w:r>
+        <w:rPr>
+          <w:rFonts w:eastAsia="Times New Roman" w:cs="Times New Roman"/>
+          <w:color w:val="C678DD"/>
+          <w:kern w:val="0"/>
+          <w:sz w:val="21"/>
+          <w:szCs w:val="21"/>
+          <w14:ligatures w14:val="none"/>
+        </w:rPr>
+        <w:t>return</w:t>
+      </w:r>
+      <w:r>
+        <w:rPr>
+          <w:rFonts w:eastAsia="Times New Roman" w:cs="Times New Roman"/>
+          <w:color w:val="ABB2BF"/>
+          <w:kern w:val="0"/>
+          <w:sz w:val="21"/>
+          <w:szCs w:val="21"/>
+          <w14:ligatures w14:val="none"/>
+        </w:rPr>
+        <w:t xml:space="preserve"> </w:t>
+      </w:r>
+      <w:r>
+        <w:rPr>
+          <w:rFonts w:eastAsia="Times New Roman" w:cs="Times New Roman"/>
+          <w:color w:val="E06C75"/>
+          <w:kern w:val="0"/>
+          <w:sz w:val="21"/>
+          <w:szCs w:val="21"/>
+          <w14:ligatures w14:val="none"/>
+        </w:rPr>
+        <w:t>attrs</w:t>
+      </w:r>
+    </w:p>
+    <w:p>
+      <w:pPr>
+        <w:rPr>
+          <w:rFonts w:hint="cs"/>
+          <w:rtl/>
+          <w:lang w:bidi="fa-IR"/>
+        </w:rPr>
+      </w:pPr>
+      <w:r>
+        <w:rPr>
+          <w:rFonts w:hint="cs"/>
+          <w:rtl/>
+          <w:lang w:bidi="fa-IR"/>
+        </w:rPr>
+        <w:t xml:space="preserve">میاد داده ای که از </w:t>
+      </w:r>
+      <w:r>
+        <w:rPr>
+          <w:lang w:bidi="fa-IR"/>
+        </w:rPr>
+        <w:t>request.data</w:t>
+      </w:r>
+      <w:r>
+        <w:rPr>
+          <w:rFonts w:hint="cs"/>
+          <w:rtl/>
+          <w:lang w:bidi="fa-IR"/>
+        </w:rPr>
+        <w:t xml:space="preserve"> گرفته که یک دیکشنری توی </w:t>
+      </w:r>
+      <w:r>
+        <w:rPr>
+          <w:lang w:bidi="fa-IR"/>
+        </w:rPr>
+        <w:t>attrs</w:t>
+      </w:r>
+      <w:r>
+        <w:rPr>
+          <w:rFonts w:hint="cs"/>
+          <w:rtl/>
+          <w:lang w:bidi="fa-IR"/>
+        </w:rPr>
+        <w:t xml:space="preserve"> میگیرتش و </w:t>
+      </w:r>
+      <w:r>
+        <w:rPr>
+          <w:lang w:bidi="fa-IR"/>
+        </w:rPr>
+        <w:t>validation</w:t>
+      </w:r>
+      <w:r>
+        <w:rPr>
+          <w:rFonts w:hint="cs"/>
+          <w:rtl/>
+          <w:lang w:bidi="fa-IR"/>
+        </w:rPr>
+        <w:t xml:space="preserve"> رو روش انجام میده</w:t>
+      </w:r>
+    </w:p>
+    <w:p>
+      <w:pPr>
+        <w:rPr>
+          <w:rtl/>
+          <w:lang w:bidi="fa-IR"/>
+        </w:rPr>
+      </w:pPr>
+    </w:p>
+    <w:p>
+      <w:pPr>
+        <w:rPr>
+          <w:rtl/>
+          <w:lang w:bidi="fa-IR"/>
+        </w:rPr>
+      </w:pPr>
+    </w:p>
+    <w:p>
+      <w:pPr>
+        <w:rPr>
+          <w:rtl/>
+          <w:lang w:bidi="fa-IR"/>
+        </w:rPr>
+      </w:pPr>
+    </w:p>
+    <w:p>
+      <w:pPr>
+        <w:rPr>
+          <w:rtl/>
+          <w:lang w:bidi="fa-IR"/>
+        </w:rPr>
+      </w:pPr>
+    </w:p>
+    <w:p>
+      <w:pPr>
+        <w:rPr>
+          <w:rtl/>
+          <w:lang w:bidi="fa-IR"/>
+        </w:rPr>
+      </w:pPr>
+    </w:p>
+    <w:p>
+      <w:pPr>
+        <w:rPr>
+          <w:lang w:bidi="fa-IR"/>
+        </w:rPr>
+      </w:pPr>
+    </w:p>
+    <w:p>
+      <w:pPr>
+        <w:rPr>
+          <w:rtl/>
+          <w:lang w:bidi="fa-IR"/>
+        </w:rPr>
+      </w:pPr>
+      <w:r>
+        <w:rPr>
+          <w:rFonts w:hint="cs"/>
+          <w:rtl/>
+          <w:lang w:bidi="fa-IR"/>
+        </w:rPr>
+        <w:t xml:space="preserve">ترتیب اجرای </w:t>
+      </w:r>
+      <w:r>
+        <w:rPr>
+          <w:lang w:bidi="fa-IR"/>
+        </w:rPr>
+        <w:t>validation</w:t>
+      </w:r>
+      <w:r>
+        <w:rPr>
+          <w:rFonts w:hint="cs"/>
+          <w:rtl/>
+          <w:lang w:bidi="fa-IR"/>
+        </w:rPr>
+        <w:t xml:space="preserve"> ها در سریالایزر به صورت زیر است</w:t>
+      </w:r>
+    </w:p>
+    <w:p>
+      <w:pPr>
+        <w:rPr>
+          <w:rtl/>
+          <w:lang w:bidi="fa-IR"/>
+        </w:rPr>
+      </w:pPr>
+      <w:r>
+        <w:rPr>
+          <w:rtl/>
+          <w:lang w:bidi="fa-IR"/>
+        </w:rPr>
+        <w:drawing>
+          <wp:inline distT="0" distB="0" distL="0" distR="0" wp14:anchorId="0F43682F" wp14:editId="422C73BA">
+            <wp:extent cx="2695575" cy="2720611"/>
+            <wp:effectExtent l="0" t="0" r="0" b="3810"/>
+            <wp:docPr id="5" name="Picture 5"/>
+            <wp:cNvGraphicFramePr>
+              <a:graphicFrameLocks xmlns:a="http://schemas.openxmlformats.org/drawingml/2006/main" noChangeAspect="1"/>
+            </wp:cNvGraphicFramePr>
+            <a:graphic xmlns:a="http://schemas.openxmlformats.org/drawingml/2006/main">
+              <a:graphicData uri="http://schemas.openxmlformats.org/drawingml/2006/picture">
+                <pic:pic xmlns:pic="http://schemas.openxmlformats.org/drawingml/2006/picture">
+                  <pic:nvPicPr>
+                    <pic:cNvPr id="1" name=""/>
+                    <pic:cNvPicPr/>
+                  </pic:nvPicPr>
+                  <pic:blipFill>
+                    <a:blip r:embed="rId9"/>
+                    <a:stretch>
+                      <a:fillRect/>
+                    </a:stretch>
+                  </pic:blipFill>
+                  <pic:spPr>
+                    <a:xfrm>
+                      <a:off x="0" y="0"/>
+                      <a:ext cx="2698218" cy="2723278"/>
+                    </a:xfrm>
+                    <a:prstGeom prst="rect">
+                      <a:avLst/>
+                    </a:prstGeom>
+                  </pic:spPr>
+                </pic:pic>
+              </a:graphicData>
+            </a:graphic>
+          </wp:inline>
+        </w:drawing>
+      </w:r>
+    </w:p>
+    <w:p>
+      <w:pPr>
+        <w:rPr>
+          <w:rtl/>
+          <w:lang w:bidi="fa-IR"/>
+        </w:rPr>
+      </w:pPr>
+      <w:r>
+        <w:rPr>
+          <w:rFonts w:hint="cs"/>
+          <w:rtl/>
+          <w:lang w:bidi="fa-IR"/>
+        </w:rPr>
+        <w:t xml:space="preserve">پس تا الان سه تا </w:t>
+      </w:r>
+      <w:r>
+        <w:rPr>
+          <w:lang w:bidi="fa-IR"/>
+        </w:rPr>
+        <w:t>validation</w:t>
+      </w:r>
+      <w:r>
+        <w:rPr>
+          <w:rFonts w:hint="cs"/>
+          <w:rtl/>
+          <w:lang w:bidi="fa-IR"/>
+        </w:rPr>
+        <w:t xml:space="preserve"> رو یاد گرفتیم 1- توی هر فیلد توی مدل </w:t>
+      </w:r>
+      <w:r>
+        <w:rPr>
+          <w:lang w:bidi="fa-IR"/>
+        </w:rPr>
+        <w:t>max_length</w:t>
+      </w:r>
+      <w:r>
+        <w:rPr>
+          <w:rFonts w:hint="cs"/>
+          <w:rtl/>
+          <w:lang w:bidi="fa-IR"/>
+        </w:rPr>
+        <w:t xml:space="preserve">و ... 2- </w:t>
+      </w:r>
+      <w:r>
+        <w:rPr>
+          <w:lang w:bidi="fa-IR"/>
+        </w:rPr>
+        <w:t>clean()</w:t>
+      </w:r>
+      <w:r>
+        <w:rPr>
+          <w:rFonts w:hint="cs"/>
+          <w:rtl/>
+          <w:lang w:bidi="fa-IR"/>
+        </w:rPr>
+        <w:t xml:space="preserve"> توی مدل</w:t>
+      </w:r>
+    </w:p>
+    <w:p>
+      <w:pPr>
+        <w:rPr>
+          <w:rFonts w:hint="cs"/>
+          <w:rtl/>
+          <w:lang w:bidi="fa-IR"/>
+        </w:rPr>
+      </w:pPr>
+      <w:r>
+        <w:rPr>
+          <w:rFonts w:hint="cs"/>
+          <w:rtl/>
+          <w:lang w:bidi="fa-IR"/>
+        </w:rPr>
+        <w:t xml:space="preserve">3- </w:t>
+      </w:r>
+      <w:r>
+        <w:rPr>
+          <w:lang w:bidi="fa-IR"/>
+        </w:rPr>
+        <w:t>validate_filedname</w:t>
+      </w:r>
+      <w:r>
+        <w:rPr>
+          <w:rFonts w:hint="cs"/>
+          <w:rtl/>
+          <w:lang w:bidi="fa-IR"/>
+        </w:rPr>
+        <w:t>و</w:t>
+      </w:r>
+      <w:r>
+        <w:rPr>
+          <w:lang w:bidi="fa-IR"/>
+        </w:rPr>
+        <w:t xml:space="preserve"> validate</w:t>
+      </w:r>
+      <w:r>
+        <w:rPr>
+          <w:rFonts w:hint="cs"/>
+          <w:rtl/>
+          <w:lang w:bidi="fa-IR"/>
+        </w:rPr>
+        <w:t xml:space="preserve"> توی سریالایزر</w:t>
       </w:r>
     </w:p>
     <w:sectPr>
@@ -17758,6 +18536,16 @@
       <w:vertAlign w:val="superscript"/>
     </w:rPr>
   </w:style>
+  <w:style w:type="character" w:customStyle="1" w:styleId="11">
+    <w:name w:val="ͼ11"/>
+    <w:basedOn w:val="DefaultParagraphFont"/>
+    <w:rsid w:val="007F165D"/>
+  </w:style>
+  <w:style w:type="character" w:customStyle="1" w:styleId="v">
+    <w:name w:val="ͼv"/>
+    <w:basedOn w:val="DefaultParagraphFont"/>
+    <w:rsid w:val="007F165D"/>
+  </w:style>
 </w:styles>
 </file>
 

</xml_diff>

<commit_message>
lock database for order
</commit_message>
<xml_diff>
--- a/ticketing.docx
+++ b/ticketing.docx
@@ -1,6 +1,6 @@
 
 <file path=word/document.xml><?xml version="1.0" encoding="utf-8"?>
-<w:document xmlns:wpc="http://schemas.microsoft.com/office/word/2010/wordprocessingCanvas" xmlns:cx="http://schemas.microsoft.com/office/drawing/2014/chartex" xmlns:cx1="http://schemas.microsoft.com/office/drawing/2015/9/8/chartex" xmlns:cx2="http://schemas.microsoft.com/office/drawing/2015/10/21/chartex" xmlns:cx3="http://schemas.microsoft.com/office/drawing/2016/5/9/chartex" xmlns:cx4="http://schemas.microsoft.com/office/drawing/2016/5/10/chartex" xmlns:cx5="http://schemas.microsoft.com/office/drawing/2016/5/11/chartex" xmlns:cx6="http://schemas.microsoft.com/office/drawing/2016/5/12/chartex" xmlns:cx7="http://schemas.microsoft.com/office/drawing/2016/5/13/chartex" xmlns:cx8="http://schemas.microsoft.com/office/drawing/2016/5/14/chartex" xmlns:mc="http://schemas.openxmlformats.org/markup-compatibility/2006" xmlns:aink="http://schemas.microsoft.com/office/drawing/2016/ink" xmlns:am3d="http://schemas.microsoft.com/office/drawing/2017/model3d" xmlns:o="urn:schemas-microsoft-com:office:office" xmlns:oel="http://schemas.microsoft.com/office/2019/extlst" xmlns:r="http://schemas.openxmlformats.org/officeDocument/2006/relationships" xmlns:m="http://schemas.openxmlformats.org/officeDocument/2006/math" xmlns:v="urn:schemas-microsoft-com:vml" xmlns:wp14="http://schemas.microsoft.com/office/word/2010/wordprocessingDrawing" xmlns:wp="http://schemas.openxmlformats.org/drawingml/2006/wordprocessingDrawing" xmlns:w10="urn:schemas-microsoft-com:office:word" xmlns:w="http://schemas.openxmlformats.org/wordprocessingml/2006/main" xmlns:w14="http://schemas.microsoft.com/office/word/2010/wordml" xmlns:w15="http://schemas.microsoft.com/office/word/2012/wordml" xmlns:w16cex="http://schemas.microsoft.com/office/word/2018/wordml/cex" xmlns:w16cid="http://schemas.microsoft.com/office/word/2016/wordml/cid" xmlns:w16="http://schemas.microsoft.com/office/word/2018/wordml" xmlns:w16du="http://schemas.microsoft.com/office/word/2023/wordml/word16du" xmlns:w16sdtdh="http://schemas.microsoft.com/office/word/2020/wordml/sdtdatahash" xmlns:w16sdtfl="http://schemas.microsoft.com/office/word/2024/wordml/sdtformatlock" xmlns:w16se="http://schemas.microsoft.com/office/word/2015/wordml/symex" xmlns:wpg="http://schemas.microsoft.com/office/word/2010/wordprocessingGroup" xmlns:wpi="http://schemas.microsoft.com/office/word/2010/wordprocessingInk" xmlns:wne="http://schemas.microsoft.com/office/word/2006/wordml" xmlns:wps="http://schemas.microsoft.com/office/word/2010/wordprocessingShape" mc:Ignorable="w14 w15 w16se w16cid w16 w16cex w16sdtdh w16sdtfl w16du wp14">
+<w:document xmlns:wpc="http://schemas.microsoft.com/office/word/2010/wordprocessingCanvas" xmlns:cx="http://schemas.microsoft.com/office/drawing/2014/chartex" xmlns:cx1="http://schemas.microsoft.com/office/drawing/2015/9/8/chartex" xmlns:cx2="http://schemas.microsoft.com/office/drawing/2015/10/21/chartex" xmlns:cx3="http://schemas.microsoft.com/office/drawing/2016/5/9/chartex" xmlns:cx4="http://schemas.microsoft.com/office/drawing/2016/5/10/chartex" xmlns:cx5="http://schemas.microsoft.com/office/drawing/2016/5/11/chartex" xmlns:cx6="http://schemas.microsoft.com/office/drawing/2016/5/12/chartex" xmlns:cx7="http://schemas.microsoft.com/office/drawing/2016/5/13/chartex" xmlns:cx8="http://schemas.microsoft.com/office/drawing/2016/5/14/chartex" xmlns:mc="http://schemas.openxmlformats.org/markup-compatibility/2006" xmlns:aink="http://schemas.microsoft.com/office/drawing/2016/ink" xmlns:am3d="http://schemas.microsoft.com/office/drawing/2017/model3d" xmlns:o="urn:schemas-microsoft-com:office:office" xmlns:oel="http://schemas.microsoft.com/office/2019/extlst" xmlns:r="http://schemas.openxmlformats.org/officeDocument/2006/relationships" xmlns:m="http://schemas.openxmlformats.org/officeDocument/2006/math" xmlns:v="urn:schemas-microsoft-com:vml" xmlns:wp14="http://schemas.microsoft.com/office/word/2010/wordprocessingDrawing" xmlns:wp="http://schemas.openxmlformats.org/drawingml/2006/wordprocessingDrawing" xmlns:w10="urn:schemas-microsoft-com:office:word" xmlns:w="http://schemas.openxmlformats.org/wordprocessingml/2006/main" xmlns:w14="http://schemas.microsoft.com/office/word/2010/wordml" xmlns:w15="http://schemas.microsoft.com/office/word/2012/wordml" xmlns:w16cex="http://schemas.microsoft.com/office/word/2018/wordml/cex" xmlns:w16cid="http://schemas.microsoft.com/office/word/2016/wordml/cid" xmlns:w16="http://schemas.microsoft.com/office/word/2018/wordml" xmlns:w16sdtdh="http://schemas.microsoft.com/office/word/2020/wordml/sdtdatahash" xmlns:w16se="http://schemas.microsoft.com/office/word/2015/wordml/symex" xmlns:wpg="http://schemas.microsoft.com/office/word/2010/wordprocessingGroup" xmlns:wpi="http://schemas.microsoft.com/office/word/2010/wordprocessingInk" xmlns:wne="http://schemas.microsoft.com/office/word/2006/wordml" xmlns:wps="http://schemas.microsoft.com/office/word/2010/wordprocessingShape" mc:Ignorable="w14 w15 w16se w16cid w16 w16cex w16sdtdh wp14">
   <w:body>
     <w:p>
       <w:pPr>
@@ -7010,7 +7010,7 @@
               </wp:anchor>
             </w:drawing>
           </mc:Choice>
-          <mc:Fallback>
+          <mc:Fallback xmlns:w16sdtfl="http://schemas.microsoft.com/office/word/2024/wordml/sdtformatlock" xmlns:w16du="http://schemas.microsoft.com/office/word/2023/wordml/word16du">
             <w:pict>
               <v:line w14:anchorId="758C7148" id="Straight Connector 4" o:spid="_x0000_s1026" style="position:absolute;z-index:251659264;visibility:visible;mso-wrap-style:square;mso-width-percent:0;mso-height-percent:0;mso-wrap-distance-left:9pt;mso-wrap-distance-top:0;mso-wrap-distance-right:9pt;mso-wrap-distance-bottom:0;mso-position-horizontal:absolute;mso-position-horizontal-relative:text;mso-position-vertical:absolute;mso-position-vertical-relative:text;mso-width-percent:0;mso-height-percent:0;mso-width-relative:margin;mso-height-relative:margin" from="265.5pt,17.3pt" to="424.5pt,18.05pt" o:gfxdata="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" strokecolor="#70ad47 [3209]" strokeweight="3.75pt">
                 <v:stroke joinstyle="miter"/>
@@ -14430,7 +14430,7 @@
               </wp:anchor>
             </w:drawing>
           </mc:Choice>
-          <mc:Fallback>
+          <mc:Fallback xmlns:w16sdtfl="http://schemas.microsoft.com/office/word/2024/wordml/sdtformatlock" xmlns:w16du="http://schemas.microsoft.com/office/word/2023/wordml/word16du">
             <w:pict>
               <v:line w14:anchorId="59A749BE" id="Straight Connector 2" o:spid="_x0000_s1026" style="position:absolute;flip:y;z-index:251660288;visibility:visible;mso-wrap-style:square;mso-wrap-distance-left:9pt;mso-wrap-distance-top:0;mso-wrap-distance-right:9pt;mso-wrap-distance-bottom:0;mso-position-horizontal:absolute;mso-position-horizontal-relative:text;mso-position-vertical:absolute;mso-position-vertical-relative:text" from="43.5pt,12.4pt" to="156pt,13.15pt" o:gfxdata="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" strokecolor="#70ad47 [3209]" strokeweight="2pt">
                 <v:stroke dashstyle="dash"/>
@@ -20351,7 +20351,6 @@
     <w:p>
       <w:pPr>
         <w:rPr>
-          <w:rFonts w:hint="cs"/>
           <w:rtl/>
           <w:lang w:bidi="fa-IR"/>
         </w:rPr>
@@ -20382,10 +20381,3274 @@
     <w:p>
       <w:pPr>
         <w:rPr>
-          <w:rtl/>
-          <w:lang w:bidi="fa-IR"/>
-        </w:rPr>
-      </w:pPr>
+          <w:lang w:bidi="fa-IR"/>
+        </w:rPr>
+      </w:pPr>
+    </w:p>
+    <w:p>
+      <w:pPr>
+        <w:rPr>
+          <w:rtl/>
+          <w:lang w:bidi="fa-IR"/>
+        </w:rPr>
+      </w:pPr>
+      <w:r>
+        <w:rPr>
+          <w:lang w:bidi="fa-IR"/>
+        </w:rPr>
+        <w:t>Transaction.atomic</w:t>
+      </w:r>
+      <w:r>
+        <w:rPr>
+          <w:rFonts w:hint="cs"/>
+          <w:rtl/>
+          <w:lang w:bidi="fa-IR"/>
+        </w:rPr>
+        <w:t xml:space="preserve"> چیه؟</w:t>
+      </w:r>
+    </w:p>
+    <w:p>
+      <w:pPr>
+        <w:rPr>
+          <w:rtl/>
+          <w:lang w:bidi="fa-IR"/>
+        </w:rPr>
+      </w:pPr>
+      <w:r>
+        <w:rPr>
+          <w:rFonts w:hint="cs"/>
+          <w:rtl/>
+          <w:lang w:bidi="fa-IR"/>
+        </w:rPr>
+        <w:t>ینی یا کل اون عملیاتی که نوشتیم باهم انجام میشه یا هیچ اتفاقی نمیوفته ینی هیچ کدومشون انجام نمیشه</w:t>
+      </w:r>
+      <w:r>
+        <w:rPr>
+          <w:rFonts w:hint="cs"/>
+          <w:rtl/>
+          <w:lang w:bidi="fa-IR"/>
+        </w:rPr>
+        <w:t xml:space="preserve"> مثل مثال زیر</w:t>
+      </w:r>
+    </w:p>
+    <w:p>
+      <w:pPr>
+        <w:shd w:val="clear" w:color="auto" w:fill="23272E"/>
+        <w:bidi w:val="0"/>
+        <w:spacing w:after="0" w:line="285" w:lineRule="atLeast"/>
+        <w:rPr>
+          <w:rFonts w:eastAsia="Times New Roman" w:cs="Times New Roman"/>
+          <w:color w:val="ABB2BF"/>
+          <w:kern w:val="0"/>
+          <w:sz w:val="21"/>
+          <w:szCs w:val="21"/>
+          <w14:ligatures w14:val="none"/>
+        </w:rPr>
+      </w:pPr>
+      <w:r>
+        <w:rPr>
+          <w:rFonts w:eastAsia="Times New Roman" w:cs="Times New Roman"/>
+          <w:color w:val="C678DD"/>
+          <w:kern w:val="0"/>
+          <w:sz w:val="21"/>
+          <w:szCs w:val="21"/>
+          <w14:ligatures w14:val="none"/>
+        </w:rPr>
+        <w:t>from</w:t>
+      </w:r>
+      <w:r>
+        <w:rPr>
+          <w:rFonts w:eastAsia="Times New Roman" w:cs="Times New Roman"/>
+          <w:color w:val="ABB2BF"/>
+          <w:kern w:val="0"/>
+          <w:sz w:val="21"/>
+          <w:szCs w:val="21"/>
+          <w14:ligatures w14:val="none"/>
+        </w:rPr>
+        <w:t xml:space="preserve"> </w:t>
+      </w:r>
+      <w:r>
+        <w:rPr>
+          <w:rFonts w:eastAsia="Times New Roman" w:cs="Times New Roman"/>
+          <w:color w:val="E5C07B"/>
+          <w:kern w:val="0"/>
+          <w:sz w:val="21"/>
+          <w:szCs w:val="21"/>
+          <w14:ligatures w14:val="none"/>
+        </w:rPr>
+        <w:t>django</w:t>
+      </w:r>
+      <w:r>
+        <w:rPr>
+          <w:rFonts w:eastAsia="Times New Roman" w:cs="Times New Roman"/>
+          <w:color w:val="ABB2BF"/>
+          <w:kern w:val="0"/>
+          <w:sz w:val="21"/>
+          <w:szCs w:val="21"/>
+          <w14:ligatures w14:val="none"/>
+        </w:rPr>
+        <w:t>.</w:t>
+      </w:r>
+      <w:r>
+        <w:rPr>
+          <w:rFonts w:eastAsia="Times New Roman" w:cs="Times New Roman"/>
+          <w:color w:val="E5C07B"/>
+          <w:kern w:val="0"/>
+          <w:sz w:val="21"/>
+          <w:szCs w:val="21"/>
+          <w14:ligatures w14:val="none"/>
+        </w:rPr>
+        <w:t>db</w:t>
+      </w:r>
+      <w:r>
+        <w:rPr>
+          <w:rFonts w:eastAsia="Times New Roman" w:cs="Times New Roman"/>
+          <w:color w:val="ABB2BF"/>
+          <w:kern w:val="0"/>
+          <w:sz w:val="21"/>
+          <w:szCs w:val="21"/>
+          <w14:ligatures w14:val="none"/>
+        </w:rPr>
+        <w:t xml:space="preserve"> </w:t>
+      </w:r>
+      <w:r>
+        <w:rPr>
+          <w:rFonts w:eastAsia="Times New Roman" w:cs="Times New Roman"/>
+          <w:color w:val="C678DD"/>
+          <w:kern w:val="0"/>
+          <w:sz w:val="21"/>
+          <w:szCs w:val="21"/>
+          <w14:ligatures w14:val="none"/>
+        </w:rPr>
+        <w:t>import</w:t>
+      </w:r>
+      <w:r>
+        <w:rPr>
+          <w:rFonts w:eastAsia="Times New Roman" w:cs="Times New Roman"/>
+          <w:color w:val="ABB2BF"/>
+          <w:kern w:val="0"/>
+          <w:sz w:val="21"/>
+          <w:szCs w:val="21"/>
+          <w14:ligatures w14:val="none"/>
+        </w:rPr>
+        <w:t xml:space="preserve"> </w:t>
+      </w:r>
+      <w:r>
+        <w:rPr>
+          <w:rFonts w:eastAsia="Times New Roman" w:cs="Times New Roman"/>
+          <w:color w:val="E5C07B"/>
+          <w:kern w:val="0"/>
+          <w:sz w:val="21"/>
+          <w:szCs w:val="21"/>
+          <w14:ligatures w14:val="none"/>
+        </w:rPr>
+        <w:t>transaction</w:t>
+      </w:r>
+    </w:p>
+    <w:p>
+      <w:pPr>
+        <w:shd w:val="clear" w:color="auto" w:fill="23272E"/>
+        <w:bidi w:val="0"/>
+        <w:spacing w:after="0" w:line="285" w:lineRule="atLeast"/>
+        <w:rPr>
+          <w:rFonts w:eastAsia="Times New Roman" w:cs="Times New Roman"/>
+          <w:color w:val="ABB2BF"/>
+          <w:kern w:val="0"/>
+          <w:sz w:val="21"/>
+          <w:szCs w:val="21"/>
+          <w14:ligatures w14:val="none"/>
+        </w:rPr>
+      </w:pPr>
+    </w:p>
+    <w:p>
+      <w:pPr>
+        <w:shd w:val="clear" w:color="auto" w:fill="23272E"/>
+        <w:bidi w:val="0"/>
+        <w:spacing w:after="0" w:line="285" w:lineRule="atLeast"/>
+        <w:rPr>
+          <w:rFonts w:eastAsia="Times New Roman" w:cs="Times New Roman"/>
+          <w:color w:val="ABB2BF"/>
+          <w:kern w:val="0"/>
+          <w:sz w:val="21"/>
+          <w:szCs w:val="21"/>
+          <w14:ligatures w14:val="none"/>
+        </w:rPr>
+      </w:pPr>
+      <w:r>
+        <w:rPr>
+          <w:rFonts w:eastAsia="Times New Roman" w:cs="Times New Roman"/>
+          <w:color w:val="C678DD"/>
+          <w:kern w:val="0"/>
+          <w:sz w:val="21"/>
+          <w:szCs w:val="21"/>
+          <w14:ligatures w14:val="none"/>
+        </w:rPr>
+        <w:t>from</w:t>
+      </w:r>
+      <w:r>
+        <w:rPr>
+          <w:rFonts w:eastAsia="Times New Roman" w:cs="Times New Roman"/>
+          <w:color w:val="ABB2BF"/>
+          <w:kern w:val="0"/>
+          <w:sz w:val="21"/>
+          <w:szCs w:val="21"/>
+          <w14:ligatures w14:val="none"/>
+        </w:rPr>
+        <w:t xml:space="preserve"> .</w:t>
+      </w:r>
+      <w:r>
+        <w:rPr>
+          <w:rFonts w:eastAsia="Times New Roman" w:cs="Times New Roman"/>
+          <w:color w:val="E5C07B"/>
+          <w:kern w:val="0"/>
+          <w:sz w:val="21"/>
+          <w:szCs w:val="21"/>
+          <w14:ligatures w14:val="none"/>
+        </w:rPr>
+        <w:t>models</w:t>
+      </w:r>
+      <w:r>
+        <w:rPr>
+          <w:rFonts w:eastAsia="Times New Roman" w:cs="Times New Roman"/>
+          <w:color w:val="ABB2BF"/>
+          <w:kern w:val="0"/>
+          <w:sz w:val="21"/>
+          <w:szCs w:val="21"/>
+          <w14:ligatures w14:val="none"/>
+        </w:rPr>
+        <w:t xml:space="preserve"> </w:t>
+      </w:r>
+      <w:r>
+        <w:rPr>
+          <w:rFonts w:eastAsia="Times New Roman" w:cs="Times New Roman"/>
+          <w:color w:val="C678DD"/>
+          <w:kern w:val="0"/>
+          <w:sz w:val="21"/>
+          <w:szCs w:val="21"/>
+          <w14:ligatures w14:val="none"/>
+        </w:rPr>
+        <w:t>import</w:t>
+      </w:r>
+      <w:r>
+        <w:rPr>
+          <w:rFonts w:eastAsia="Times New Roman" w:cs="Times New Roman"/>
+          <w:color w:val="ABB2BF"/>
+          <w:kern w:val="0"/>
+          <w:sz w:val="21"/>
+          <w:szCs w:val="21"/>
+          <w14:ligatures w14:val="none"/>
+        </w:rPr>
+        <w:t xml:space="preserve"> </w:t>
+      </w:r>
+      <w:r>
+        <w:rPr>
+          <w:rFonts w:eastAsia="Times New Roman" w:cs="Times New Roman"/>
+          <w:color w:val="E5C07B"/>
+          <w:kern w:val="0"/>
+          <w:sz w:val="21"/>
+          <w:szCs w:val="21"/>
+          <w14:ligatures w14:val="none"/>
+        </w:rPr>
+        <w:t>OrderModel</w:t>
+      </w:r>
+      <w:r>
+        <w:rPr>
+          <w:rFonts w:eastAsia="Times New Roman" w:cs="Times New Roman"/>
+          <w:color w:val="ABB2BF"/>
+          <w:kern w:val="0"/>
+          <w:sz w:val="21"/>
+          <w:szCs w:val="21"/>
+          <w14:ligatures w14:val="none"/>
+        </w:rPr>
+        <w:t xml:space="preserve">, </w:t>
+      </w:r>
+      <w:r>
+        <w:rPr>
+          <w:rFonts w:eastAsia="Times New Roman" w:cs="Times New Roman"/>
+          <w:color w:val="E5C07B"/>
+          <w:kern w:val="0"/>
+          <w:sz w:val="21"/>
+          <w:szCs w:val="21"/>
+          <w14:ligatures w14:val="none"/>
+        </w:rPr>
+        <w:t>TicketModel</w:t>
+      </w:r>
+    </w:p>
+    <w:p>
+      <w:pPr>
+        <w:shd w:val="clear" w:color="auto" w:fill="23272E"/>
+        <w:bidi w:val="0"/>
+        <w:spacing w:after="0" w:line="285" w:lineRule="atLeast"/>
+        <w:rPr>
+          <w:rFonts w:eastAsia="Times New Roman" w:cs="Times New Roman"/>
+          <w:color w:val="ABB2BF"/>
+          <w:kern w:val="0"/>
+          <w:sz w:val="21"/>
+          <w:szCs w:val="21"/>
+          <w14:ligatures w14:val="none"/>
+        </w:rPr>
+      </w:pPr>
+      <w:r>
+        <w:rPr>
+          <w:rFonts w:eastAsia="Times New Roman" w:cs="Times New Roman"/>
+          <w:color w:val="C678DD"/>
+          <w:kern w:val="0"/>
+          <w:sz w:val="21"/>
+          <w:szCs w:val="21"/>
+          <w14:ligatures w14:val="none"/>
+        </w:rPr>
+        <w:t>from</w:t>
+      </w:r>
+      <w:r>
+        <w:rPr>
+          <w:rFonts w:eastAsia="Times New Roman" w:cs="Times New Roman"/>
+          <w:color w:val="ABB2BF"/>
+          <w:kern w:val="0"/>
+          <w:sz w:val="21"/>
+          <w:szCs w:val="21"/>
+          <w14:ligatures w14:val="none"/>
+        </w:rPr>
+        <w:t xml:space="preserve"> </w:t>
+      </w:r>
+      <w:r>
+        <w:rPr>
+          <w:rFonts w:eastAsia="Times New Roman" w:cs="Times New Roman"/>
+          <w:color w:val="E5C07B"/>
+          <w:kern w:val="0"/>
+          <w:sz w:val="21"/>
+          <w:szCs w:val="21"/>
+          <w14:ligatures w14:val="none"/>
+        </w:rPr>
+        <w:t>tripsapp</w:t>
+      </w:r>
+      <w:r>
+        <w:rPr>
+          <w:rFonts w:eastAsia="Times New Roman" w:cs="Times New Roman"/>
+          <w:color w:val="ABB2BF"/>
+          <w:kern w:val="0"/>
+          <w:sz w:val="21"/>
+          <w:szCs w:val="21"/>
+          <w14:ligatures w14:val="none"/>
+        </w:rPr>
+        <w:t>.</w:t>
+      </w:r>
+      <w:r>
+        <w:rPr>
+          <w:rFonts w:eastAsia="Times New Roman" w:cs="Times New Roman"/>
+          <w:color w:val="E5C07B"/>
+          <w:kern w:val="0"/>
+          <w:sz w:val="21"/>
+          <w:szCs w:val="21"/>
+          <w14:ligatures w14:val="none"/>
+        </w:rPr>
+        <w:t>models</w:t>
+      </w:r>
+      <w:r>
+        <w:rPr>
+          <w:rFonts w:eastAsia="Times New Roman" w:cs="Times New Roman"/>
+          <w:color w:val="ABB2BF"/>
+          <w:kern w:val="0"/>
+          <w:sz w:val="21"/>
+          <w:szCs w:val="21"/>
+          <w14:ligatures w14:val="none"/>
+        </w:rPr>
+        <w:t xml:space="preserve"> </w:t>
+      </w:r>
+      <w:r>
+        <w:rPr>
+          <w:rFonts w:eastAsia="Times New Roman" w:cs="Times New Roman"/>
+          <w:color w:val="C678DD"/>
+          <w:kern w:val="0"/>
+          <w:sz w:val="21"/>
+          <w:szCs w:val="21"/>
+          <w14:ligatures w14:val="none"/>
+        </w:rPr>
+        <w:t>import</w:t>
+      </w:r>
+      <w:r>
+        <w:rPr>
+          <w:rFonts w:eastAsia="Times New Roman" w:cs="Times New Roman"/>
+          <w:color w:val="ABB2BF"/>
+          <w:kern w:val="0"/>
+          <w:sz w:val="21"/>
+          <w:szCs w:val="21"/>
+          <w14:ligatures w14:val="none"/>
+        </w:rPr>
+        <w:t xml:space="preserve"> </w:t>
+      </w:r>
+      <w:r>
+        <w:rPr>
+          <w:rFonts w:eastAsia="Times New Roman" w:cs="Times New Roman"/>
+          <w:color w:val="E5C07B"/>
+          <w:kern w:val="0"/>
+          <w:sz w:val="21"/>
+          <w:szCs w:val="21"/>
+          <w14:ligatures w14:val="none"/>
+        </w:rPr>
+        <w:t>TripSeatModel</w:t>
+      </w:r>
+    </w:p>
+    <w:p>
+      <w:pPr>
+        <w:shd w:val="clear" w:color="auto" w:fill="23272E"/>
+        <w:bidi w:val="0"/>
+        <w:spacing w:after="240" w:line="285" w:lineRule="atLeast"/>
+        <w:rPr>
+          <w:rFonts w:eastAsia="Times New Roman" w:cs="Times New Roman"/>
+          <w:color w:val="ABB2BF"/>
+          <w:kern w:val="0"/>
+          <w:sz w:val="21"/>
+          <w:szCs w:val="21"/>
+          <w14:ligatures w14:val="none"/>
+        </w:rPr>
+      </w:pPr>
+    </w:p>
+    <w:p>
+      <w:pPr>
+        <w:shd w:val="clear" w:color="auto" w:fill="23272E"/>
+        <w:bidi w:val="0"/>
+        <w:spacing w:after="0" w:line="285" w:lineRule="atLeast"/>
+        <w:rPr>
+          <w:rFonts w:eastAsia="Times New Roman" w:cs="Times New Roman"/>
+          <w:color w:val="ABB2BF"/>
+          <w:kern w:val="0"/>
+          <w:sz w:val="21"/>
+          <w:szCs w:val="21"/>
+          <w14:ligatures w14:val="none"/>
+        </w:rPr>
+      </w:pPr>
+      <w:r>
+        <w:rPr>
+          <w:rFonts w:eastAsia="Times New Roman" w:cs="Times New Roman"/>
+          <w:color w:val="61AFEF"/>
+          <w:kern w:val="0"/>
+          <w:sz w:val="21"/>
+          <w:szCs w:val="21"/>
+          <w14:ligatures w14:val="none"/>
+        </w:rPr>
+        <w:t>@</w:t>
+      </w:r>
+      <w:r>
+        <w:rPr>
+          <w:rFonts w:eastAsia="Times New Roman" w:cs="Times New Roman"/>
+          <w:color w:val="E5C07B"/>
+          <w:kern w:val="0"/>
+          <w:sz w:val="21"/>
+          <w:szCs w:val="21"/>
+          <w14:ligatures w14:val="none"/>
+        </w:rPr>
+        <w:t>transaction</w:t>
+      </w:r>
+      <w:r>
+        <w:rPr>
+          <w:rFonts w:eastAsia="Times New Roman" w:cs="Times New Roman"/>
+          <w:color w:val="ABB2BF"/>
+          <w:kern w:val="0"/>
+          <w:sz w:val="21"/>
+          <w:szCs w:val="21"/>
+          <w14:ligatures w14:val="none"/>
+        </w:rPr>
+        <w:t>.</w:t>
+      </w:r>
+      <w:r>
+        <w:rPr>
+          <w:rFonts w:eastAsia="Times New Roman" w:cs="Times New Roman"/>
+          <w:color w:val="61AFEF"/>
+          <w:kern w:val="0"/>
+          <w:sz w:val="21"/>
+          <w:szCs w:val="21"/>
+          <w14:ligatures w14:val="none"/>
+        </w:rPr>
+        <w:t>atomic</w:t>
+      </w:r>
+    </w:p>
+    <w:p>
+      <w:pPr>
+        <w:shd w:val="clear" w:color="auto" w:fill="23272E"/>
+        <w:bidi w:val="0"/>
+        <w:spacing w:after="0" w:line="285" w:lineRule="atLeast"/>
+        <w:rPr>
+          <w:rFonts w:eastAsia="Times New Roman" w:cs="Times New Roman"/>
+          <w:color w:val="ABB2BF"/>
+          <w:kern w:val="0"/>
+          <w:sz w:val="21"/>
+          <w:szCs w:val="21"/>
+          <w14:ligatures w14:val="none"/>
+        </w:rPr>
+      </w:pPr>
+      <w:r>
+        <w:rPr>
+          <w:rFonts w:eastAsia="Times New Roman" w:cs="Times New Roman"/>
+          <w:color w:val="C678DD"/>
+          <w:kern w:val="0"/>
+          <w:sz w:val="21"/>
+          <w:szCs w:val="21"/>
+          <w14:ligatures w14:val="none"/>
+        </w:rPr>
+        <w:t>def</w:t>
+      </w:r>
+      <w:r>
+        <w:rPr>
+          <w:rFonts w:eastAsia="Times New Roman" w:cs="Times New Roman"/>
+          <w:color w:val="ABB2BF"/>
+          <w:kern w:val="0"/>
+          <w:sz w:val="21"/>
+          <w:szCs w:val="21"/>
+          <w14:ligatures w14:val="none"/>
+        </w:rPr>
+        <w:t xml:space="preserve"> </w:t>
+      </w:r>
+      <w:r>
+        <w:rPr>
+          <w:rFonts w:eastAsia="Times New Roman" w:cs="Times New Roman"/>
+          <w:color w:val="61AFEF"/>
+          <w:kern w:val="0"/>
+          <w:sz w:val="21"/>
+          <w:szCs w:val="21"/>
+          <w14:ligatures w14:val="none"/>
+        </w:rPr>
+        <w:t>create_order</w:t>
+      </w:r>
+      <w:r>
+        <w:rPr>
+          <w:rFonts w:eastAsia="Times New Roman" w:cs="Times New Roman"/>
+          <w:color w:val="ABB2BF"/>
+          <w:kern w:val="0"/>
+          <w:sz w:val="21"/>
+          <w:szCs w:val="21"/>
+          <w14:ligatures w14:val="none"/>
+        </w:rPr>
+        <w:t xml:space="preserve">(*, </w:t>
+      </w:r>
+      <w:r>
+        <w:rPr>
+          <w:rFonts w:eastAsia="Times New Roman" w:cs="Times New Roman"/>
+          <w:color w:val="E06C75"/>
+          <w:kern w:val="0"/>
+          <w:sz w:val="21"/>
+          <w:szCs w:val="21"/>
+          <w14:ligatures w14:val="none"/>
+        </w:rPr>
+        <w:t>user</w:t>
+      </w:r>
+      <w:r>
+        <w:rPr>
+          <w:rFonts w:eastAsia="Times New Roman" w:cs="Times New Roman"/>
+          <w:color w:val="ABB2BF"/>
+          <w:kern w:val="0"/>
+          <w:sz w:val="21"/>
+          <w:szCs w:val="21"/>
+          <w14:ligatures w14:val="none"/>
+        </w:rPr>
+        <w:t xml:space="preserve">, </w:t>
+      </w:r>
+      <w:r>
+        <w:rPr>
+          <w:rFonts w:eastAsia="Times New Roman" w:cs="Times New Roman"/>
+          <w:color w:val="E06C75"/>
+          <w:kern w:val="0"/>
+          <w:sz w:val="21"/>
+          <w:szCs w:val="21"/>
+          <w14:ligatures w14:val="none"/>
+        </w:rPr>
+        <w:t>trip</w:t>
+      </w:r>
+      <w:r>
+        <w:rPr>
+          <w:rFonts w:eastAsia="Times New Roman" w:cs="Times New Roman"/>
+          <w:color w:val="ABB2BF"/>
+          <w:kern w:val="0"/>
+          <w:sz w:val="21"/>
+          <w:szCs w:val="21"/>
+          <w14:ligatures w14:val="none"/>
+        </w:rPr>
+        <w:t xml:space="preserve">, </w:t>
+      </w:r>
+      <w:r>
+        <w:rPr>
+          <w:rFonts w:eastAsia="Times New Roman" w:cs="Times New Roman"/>
+          <w:color w:val="E06C75"/>
+          <w:kern w:val="0"/>
+          <w:sz w:val="21"/>
+          <w:szCs w:val="21"/>
+          <w14:ligatures w14:val="none"/>
+        </w:rPr>
+        <w:t>trip_seats</w:t>
+      </w:r>
+      <w:r>
+        <w:rPr>
+          <w:rFonts w:eastAsia="Times New Roman" w:cs="Times New Roman"/>
+          <w:color w:val="ABB2BF"/>
+          <w:kern w:val="0"/>
+          <w:sz w:val="21"/>
+          <w:szCs w:val="21"/>
+          <w14:ligatures w14:val="none"/>
+        </w:rPr>
+        <w:t>):</w:t>
+      </w:r>
+    </w:p>
+    <w:p>
+      <w:pPr>
+        <w:shd w:val="clear" w:color="auto" w:fill="23272E"/>
+        <w:bidi w:val="0"/>
+        <w:spacing w:after="0" w:line="285" w:lineRule="atLeast"/>
+        <w:rPr>
+          <w:rFonts w:eastAsia="Times New Roman" w:cs="Times New Roman"/>
+          <w:color w:val="ABB2BF"/>
+          <w:kern w:val="0"/>
+          <w:sz w:val="21"/>
+          <w:szCs w:val="21"/>
+          <w14:ligatures w14:val="none"/>
+        </w:rPr>
+      </w:pPr>
+    </w:p>
+    <w:p>
+      <w:pPr>
+        <w:shd w:val="clear" w:color="auto" w:fill="23272E"/>
+        <w:bidi w:val="0"/>
+        <w:spacing w:after="0" w:line="285" w:lineRule="atLeast"/>
+        <w:rPr>
+          <w:rFonts w:eastAsia="Times New Roman" w:cs="Times New Roman"/>
+          <w:color w:val="ABB2BF"/>
+          <w:kern w:val="0"/>
+          <w:sz w:val="21"/>
+          <w:szCs w:val="21"/>
+          <w14:ligatures w14:val="none"/>
+        </w:rPr>
+      </w:pPr>
+      <w:r>
+        <w:rPr>
+          <w:rFonts w:eastAsia="Times New Roman" w:cs="Times New Roman"/>
+          <w:color w:val="ABB2BF"/>
+          <w:kern w:val="0"/>
+          <w:sz w:val="21"/>
+          <w:szCs w:val="21"/>
+          <w14:ligatures w14:val="none"/>
+        </w:rPr>
+        <w:t xml:space="preserve">    </w:t>
+      </w:r>
+      <w:r>
+        <w:rPr>
+          <w:rFonts w:eastAsia="Times New Roman" w:cs="Times New Roman"/>
+          <w:color w:val="E06C75"/>
+          <w:kern w:val="0"/>
+          <w:sz w:val="21"/>
+          <w:szCs w:val="21"/>
+          <w14:ligatures w14:val="none"/>
+        </w:rPr>
+        <w:t>total_price</w:t>
+      </w:r>
+      <w:r>
+        <w:rPr>
+          <w:rFonts w:eastAsia="Times New Roman" w:cs="Times New Roman"/>
+          <w:color w:val="ABB2BF"/>
+          <w:kern w:val="0"/>
+          <w:sz w:val="21"/>
+          <w:szCs w:val="21"/>
+          <w14:ligatures w14:val="none"/>
+        </w:rPr>
+        <w:t xml:space="preserve"> </w:t>
+      </w:r>
+      <w:r>
+        <w:rPr>
+          <w:rFonts w:eastAsia="Times New Roman" w:cs="Times New Roman"/>
+          <w:color w:val="56B6C2"/>
+          <w:kern w:val="0"/>
+          <w:sz w:val="21"/>
+          <w:szCs w:val="21"/>
+          <w14:ligatures w14:val="none"/>
+        </w:rPr>
+        <w:t>=</w:t>
+      </w:r>
+      <w:r>
+        <w:rPr>
+          <w:rFonts w:eastAsia="Times New Roman" w:cs="Times New Roman"/>
+          <w:color w:val="ABB2BF"/>
+          <w:kern w:val="0"/>
+          <w:sz w:val="21"/>
+          <w:szCs w:val="21"/>
+          <w14:ligatures w14:val="none"/>
+        </w:rPr>
+        <w:t xml:space="preserve"> </w:t>
+      </w:r>
+      <w:r>
+        <w:rPr>
+          <w:rFonts w:eastAsia="Times New Roman" w:cs="Times New Roman"/>
+          <w:color w:val="E06C75"/>
+          <w:kern w:val="0"/>
+          <w:sz w:val="21"/>
+          <w:szCs w:val="21"/>
+          <w14:ligatures w14:val="none"/>
+        </w:rPr>
+        <w:t>trip</w:t>
+      </w:r>
+      <w:r>
+        <w:rPr>
+          <w:rFonts w:eastAsia="Times New Roman" w:cs="Times New Roman"/>
+          <w:color w:val="ABB2BF"/>
+          <w:kern w:val="0"/>
+          <w:sz w:val="21"/>
+          <w:szCs w:val="21"/>
+          <w14:ligatures w14:val="none"/>
+        </w:rPr>
+        <w:t xml:space="preserve">.price </w:t>
+      </w:r>
+      <w:r>
+        <w:rPr>
+          <w:rFonts w:eastAsia="Times New Roman" w:cs="Times New Roman"/>
+          <w:color w:val="56B6C2"/>
+          <w:kern w:val="0"/>
+          <w:sz w:val="21"/>
+          <w:szCs w:val="21"/>
+          <w14:ligatures w14:val="none"/>
+        </w:rPr>
+        <w:t>*</w:t>
+      </w:r>
+      <w:r>
+        <w:rPr>
+          <w:rFonts w:eastAsia="Times New Roman" w:cs="Times New Roman"/>
+          <w:color w:val="ABB2BF"/>
+          <w:kern w:val="0"/>
+          <w:sz w:val="21"/>
+          <w:szCs w:val="21"/>
+          <w14:ligatures w14:val="none"/>
+        </w:rPr>
+        <w:t xml:space="preserve"> </w:t>
+      </w:r>
+      <w:r>
+        <w:rPr>
+          <w:rFonts w:eastAsia="Times New Roman" w:cs="Times New Roman"/>
+          <w:color w:val="61AFEF"/>
+          <w:kern w:val="0"/>
+          <w:sz w:val="21"/>
+          <w:szCs w:val="21"/>
+          <w14:ligatures w14:val="none"/>
+        </w:rPr>
+        <w:t>len</w:t>
+      </w:r>
+      <w:r>
+        <w:rPr>
+          <w:rFonts w:eastAsia="Times New Roman" w:cs="Times New Roman"/>
+          <w:color w:val="ABB2BF"/>
+          <w:kern w:val="0"/>
+          <w:sz w:val="21"/>
+          <w:szCs w:val="21"/>
+          <w14:ligatures w14:val="none"/>
+        </w:rPr>
+        <w:t>(</w:t>
+      </w:r>
+      <w:r>
+        <w:rPr>
+          <w:rFonts w:eastAsia="Times New Roman" w:cs="Times New Roman"/>
+          <w:color w:val="E06C75"/>
+          <w:kern w:val="0"/>
+          <w:sz w:val="21"/>
+          <w:szCs w:val="21"/>
+          <w14:ligatures w14:val="none"/>
+        </w:rPr>
+        <w:t>trip_seats</w:t>
+      </w:r>
+      <w:r>
+        <w:rPr>
+          <w:rFonts w:eastAsia="Times New Roman" w:cs="Times New Roman"/>
+          <w:color w:val="ABB2BF"/>
+          <w:kern w:val="0"/>
+          <w:sz w:val="21"/>
+          <w:szCs w:val="21"/>
+          <w14:ligatures w14:val="none"/>
+        </w:rPr>
+        <w:t>)</w:t>
+      </w:r>
+    </w:p>
+    <w:p>
+      <w:pPr>
+        <w:shd w:val="clear" w:color="auto" w:fill="23272E"/>
+        <w:bidi w:val="0"/>
+        <w:spacing w:after="0" w:line="285" w:lineRule="atLeast"/>
+        <w:rPr>
+          <w:rFonts w:eastAsia="Times New Roman" w:cs="Times New Roman"/>
+          <w:color w:val="ABB2BF"/>
+          <w:kern w:val="0"/>
+          <w:sz w:val="21"/>
+          <w:szCs w:val="21"/>
+          <w14:ligatures w14:val="none"/>
+        </w:rPr>
+      </w:pPr>
+    </w:p>
+    <w:p>
+      <w:pPr>
+        <w:shd w:val="clear" w:color="auto" w:fill="23272E"/>
+        <w:bidi w:val="0"/>
+        <w:spacing w:after="0" w:line="285" w:lineRule="atLeast"/>
+        <w:rPr>
+          <w:rFonts w:eastAsia="Times New Roman" w:cs="Times New Roman"/>
+          <w:color w:val="ABB2BF"/>
+          <w:kern w:val="0"/>
+          <w:sz w:val="21"/>
+          <w:szCs w:val="21"/>
+          <w14:ligatures w14:val="none"/>
+        </w:rPr>
+      </w:pPr>
+      <w:r>
+        <w:rPr>
+          <w:rFonts w:eastAsia="Times New Roman" w:cs="Times New Roman"/>
+          <w:color w:val="ABB2BF"/>
+          <w:kern w:val="0"/>
+          <w:sz w:val="21"/>
+          <w:szCs w:val="21"/>
+          <w14:ligatures w14:val="none"/>
+        </w:rPr>
+        <w:t xml:space="preserve">    </w:t>
+      </w:r>
+      <w:r>
+        <w:rPr>
+          <w:rFonts w:eastAsia="Times New Roman" w:cs="Times New Roman"/>
+          <w:color w:val="E06C75"/>
+          <w:kern w:val="0"/>
+          <w:sz w:val="21"/>
+          <w:szCs w:val="21"/>
+          <w14:ligatures w14:val="none"/>
+        </w:rPr>
+        <w:t>order</w:t>
+      </w:r>
+      <w:r>
+        <w:rPr>
+          <w:rFonts w:eastAsia="Times New Roman" w:cs="Times New Roman"/>
+          <w:color w:val="ABB2BF"/>
+          <w:kern w:val="0"/>
+          <w:sz w:val="21"/>
+          <w:szCs w:val="21"/>
+          <w14:ligatures w14:val="none"/>
+        </w:rPr>
+        <w:t xml:space="preserve"> </w:t>
+      </w:r>
+      <w:r>
+        <w:rPr>
+          <w:rFonts w:eastAsia="Times New Roman" w:cs="Times New Roman"/>
+          <w:color w:val="56B6C2"/>
+          <w:kern w:val="0"/>
+          <w:sz w:val="21"/>
+          <w:szCs w:val="21"/>
+          <w14:ligatures w14:val="none"/>
+        </w:rPr>
+        <w:t>=</w:t>
+      </w:r>
+      <w:r>
+        <w:rPr>
+          <w:rFonts w:eastAsia="Times New Roman" w:cs="Times New Roman"/>
+          <w:color w:val="ABB2BF"/>
+          <w:kern w:val="0"/>
+          <w:sz w:val="21"/>
+          <w:szCs w:val="21"/>
+          <w14:ligatures w14:val="none"/>
+        </w:rPr>
+        <w:t xml:space="preserve"> </w:t>
+      </w:r>
+      <w:r>
+        <w:rPr>
+          <w:rFonts w:eastAsia="Times New Roman" w:cs="Times New Roman"/>
+          <w:color w:val="E5C07B"/>
+          <w:kern w:val="0"/>
+          <w:sz w:val="21"/>
+          <w:szCs w:val="21"/>
+          <w14:ligatures w14:val="none"/>
+        </w:rPr>
+        <w:t>OrderModel</w:t>
+      </w:r>
+      <w:r>
+        <w:rPr>
+          <w:rFonts w:eastAsia="Times New Roman" w:cs="Times New Roman"/>
+          <w:color w:val="ABB2BF"/>
+          <w:kern w:val="0"/>
+          <w:sz w:val="21"/>
+          <w:szCs w:val="21"/>
+          <w14:ligatures w14:val="none"/>
+        </w:rPr>
+        <w:t>.</w:t>
+      </w:r>
+      <w:r>
+        <w:rPr>
+          <w:rFonts w:eastAsia="Times New Roman" w:cs="Times New Roman"/>
+          <w:color w:val="E06C75"/>
+          <w:kern w:val="0"/>
+          <w:sz w:val="21"/>
+          <w:szCs w:val="21"/>
+          <w14:ligatures w14:val="none"/>
+        </w:rPr>
+        <w:t>objects</w:t>
+      </w:r>
+      <w:r>
+        <w:rPr>
+          <w:rFonts w:eastAsia="Times New Roman" w:cs="Times New Roman"/>
+          <w:color w:val="ABB2BF"/>
+          <w:kern w:val="0"/>
+          <w:sz w:val="21"/>
+          <w:szCs w:val="21"/>
+          <w14:ligatures w14:val="none"/>
+        </w:rPr>
+        <w:t>.</w:t>
+      </w:r>
+      <w:r>
+        <w:rPr>
+          <w:rFonts w:eastAsia="Times New Roman" w:cs="Times New Roman"/>
+          <w:color w:val="61AFEF"/>
+          <w:kern w:val="0"/>
+          <w:sz w:val="21"/>
+          <w:szCs w:val="21"/>
+          <w14:ligatures w14:val="none"/>
+        </w:rPr>
+        <w:t>create</w:t>
+      </w:r>
+      <w:r>
+        <w:rPr>
+          <w:rFonts w:eastAsia="Times New Roman" w:cs="Times New Roman"/>
+          <w:color w:val="ABB2BF"/>
+          <w:kern w:val="0"/>
+          <w:sz w:val="21"/>
+          <w:szCs w:val="21"/>
+          <w14:ligatures w14:val="none"/>
+        </w:rPr>
+        <w:t>(</w:t>
+      </w:r>
+    </w:p>
+    <w:p>
+      <w:pPr>
+        <w:shd w:val="clear" w:color="auto" w:fill="23272E"/>
+        <w:bidi w:val="0"/>
+        <w:spacing w:after="0" w:line="285" w:lineRule="atLeast"/>
+        <w:rPr>
+          <w:rFonts w:eastAsia="Times New Roman" w:cs="Times New Roman"/>
+          <w:color w:val="ABB2BF"/>
+          <w:kern w:val="0"/>
+          <w:sz w:val="21"/>
+          <w:szCs w:val="21"/>
+          <w14:ligatures w14:val="none"/>
+        </w:rPr>
+      </w:pPr>
+      <w:r>
+        <w:rPr>
+          <w:rFonts w:eastAsia="Times New Roman" w:cs="Times New Roman"/>
+          <w:color w:val="ABB2BF"/>
+          <w:kern w:val="0"/>
+          <w:sz w:val="21"/>
+          <w:szCs w:val="21"/>
+          <w14:ligatures w14:val="none"/>
+        </w:rPr>
+        <w:t xml:space="preserve">        </w:t>
+      </w:r>
+      <w:r>
+        <w:rPr>
+          <w:rFonts w:eastAsia="Times New Roman" w:cs="Times New Roman"/>
+          <w:color w:val="E06C75"/>
+          <w:kern w:val="0"/>
+          <w:sz w:val="21"/>
+          <w:szCs w:val="21"/>
+          <w14:ligatures w14:val="none"/>
+        </w:rPr>
+        <w:t>user</w:t>
+      </w:r>
+      <w:r>
+        <w:rPr>
+          <w:rFonts w:eastAsia="Times New Roman" w:cs="Times New Roman"/>
+          <w:color w:val="56B6C2"/>
+          <w:kern w:val="0"/>
+          <w:sz w:val="21"/>
+          <w:szCs w:val="21"/>
+          <w14:ligatures w14:val="none"/>
+        </w:rPr>
+        <w:t>=</w:t>
+      </w:r>
+      <w:r>
+        <w:rPr>
+          <w:rFonts w:eastAsia="Times New Roman" w:cs="Times New Roman"/>
+          <w:color w:val="E06C75"/>
+          <w:kern w:val="0"/>
+          <w:sz w:val="21"/>
+          <w:szCs w:val="21"/>
+          <w14:ligatures w14:val="none"/>
+        </w:rPr>
+        <w:t>user</w:t>
+      </w:r>
+      <w:r>
+        <w:rPr>
+          <w:rFonts w:eastAsia="Times New Roman" w:cs="Times New Roman"/>
+          <w:color w:val="ABB2BF"/>
+          <w:kern w:val="0"/>
+          <w:sz w:val="21"/>
+          <w:szCs w:val="21"/>
+          <w14:ligatures w14:val="none"/>
+        </w:rPr>
+        <w:t>,</w:t>
+      </w:r>
+    </w:p>
+    <w:p>
+      <w:pPr>
+        <w:shd w:val="clear" w:color="auto" w:fill="23272E"/>
+        <w:bidi w:val="0"/>
+        <w:spacing w:after="0" w:line="285" w:lineRule="atLeast"/>
+        <w:rPr>
+          <w:rFonts w:eastAsia="Times New Roman" w:cs="Times New Roman"/>
+          <w:color w:val="ABB2BF"/>
+          <w:kern w:val="0"/>
+          <w:sz w:val="21"/>
+          <w:szCs w:val="21"/>
+          <w14:ligatures w14:val="none"/>
+        </w:rPr>
+      </w:pPr>
+      <w:r>
+        <w:rPr>
+          <w:rFonts w:eastAsia="Times New Roman" w:cs="Times New Roman"/>
+          <w:color w:val="ABB2BF"/>
+          <w:kern w:val="0"/>
+          <w:sz w:val="21"/>
+          <w:szCs w:val="21"/>
+          <w14:ligatures w14:val="none"/>
+        </w:rPr>
+        <w:t xml:space="preserve">        </w:t>
+      </w:r>
+      <w:r>
+        <w:rPr>
+          <w:rFonts w:eastAsia="Times New Roman" w:cs="Times New Roman"/>
+          <w:color w:val="E06C75"/>
+          <w:kern w:val="0"/>
+          <w:sz w:val="21"/>
+          <w:szCs w:val="21"/>
+          <w14:ligatures w14:val="none"/>
+        </w:rPr>
+        <w:t>final_price</w:t>
+      </w:r>
+      <w:r>
+        <w:rPr>
+          <w:rFonts w:eastAsia="Times New Roman" w:cs="Times New Roman"/>
+          <w:color w:val="56B6C2"/>
+          <w:kern w:val="0"/>
+          <w:sz w:val="21"/>
+          <w:szCs w:val="21"/>
+          <w14:ligatures w14:val="none"/>
+        </w:rPr>
+        <w:t>=</w:t>
+      </w:r>
+      <w:r>
+        <w:rPr>
+          <w:rFonts w:eastAsia="Times New Roman" w:cs="Times New Roman"/>
+          <w:color w:val="E06C75"/>
+          <w:kern w:val="0"/>
+          <w:sz w:val="21"/>
+          <w:szCs w:val="21"/>
+          <w14:ligatures w14:val="none"/>
+        </w:rPr>
+        <w:t>total_price</w:t>
+      </w:r>
+      <w:r>
+        <w:rPr>
+          <w:rFonts w:eastAsia="Times New Roman" w:cs="Times New Roman"/>
+          <w:color w:val="ABB2BF"/>
+          <w:kern w:val="0"/>
+          <w:sz w:val="21"/>
+          <w:szCs w:val="21"/>
+          <w14:ligatures w14:val="none"/>
+        </w:rPr>
+        <w:t>,</w:t>
+      </w:r>
+    </w:p>
+    <w:p>
+      <w:pPr>
+        <w:shd w:val="clear" w:color="auto" w:fill="23272E"/>
+        <w:bidi w:val="0"/>
+        <w:spacing w:after="0" w:line="285" w:lineRule="atLeast"/>
+        <w:rPr>
+          <w:rFonts w:eastAsia="Times New Roman" w:cs="Times New Roman"/>
+          <w:color w:val="ABB2BF"/>
+          <w:kern w:val="0"/>
+          <w:sz w:val="21"/>
+          <w:szCs w:val="21"/>
+          <w14:ligatures w14:val="none"/>
+        </w:rPr>
+      </w:pPr>
+      <w:r>
+        <w:rPr>
+          <w:rFonts w:eastAsia="Times New Roman" w:cs="Times New Roman"/>
+          <w:color w:val="ABB2BF"/>
+          <w:kern w:val="0"/>
+          <w:sz w:val="21"/>
+          <w:szCs w:val="21"/>
+          <w14:ligatures w14:val="none"/>
+        </w:rPr>
+        <w:lastRenderedPageBreak/>
+        <w:t xml:space="preserve">        </w:t>
+      </w:r>
+      <w:r>
+        <w:rPr>
+          <w:rFonts w:eastAsia="Times New Roman" w:cs="Times New Roman"/>
+          <w:color w:val="E06C75"/>
+          <w:kern w:val="0"/>
+          <w:sz w:val="21"/>
+          <w:szCs w:val="21"/>
+          <w14:ligatures w14:val="none"/>
+        </w:rPr>
+        <w:t>status</w:t>
+      </w:r>
+      <w:r>
+        <w:rPr>
+          <w:rFonts w:eastAsia="Times New Roman" w:cs="Times New Roman"/>
+          <w:color w:val="56B6C2"/>
+          <w:kern w:val="0"/>
+          <w:sz w:val="21"/>
+          <w:szCs w:val="21"/>
+          <w14:ligatures w14:val="none"/>
+        </w:rPr>
+        <w:t>=</w:t>
+      </w:r>
+      <w:r>
+        <w:rPr>
+          <w:rFonts w:eastAsia="Times New Roman" w:cs="Times New Roman"/>
+          <w:color w:val="E5C07B"/>
+          <w:kern w:val="0"/>
+          <w:sz w:val="21"/>
+          <w:szCs w:val="21"/>
+          <w14:ligatures w14:val="none"/>
+        </w:rPr>
+        <w:t>OrderModel</w:t>
+      </w:r>
+      <w:r>
+        <w:rPr>
+          <w:rFonts w:eastAsia="Times New Roman" w:cs="Times New Roman"/>
+          <w:color w:val="ABB2BF"/>
+          <w:kern w:val="0"/>
+          <w:sz w:val="21"/>
+          <w:szCs w:val="21"/>
+          <w14:ligatures w14:val="none"/>
+        </w:rPr>
+        <w:t>.</w:t>
+      </w:r>
+      <w:r>
+        <w:rPr>
+          <w:rFonts w:eastAsia="Times New Roman" w:cs="Times New Roman"/>
+          <w:color w:val="E5C07B"/>
+          <w:kern w:val="0"/>
+          <w:sz w:val="21"/>
+          <w:szCs w:val="21"/>
+          <w14:ligatures w14:val="none"/>
+        </w:rPr>
+        <w:t>OrderStatus</w:t>
+      </w:r>
+      <w:r>
+        <w:rPr>
+          <w:rFonts w:eastAsia="Times New Roman" w:cs="Times New Roman"/>
+          <w:color w:val="ABB2BF"/>
+          <w:kern w:val="0"/>
+          <w:sz w:val="21"/>
+          <w:szCs w:val="21"/>
+          <w14:ligatures w14:val="none"/>
+        </w:rPr>
+        <w:t>.</w:t>
+      </w:r>
+      <w:r>
+        <w:rPr>
+          <w:rFonts w:eastAsia="Times New Roman" w:cs="Times New Roman"/>
+          <w:color w:val="56B6C2"/>
+          <w:kern w:val="0"/>
+          <w:sz w:val="21"/>
+          <w:szCs w:val="21"/>
+          <w14:ligatures w14:val="none"/>
+        </w:rPr>
+        <w:t>PAID</w:t>
+      </w:r>
+    </w:p>
+    <w:p>
+      <w:pPr>
+        <w:shd w:val="clear" w:color="auto" w:fill="23272E"/>
+        <w:bidi w:val="0"/>
+        <w:spacing w:after="0" w:line="285" w:lineRule="atLeast"/>
+        <w:rPr>
+          <w:rFonts w:eastAsia="Times New Roman" w:cs="Times New Roman"/>
+          <w:color w:val="ABB2BF"/>
+          <w:kern w:val="0"/>
+          <w:sz w:val="21"/>
+          <w:szCs w:val="21"/>
+          <w14:ligatures w14:val="none"/>
+        </w:rPr>
+      </w:pPr>
+      <w:r>
+        <w:rPr>
+          <w:rFonts w:eastAsia="Times New Roman" w:cs="Times New Roman"/>
+          <w:color w:val="ABB2BF"/>
+          <w:kern w:val="0"/>
+          <w:sz w:val="21"/>
+          <w:szCs w:val="21"/>
+          <w14:ligatures w14:val="none"/>
+        </w:rPr>
+        <w:t>    )</w:t>
+      </w:r>
+    </w:p>
+    <w:p>
+      <w:pPr>
+        <w:shd w:val="clear" w:color="auto" w:fill="23272E"/>
+        <w:bidi w:val="0"/>
+        <w:spacing w:after="240" w:line="285" w:lineRule="atLeast"/>
+        <w:rPr>
+          <w:rFonts w:eastAsia="Times New Roman" w:cs="Times New Roman"/>
+          <w:color w:val="ABB2BF"/>
+          <w:kern w:val="0"/>
+          <w:sz w:val="21"/>
+          <w:szCs w:val="21"/>
+          <w14:ligatures w14:val="none"/>
+        </w:rPr>
+      </w:pPr>
+    </w:p>
+    <w:p>
+      <w:pPr>
+        <w:shd w:val="clear" w:color="auto" w:fill="23272E"/>
+        <w:bidi w:val="0"/>
+        <w:spacing w:after="0" w:line="285" w:lineRule="atLeast"/>
+        <w:rPr>
+          <w:rFonts w:eastAsia="Times New Roman" w:cs="Times New Roman"/>
+          <w:color w:val="ABB2BF"/>
+          <w:kern w:val="0"/>
+          <w:sz w:val="21"/>
+          <w:szCs w:val="21"/>
+          <w14:ligatures w14:val="none"/>
+        </w:rPr>
+      </w:pPr>
+      <w:r>
+        <w:rPr>
+          <w:rFonts w:eastAsia="Times New Roman" w:cs="Times New Roman"/>
+          <w:color w:val="ABB2BF"/>
+          <w:kern w:val="0"/>
+          <w:sz w:val="21"/>
+          <w:szCs w:val="21"/>
+          <w14:ligatures w14:val="none"/>
+        </w:rPr>
+        <w:t xml:space="preserve">    </w:t>
+      </w:r>
+      <w:r>
+        <w:rPr>
+          <w:rFonts w:eastAsia="Times New Roman" w:cs="Times New Roman"/>
+          <w:color w:val="E06C75"/>
+          <w:kern w:val="0"/>
+          <w:sz w:val="21"/>
+          <w:szCs w:val="21"/>
+          <w14:ligatures w14:val="none"/>
+        </w:rPr>
+        <w:t>tickets</w:t>
+      </w:r>
+      <w:r>
+        <w:rPr>
+          <w:rFonts w:eastAsia="Times New Roman" w:cs="Times New Roman"/>
+          <w:color w:val="ABB2BF"/>
+          <w:kern w:val="0"/>
+          <w:sz w:val="21"/>
+          <w:szCs w:val="21"/>
+          <w14:ligatures w14:val="none"/>
+        </w:rPr>
+        <w:t xml:space="preserve"> </w:t>
+      </w:r>
+      <w:r>
+        <w:rPr>
+          <w:rFonts w:eastAsia="Times New Roman" w:cs="Times New Roman"/>
+          <w:color w:val="56B6C2"/>
+          <w:kern w:val="0"/>
+          <w:sz w:val="21"/>
+          <w:szCs w:val="21"/>
+          <w14:ligatures w14:val="none"/>
+        </w:rPr>
+        <w:t>=</w:t>
+      </w:r>
+      <w:r>
+        <w:rPr>
+          <w:rFonts w:eastAsia="Times New Roman" w:cs="Times New Roman"/>
+          <w:color w:val="ABB2BF"/>
+          <w:kern w:val="0"/>
+          <w:sz w:val="21"/>
+          <w:szCs w:val="21"/>
+          <w14:ligatures w14:val="none"/>
+        </w:rPr>
+        <w:t xml:space="preserve"> []</w:t>
+      </w:r>
+    </w:p>
+    <w:p>
+      <w:pPr>
+        <w:shd w:val="clear" w:color="auto" w:fill="23272E"/>
+        <w:bidi w:val="0"/>
+        <w:spacing w:after="0" w:line="285" w:lineRule="atLeast"/>
+        <w:rPr>
+          <w:rFonts w:eastAsia="Times New Roman" w:cs="Times New Roman"/>
+          <w:color w:val="ABB2BF"/>
+          <w:kern w:val="0"/>
+          <w:sz w:val="21"/>
+          <w:szCs w:val="21"/>
+          <w14:ligatures w14:val="none"/>
+        </w:rPr>
+      </w:pPr>
+    </w:p>
+    <w:p>
+      <w:pPr>
+        <w:shd w:val="clear" w:color="auto" w:fill="23272E"/>
+        <w:bidi w:val="0"/>
+        <w:spacing w:after="0" w:line="285" w:lineRule="atLeast"/>
+        <w:rPr>
+          <w:rFonts w:eastAsia="Times New Roman" w:cs="Times New Roman"/>
+          <w:color w:val="ABB2BF"/>
+          <w:kern w:val="0"/>
+          <w:sz w:val="21"/>
+          <w:szCs w:val="21"/>
+          <w14:ligatures w14:val="none"/>
+        </w:rPr>
+      </w:pPr>
+      <w:r>
+        <w:rPr>
+          <w:rFonts w:eastAsia="Times New Roman" w:cs="Times New Roman"/>
+          <w:color w:val="ABB2BF"/>
+          <w:kern w:val="0"/>
+          <w:sz w:val="21"/>
+          <w:szCs w:val="21"/>
+          <w14:ligatures w14:val="none"/>
+        </w:rPr>
+        <w:t xml:space="preserve">    </w:t>
+      </w:r>
+      <w:r>
+        <w:rPr>
+          <w:rFonts w:eastAsia="Times New Roman" w:cs="Times New Roman"/>
+          <w:color w:val="C678DD"/>
+          <w:kern w:val="0"/>
+          <w:sz w:val="21"/>
+          <w:szCs w:val="21"/>
+          <w14:ligatures w14:val="none"/>
+        </w:rPr>
+        <w:t>for</w:t>
+      </w:r>
+      <w:r>
+        <w:rPr>
+          <w:rFonts w:eastAsia="Times New Roman" w:cs="Times New Roman"/>
+          <w:color w:val="ABB2BF"/>
+          <w:kern w:val="0"/>
+          <w:sz w:val="21"/>
+          <w:szCs w:val="21"/>
+          <w14:ligatures w14:val="none"/>
+        </w:rPr>
+        <w:t xml:space="preserve"> </w:t>
+      </w:r>
+      <w:r>
+        <w:rPr>
+          <w:rFonts w:eastAsia="Times New Roman" w:cs="Times New Roman"/>
+          <w:color w:val="E06C75"/>
+          <w:kern w:val="0"/>
+          <w:sz w:val="21"/>
+          <w:szCs w:val="21"/>
+          <w14:ligatures w14:val="none"/>
+        </w:rPr>
+        <w:t>trip_seat</w:t>
+      </w:r>
+      <w:r>
+        <w:rPr>
+          <w:rFonts w:eastAsia="Times New Roman" w:cs="Times New Roman"/>
+          <w:color w:val="ABB2BF"/>
+          <w:kern w:val="0"/>
+          <w:sz w:val="21"/>
+          <w:szCs w:val="21"/>
+          <w14:ligatures w14:val="none"/>
+        </w:rPr>
+        <w:t xml:space="preserve"> </w:t>
+      </w:r>
+      <w:r>
+        <w:rPr>
+          <w:rFonts w:eastAsia="Times New Roman" w:cs="Times New Roman"/>
+          <w:color w:val="C678DD"/>
+          <w:kern w:val="0"/>
+          <w:sz w:val="21"/>
+          <w:szCs w:val="21"/>
+          <w14:ligatures w14:val="none"/>
+        </w:rPr>
+        <w:t>in</w:t>
+      </w:r>
+      <w:r>
+        <w:rPr>
+          <w:rFonts w:eastAsia="Times New Roman" w:cs="Times New Roman"/>
+          <w:color w:val="ABB2BF"/>
+          <w:kern w:val="0"/>
+          <w:sz w:val="21"/>
+          <w:szCs w:val="21"/>
+          <w14:ligatures w14:val="none"/>
+        </w:rPr>
+        <w:t xml:space="preserve"> </w:t>
+      </w:r>
+      <w:r>
+        <w:rPr>
+          <w:rFonts w:eastAsia="Times New Roman" w:cs="Times New Roman"/>
+          <w:color w:val="E06C75"/>
+          <w:kern w:val="0"/>
+          <w:sz w:val="21"/>
+          <w:szCs w:val="21"/>
+          <w14:ligatures w14:val="none"/>
+        </w:rPr>
+        <w:t>trip_seats</w:t>
+      </w:r>
+      <w:r>
+        <w:rPr>
+          <w:rFonts w:eastAsia="Times New Roman" w:cs="Times New Roman"/>
+          <w:color w:val="ABB2BF"/>
+          <w:kern w:val="0"/>
+          <w:sz w:val="21"/>
+          <w:szCs w:val="21"/>
+          <w14:ligatures w14:val="none"/>
+        </w:rPr>
+        <w:t>:</w:t>
+      </w:r>
+    </w:p>
+    <w:p>
+      <w:pPr>
+        <w:shd w:val="clear" w:color="auto" w:fill="23272E"/>
+        <w:bidi w:val="0"/>
+        <w:spacing w:after="0" w:line="285" w:lineRule="atLeast"/>
+        <w:rPr>
+          <w:rFonts w:eastAsia="Times New Roman" w:cs="Times New Roman"/>
+          <w:color w:val="ABB2BF"/>
+          <w:kern w:val="0"/>
+          <w:sz w:val="21"/>
+          <w:szCs w:val="21"/>
+          <w14:ligatures w14:val="none"/>
+        </w:rPr>
+      </w:pPr>
+    </w:p>
+    <w:p>
+      <w:pPr>
+        <w:shd w:val="clear" w:color="auto" w:fill="23272E"/>
+        <w:bidi w:val="0"/>
+        <w:spacing w:after="0" w:line="285" w:lineRule="atLeast"/>
+        <w:rPr>
+          <w:rFonts w:eastAsia="Times New Roman" w:cs="Times New Roman"/>
+          <w:color w:val="ABB2BF"/>
+          <w:kern w:val="0"/>
+          <w:sz w:val="21"/>
+          <w:szCs w:val="21"/>
+          <w14:ligatures w14:val="none"/>
+        </w:rPr>
+      </w:pPr>
+      <w:r>
+        <w:rPr>
+          <w:rFonts w:eastAsia="Times New Roman" w:cs="Times New Roman"/>
+          <w:color w:val="ABB2BF"/>
+          <w:kern w:val="0"/>
+          <w:sz w:val="21"/>
+          <w:szCs w:val="21"/>
+          <w14:ligatures w14:val="none"/>
+        </w:rPr>
+        <w:t xml:space="preserve">        </w:t>
+      </w:r>
+      <w:r>
+        <w:rPr>
+          <w:rFonts w:eastAsia="Times New Roman" w:cs="Times New Roman"/>
+          <w:color w:val="E06C75"/>
+          <w:kern w:val="0"/>
+          <w:sz w:val="21"/>
+          <w:szCs w:val="21"/>
+          <w14:ligatures w14:val="none"/>
+        </w:rPr>
+        <w:t>ticket</w:t>
+      </w:r>
+      <w:r>
+        <w:rPr>
+          <w:rFonts w:eastAsia="Times New Roman" w:cs="Times New Roman"/>
+          <w:color w:val="ABB2BF"/>
+          <w:kern w:val="0"/>
+          <w:sz w:val="21"/>
+          <w:szCs w:val="21"/>
+          <w14:ligatures w14:val="none"/>
+        </w:rPr>
+        <w:t xml:space="preserve"> </w:t>
+      </w:r>
+      <w:r>
+        <w:rPr>
+          <w:rFonts w:eastAsia="Times New Roman" w:cs="Times New Roman"/>
+          <w:color w:val="56B6C2"/>
+          <w:kern w:val="0"/>
+          <w:sz w:val="21"/>
+          <w:szCs w:val="21"/>
+          <w14:ligatures w14:val="none"/>
+        </w:rPr>
+        <w:t>=</w:t>
+      </w:r>
+      <w:r>
+        <w:rPr>
+          <w:rFonts w:eastAsia="Times New Roman" w:cs="Times New Roman"/>
+          <w:color w:val="ABB2BF"/>
+          <w:kern w:val="0"/>
+          <w:sz w:val="21"/>
+          <w:szCs w:val="21"/>
+          <w14:ligatures w14:val="none"/>
+        </w:rPr>
+        <w:t xml:space="preserve"> </w:t>
+      </w:r>
+      <w:r>
+        <w:rPr>
+          <w:rFonts w:eastAsia="Times New Roman" w:cs="Times New Roman"/>
+          <w:color w:val="E5C07B"/>
+          <w:kern w:val="0"/>
+          <w:sz w:val="21"/>
+          <w:szCs w:val="21"/>
+          <w14:ligatures w14:val="none"/>
+        </w:rPr>
+        <w:t>TicketModel</w:t>
+      </w:r>
+      <w:r>
+        <w:rPr>
+          <w:rFonts w:eastAsia="Times New Roman" w:cs="Times New Roman"/>
+          <w:color w:val="ABB2BF"/>
+          <w:kern w:val="0"/>
+          <w:sz w:val="21"/>
+          <w:szCs w:val="21"/>
+          <w14:ligatures w14:val="none"/>
+        </w:rPr>
+        <w:t>.</w:t>
+      </w:r>
+      <w:r>
+        <w:rPr>
+          <w:rFonts w:eastAsia="Times New Roman" w:cs="Times New Roman"/>
+          <w:color w:val="E06C75"/>
+          <w:kern w:val="0"/>
+          <w:sz w:val="21"/>
+          <w:szCs w:val="21"/>
+          <w14:ligatures w14:val="none"/>
+        </w:rPr>
+        <w:t>objects</w:t>
+      </w:r>
+      <w:r>
+        <w:rPr>
+          <w:rFonts w:eastAsia="Times New Roman" w:cs="Times New Roman"/>
+          <w:color w:val="ABB2BF"/>
+          <w:kern w:val="0"/>
+          <w:sz w:val="21"/>
+          <w:szCs w:val="21"/>
+          <w14:ligatures w14:val="none"/>
+        </w:rPr>
+        <w:t>.</w:t>
+      </w:r>
+      <w:r>
+        <w:rPr>
+          <w:rFonts w:eastAsia="Times New Roman" w:cs="Times New Roman"/>
+          <w:color w:val="61AFEF"/>
+          <w:kern w:val="0"/>
+          <w:sz w:val="21"/>
+          <w:szCs w:val="21"/>
+          <w14:ligatures w14:val="none"/>
+        </w:rPr>
+        <w:t>create</w:t>
+      </w:r>
+      <w:r>
+        <w:rPr>
+          <w:rFonts w:eastAsia="Times New Roman" w:cs="Times New Roman"/>
+          <w:color w:val="ABB2BF"/>
+          <w:kern w:val="0"/>
+          <w:sz w:val="21"/>
+          <w:szCs w:val="21"/>
+          <w14:ligatures w14:val="none"/>
+        </w:rPr>
+        <w:t>(</w:t>
+      </w:r>
+    </w:p>
+    <w:p>
+      <w:pPr>
+        <w:shd w:val="clear" w:color="auto" w:fill="23272E"/>
+        <w:bidi w:val="0"/>
+        <w:spacing w:after="0" w:line="285" w:lineRule="atLeast"/>
+        <w:rPr>
+          <w:rFonts w:eastAsia="Times New Roman" w:cs="Times New Roman"/>
+          <w:color w:val="ABB2BF"/>
+          <w:kern w:val="0"/>
+          <w:sz w:val="21"/>
+          <w:szCs w:val="21"/>
+          <w14:ligatures w14:val="none"/>
+        </w:rPr>
+      </w:pPr>
+      <w:r>
+        <w:rPr>
+          <w:rFonts w:eastAsia="Times New Roman" w:cs="Times New Roman"/>
+          <w:color w:val="ABB2BF"/>
+          <w:kern w:val="0"/>
+          <w:sz w:val="21"/>
+          <w:szCs w:val="21"/>
+          <w14:ligatures w14:val="none"/>
+        </w:rPr>
+        <w:t xml:space="preserve">            </w:t>
+      </w:r>
+      <w:r>
+        <w:rPr>
+          <w:rFonts w:eastAsia="Times New Roman" w:cs="Times New Roman"/>
+          <w:color w:val="E06C75"/>
+          <w:kern w:val="0"/>
+          <w:sz w:val="21"/>
+          <w:szCs w:val="21"/>
+          <w14:ligatures w14:val="none"/>
+        </w:rPr>
+        <w:t>order</w:t>
+      </w:r>
+      <w:r>
+        <w:rPr>
+          <w:rFonts w:eastAsia="Times New Roman" w:cs="Times New Roman"/>
+          <w:color w:val="56B6C2"/>
+          <w:kern w:val="0"/>
+          <w:sz w:val="21"/>
+          <w:szCs w:val="21"/>
+          <w14:ligatures w14:val="none"/>
+        </w:rPr>
+        <w:t>=</w:t>
+      </w:r>
+      <w:r>
+        <w:rPr>
+          <w:rFonts w:eastAsia="Times New Roman" w:cs="Times New Roman"/>
+          <w:color w:val="E06C75"/>
+          <w:kern w:val="0"/>
+          <w:sz w:val="21"/>
+          <w:szCs w:val="21"/>
+          <w14:ligatures w14:val="none"/>
+        </w:rPr>
+        <w:t>order</w:t>
+      </w:r>
+      <w:r>
+        <w:rPr>
+          <w:rFonts w:eastAsia="Times New Roman" w:cs="Times New Roman"/>
+          <w:color w:val="ABB2BF"/>
+          <w:kern w:val="0"/>
+          <w:sz w:val="21"/>
+          <w:szCs w:val="21"/>
+          <w14:ligatures w14:val="none"/>
+        </w:rPr>
+        <w:t>,</w:t>
+      </w:r>
+    </w:p>
+    <w:p>
+      <w:pPr>
+        <w:shd w:val="clear" w:color="auto" w:fill="23272E"/>
+        <w:bidi w:val="0"/>
+        <w:spacing w:after="0" w:line="285" w:lineRule="atLeast"/>
+        <w:rPr>
+          <w:rFonts w:eastAsia="Times New Roman" w:cs="Times New Roman"/>
+          <w:color w:val="ABB2BF"/>
+          <w:kern w:val="0"/>
+          <w:sz w:val="21"/>
+          <w:szCs w:val="21"/>
+          <w14:ligatures w14:val="none"/>
+        </w:rPr>
+      </w:pPr>
+      <w:r>
+        <w:rPr>
+          <w:rFonts w:eastAsia="Times New Roman" w:cs="Times New Roman"/>
+          <w:color w:val="ABB2BF"/>
+          <w:kern w:val="0"/>
+          <w:sz w:val="21"/>
+          <w:szCs w:val="21"/>
+          <w14:ligatures w14:val="none"/>
+        </w:rPr>
+        <w:t xml:space="preserve">            </w:t>
+      </w:r>
+      <w:r>
+        <w:rPr>
+          <w:rFonts w:eastAsia="Times New Roman" w:cs="Times New Roman"/>
+          <w:color w:val="E06C75"/>
+          <w:kern w:val="0"/>
+          <w:sz w:val="21"/>
+          <w:szCs w:val="21"/>
+          <w14:ligatures w14:val="none"/>
+        </w:rPr>
+        <w:t>user</w:t>
+      </w:r>
+      <w:r>
+        <w:rPr>
+          <w:rFonts w:eastAsia="Times New Roman" w:cs="Times New Roman"/>
+          <w:color w:val="56B6C2"/>
+          <w:kern w:val="0"/>
+          <w:sz w:val="21"/>
+          <w:szCs w:val="21"/>
+          <w14:ligatures w14:val="none"/>
+        </w:rPr>
+        <w:t>=</w:t>
+      </w:r>
+      <w:r>
+        <w:rPr>
+          <w:rFonts w:eastAsia="Times New Roman" w:cs="Times New Roman"/>
+          <w:color w:val="E06C75"/>
+          <w:kern w:val="0"/>
+          <w:sz w:val="21"/>
+          <w:szCs w:val="21"/>
+          <w14:ligatures w14:val="none"/>
+        </w:rPr>
+        <w:t>user</w:t>
+      </w:r>
+      <w:r>
+        <w:rPr>
+          <w:rFonts w:eastAsia="Times New Roman" w:cs="Times New Roman"/>
+          <w:color w:val="ABB2BF"/>
+          <w:kern w:val="0"/>
+          <w:sz w:val="21"/>
+          <w:szCs w:val="21"/>
+          <w14:ligatures w14:val="none"/>
+        </w:rPr>
+        <w:t>,</w:t>
+      </w:r>
+    </w:p>
+    <w:p>
+      <w:pPr>
+        <w:shd w:val="clear" w:color="auto" w:fill="23272E"/>
+        <w:bidi w:val="0"/>
+        <w:spacing w:after="0" w:line="285" w:lineRule="atLeast"/>
+        <w:rPr>
+          <w:rFonts w:eastAsia="Times New Roman" w:cs="Times New Roman"/>
+          <w:color w:val="ABB2BF"/>
+          <w:kern w:val="0"/>
+          <w:sz w:val="21"/>
+          <w:szCs w:val="21"/>
+          <w14:ligatures w14:val="none"/>
+        </w:rPr>
+      </w:pPr>
+      <w:r>
+        <w:rPr>
+          <w:rFonts w:eastAsia="Times New Roman" w:cs="Times New Roman"/>
+          <w:color w:val="ABB2BF"/>
+          <w:kern w:val="0"/>
+          <w:sz w:val="21"/>
+          <w:szCs w:val="21"/>
+          <w14:ligatures w14:val="none"/>
+        </w:rPr>
+        <w:t xml:space="preserve">            </w:t>
+      </w:r>
+      <w:r>
+        <w:rPr>
+          <w:rFonts w:eastAsia="Times New Roman" w:cs="Times New Roman"/>
+          <w:color w:val="E06C75"/>
+          <w:kern w:val="0"/>
+          <w:sz w:val="21"/>
+          <w:szCs w:val="21"/>
+          <w14:ligatures w14:val="none"/>
+        </w:rPr>
+        <w:t>trip_seat</w:t>
+      </w:r>
+      <w:r>
+        <w:rPr>
+          <w:rFonts w:eastAsia="Times New Roman" w:cs="Times New Roman"/>
+          <w:color w:val="56B6C2"/>
+          <w:kern w:val="0"/>
+          <w:sz w:val="21"/>
+          <w:szCs w:val="21"/>
+          <w14:ligatures w14:val="none"/>
+        </w:rPr>
+        <w:t>=</w:t>
+      </w:r>
+      <w:r>
+        <w:rPr>
+          <w:rFonts w:eastAsia="Times New Roman" w:cs="Times New Roman"/>
+          <w:color w:val="E06C75"/>
+          <w:kern w:val="0"/>
+          <w:sz w:val="21"/>
+          <w:szCs w:val="21"/>
+          <w14:ligatures w14:val="none"/>
+        </w:rPr>
+        <w:t>trip_seat</w:t>
+      </w:r>
+      <w:r>
+        <w:rPr>
+          <w:rFonts w:eastAsia="Times New Roman" w:cs="Times New Roman"/>
+          <w:color w:val="ABB2BF"/>
+          <w:kern w:val="0"/>
+          <w:sz w:val="21"/>
+          <w:szCs w:val="21"/>
+          <w14:ligatures w14:val="none"/>
+        </w:rPr>
+        <w:t>,</w:t>
+      </w:r>
+    </w:p>
+    <w:p>
+      <w:pPr>
+        <w:shd w:val="clear" w:color="auto" w:fill="23272E"/>
+        <w:bidi w:val="0"/>
+        <w:spacing w:after="0" w:line="285" w:lineRule="atLeast"/>
+        <w:rPr>
+          <w:rFonts w:eastAsia="Times New Roman" w:cs="Times New Roman"/>
+          <w:color w:val="ABB2BF"/>
+          <w:kern w:val="0"/>
+          <w:sz w:val="21"/>
+          <w:szCs w:val="21"/>
+          <w14:ligatures w14:val="none"/>
+        </w:rPr>
+      </w:pPr>
+      <w:r>
+        <w:rPr>
+          <w:rFonts w:eastAsia="Times New Roman" w:cs="Times New Roman"/>
+          <w:color w:val="ABB2BF"/>
+          <w:kern w:val="0"/>
+          <w:sz w:val="21"/>
+          <w:szCs w:val="21"/>
+          <w14:ligatures w14:val="none"/>
+        </w:rPr>
+        <w:t xml:space="preserve">            </w:t>
+      </w:r>
+      <w:r>
+        <w:rPr>
+          <w:rFonts w:eastAsia="Times New Roman" w:cs="Times New Roman"/>
+          <w:color w:val="E06C75"/>
+          <w:kern w:val="0"/>
+          <w:sz w:val="21"/>
+          <w:szCs w:val="21"/>
+          <w14:ligatures w14:val="none"/>
+        </w:rPr>
+        <w:t>price</w:t>
+      </w:r>
+      <w:r>
+        <w:rPr>
+          <w:rFonts w:eastAsia="Times New Roman" w:cs="Times New Roman"/>
+          <w:color w:val="56B6C2"/>
+          <w:kern w:val="0"/>
+          <w:sz w:val="21"/>
+          <w:szCs w:val="21"/>
+          <w14:ligatures w14:val="none"/>
+        </w:rPr>
+        <w:t>=</w:t>
+      </w:r>
+      <w:r>
+        <w:rPr>
+          <w:rFonts w:eastAsia="Times New Roman" w:cs="Times New Roman"/>
+          <w:color w:val="E06C75"/>
+          <w:kern w:val="0"/>
+          <w:sz w:val="21"/>
+          <w:szCs w:val="21"/>
+          <w14:ligatures w14:val="none"/>
+        </w:rPr>
+        <w:t>trip</w:t>
+      </w:r>
+      <w:r>
+        <w:rPr>
+          <w:rFonts w:eastAsia="Times New Roman" w:cs="Times New Roman"/>
+          <w:color w:val="ABB2BF"/>
+          <w:kern w:val="0"/>
+          <w:sz w:val="21"/>
+          <w:szCs w:val="21"/>
+          <w14:ligatures w14:val="none"/>
+        </w:rPr>
+        <w:t>.price</w:t>
+      </w:r>
+    </w:p>
+    <w:p>
+      <w:pPr>
+        <w:shd w:val="clear" w:color="auto" w:fill="23272E"/>
+        <w:bidi w:val="0"/>
+        <w:spacing w:after="0" w:line="285" w:lineRule="atLeast"/>
+        <w:rPr>
+          <w:rFonts w:eastAsia="Times New Roman" w:cs="Times New Roman"/>
+          <w:color w:val="ABB2BF"/>
+          <w:kern w:val="0"/>
+          <w:sz w:val="21"/>
+          <w:szCs w:val="21"/>
+          <w14:ligatures w14:val="none"/>
+        </w:rPr>
+      </w:pPr>
+      <w:r>
+        <w:rPr>
+          <w:rFonts w:eastAsia="Times New Roman" w:cs="Times New Roman"/>
+          <w:color w:val="ABB2BF"/>
+          <w:kern w:val="0"/>
+          <w:sz w:val="21"/>
+          <w:szCs w:val="21"/>
+          <w14:ligatures w14:val="none"/>
+        </w:rPr>
+        <w:t>        )</w:t>
+      </w:r>
+    </w:p>
+    <w:p>
+      <w:pPr>
+        <w:shd w:val="clear" w:color="auto" w:fill="23272E"/>
+        <w:bidi w:val="0"/>
+        <w:spacing w:after="0" w:line="285" w:lineRule="atLeast"/>
+        <w:rPr>
+          <w:rFonts w:eastAsia="Times New Roman" w:cs="Times New Roman"/>
+          <w:color w:val="ABB2BF"/>
+          <w:kern w:val="0"/>
+          <w:sz w:val="21"/>
+          <w:szCs w:val="21"/>
+          <w14:ligatures w14:val="none"/>
+        </w:rPr>
+      </w:pPr>
+    </w:p>
+    <w:p>
+      <w:pPr>
+        <w:shd w:val="clear" w:color="auto" w:fill="23272E"/>
+        <w:bidi w:val="0"/>
+        <w:spacing w:after="0" w:line="285" w:lineRule="atLeast"/>
+        <w:rPr>
+          <w:rFonts w:eastAsia="Times New Roman" w:cs="Times New Roman"/>
+          <w:color w:val="ABB2BF"/>
+          <w:kern w:val="0"/>
+          <w:sz w:val="21"/>
+          <w:szCs w:val="21"/>
+          <w14:ligatures w14:val="none"/>
+        </w:rPr>
+      </w:pPr>
+      <w:r>
+        <w:rPr>
+          <w:rFonts w:eastAsia="Times New Roman" w:cs="Times New Roman"/>
+          <w:color w:val="ABB2BF"/>
+          <w:kern w:val="0"/>
+          <w:sz w:val="21"/>
+          <w:szCs w:val="21"/>
+          <w14:ligatures w14:val="none"/>
+        </w:rPr>
+        <w:t xml:space="preserve">        </w:t>
+      </w:r>
+      <w:r>
+        <w:rPr>
+          <w:rFonts w:eastAsia="Times New Roman" w:cs="Times New Roman"/>
+          <w:color w:val="E06C75"/>
+          <w:kern w:val="0"/>
+          <w:sz w:val="21"/>
+          <w:szCs w:val="21"/>
+          <w14:ligatures w14:val="none"/>
+        </w:rPr>
+        <w:t>tickets</w:t>
+      </w:r>
+      <w:r>
+        <w:rPr>
+          <w:rFonts w:eastAsia="Times New Roman" w:cs="Times New Roman"/>
+          <w:color w:val="ABB2BF"/>
+          <w:kern w:val="0"/>
+          <w:sz w:val="21"/>
+          <w:szCs w:val="21"/>
+          <w14:ligatures w14:val="none"/>
+        </w:rPr>
+        <w:t>.</w:t>
+      </w:r>
+      <w:r>
+        <w:rPr>
+          <w:rFonts w:eastAsia="Times New Roman" w:cs="Times New Roman"/>
+          <w:color w:val="61AFEF"/>
+          <w:kern w:val="0"/>
+          <w:sz w:val="21"/>
+          <w:szCs w:val="21"/>
+          <w14:ligatures w14:val="none"/>
+        </w:rPr>
+        <w:t>append</w:t>
+      </w:r>
+      <w:r>
+        <w:rPr>
+          <w:rFonts w:eastAsia="Times New Roman" w:cs="Times New Roman"/>
+          <w:color w:val="ABB2BF"/>
+          <w:kern w:val="0"/>
+          <w:sz w:val="21"/>
+          <w:szCs w:val="21"/>
+          <w14:ligatures w14:val="none"/>
+        </w:rPr>
+        <w:t>(</w:t>
+      </w:r>
+      <w:r>
+        <w:rPr>
+          <w:rFonts w:eastAsia="Times New Roman" w:cs="Times New Roman"/>
+          <w:color w:val="E06C75"/>
+          <w:kern w:val="0"/>
+          <w:sz w:val="21"/>
+          <w:szCs w:val="21"/>
+          <w14:ligatures w14:val="none"/>
+        </w:rPr>
+        <w:t>ticket</w:t>
+      </w:r>
+      <w:r>
+        <w:rPr>
+          <w:rFonts w:eastAsia="Times New Roman" w:cs="Times New Roman"/>
+          <w:color w:val="ABB2BF"/>
+          <w:kern w:val="0"/>
+          <w:sz w:val="21"/>
+          <w:szCs w:val="21"/>
+          <w14:ligatures w14:val="none"/>
+        </w:rPr>
+        <w:t>)</w:t>
+      </w:r>
+    </w:p>
+    <w:p>
+      <w:pPr>
+        <w:shd w:val="clear" w:color="auto" w:fill="23272E"/>
+        <w:bidi w:val="0"/>
+        <w:spacing w:after="0" w:line="285" w:lineRule="atLeast"/>
+        <w:rPr>
+          <w:rFonts w:eastAsia="Times New Roman" w:cs="Times New Roman"/>
+          <w:color w:val="ABB2BF"/>
+          <w:kern w:val="0"/>
+          <w:sz w:val="21"/>
+          <w:szCs w:val="21"/>
+          <w14:ligatures w14:val="none"/>
+        </w:rPr>
+      </w:pPr>
+    </w:p>
+    <w:p>
+      <w:pPr>
+        <w:shd w:val="clear" w:color="auto" w:fill="23272E"/>
+        <w:bidi w:val="0"/>
+        <w:spacing w:after="0" w:line="285" w:lineRule="atLeast"/>
+        <w:rPr>
+          <w:rFonts w:eastAsia="Times New Roman" w:cs="Times New Roman"/>
+          <w:color w:val="ABB2BF"/>
+          <w:kern w:val="0"/>
+          <w:sz w:val="21"/>
+          <w:szCs w:val="21"/>
+          <w14:ligatures w14:val="none"/>
+        </w:rPr>
+      </w:pPr>
+      <w:r>
+        <w:rPr>
+          <w:rFonts w:eastAsia="Times New Roman" w:cs="Times New Roman"/>
+          <w:color w:val="ABB2BF"/>
+          <w:kern w:val="0"/>
+          <w:sz w:val="21"/>
+          <w:szCs w:val="21"/>
+          <w14:ligatures w14:val="none"/>
+        </w:rPr>
+        <w:t xml:space="preserve">        </w:t>
+      </w:r>
+      <w:r>
+        <w:rPr>
+          <w:rFonts w:eastAsia="Times New Roman" w:cs="Times New Roman"/>
+          <w:color w:val="E06C75"/>
+          <w:kern w:val="0"/>
+          <w:sz w:val="21"/>
+          <w:szCs w:val="21"/>
+          <w14:ligatures w14:val="none"/>
+        </w:rPr>
+        <w:t>trip_seat</w:t>
+      </w:r>
+      <w:r>
+        <w:rPr>
+          <w:rFonts w:eastAsia="Times New Roman" w:cs="Times New Roman"/>
+          <w:color w:val="ABB2BF"/>
+          <w:kern w:val="0"/>
+          <w:sz w:val="21"/>
+          <w:szCs w:val="21"/>
+          <w14:ligatures w14:val="none"/>
+        </w:rPr>
+        <w:t xml:space="preserve">.status </w:t>
+      </w:r>
+      <w:r>
+        <w:rPr>
+          <w:rFonts w:eastAsia="Times New Roman" w:cs="Times New Roman"/>
+          <w:color w:val="56B6C2"/>
+          <w:kern w:val="0"/>
+          <w:sz w:val="21"/>
+          <w:szCs w:val="21"/>
+          <w14:ligatures w14:val="none"/>
+        </w:rPr>
+        <w:t>=</w:t>
+      </w:r>
+      <w:r>
+        <w:rPr>
+          <w:rFonts w:eastAsia="Times New Roman" w:cs="Times New Roman"/>
+          <w:color w:val="ABB2BF"/>
+          <w:kern w:val="0"/>
+          <w:sz w:val="21"/>
+          <w:szCs w:val="21"/>
+          <w14:ligatures w14:val="none"/>
+        </w:rPr>
+        <w:t xml:space="preserve"> </w:t>
+      </w:r>
+      <w:r>
+        <w:rPr>
+          <w:rFonts w:eastAsia="Times New Roman" w:cs="Times New Roman"/>
+          <w:color w:val="E5C07B"/>
+          <w:kern w:val="0"/>
+          <w:sz w:val="21"/>
+          <w:szCs w:val="21"/>
+          <w14:ligatures w14:val="none"/>
+        </w:rPr>
+        <w:t>TripSeatModel</w:t>
+      </w:r>
+      <w:r>
+        <w:rPr>
+          <w:rFonts w:eastAsia="Times New Roman" w:cs="Times New Roman"/>
+          <w:color w:val="ABB2BF"/>
+          <w:kern w:val="0"/>
+          <w:sz w:val="21"/>
+          <w:szCs w:val="21"/>
+          <w14:ligatures w14:val="none"/>
+        </w:rPr>
+        <w:t>.</w:t>
+      </w:r>
+      <w:r>
+        <w:rPr>
+          <w:rFonts w:eastAsia="Times New Roman" w:cs="Times New Roman"/>
+          <w:color w:val="E5C07B"/>
+          <w:kern w:val="0"/>
+          <w:sz w:val="21"/>
+          <w:szCs w:val="21"/>
+          <w14:ligatures w14:val="none"/>
+        </w:rPr>
+        <w:t>TripSeatStatus</w:t>
+      </w:r>
+      <w:r>
+        <w:rPr>
+          <w:rFonts w:eastAsia="Times New Roman" w:cs="Times New Roman"/>
+          <w:color w:val="ABB2BF"/>
+          <w:kern w:val="0"/>
+          <w:sz w:val="21"/>
+          <w:szCs w:val="21"/>
+          <w14:ligatures w14:val="none"/>
+        </w:rPr>
+        <w:t>.</w:t>
+      </w:r>
+      <w:r>
+        <w:rPr>
+          <w:rFonts w:eastAsia="Times New Roman" w:cs="Times New Roman"/>
+          <w:color w:val="56B6C2"/>
+          <w:kern w:val="0"/>
+          <w:sz w:val="21"/>
+          <w:szCs w:val="21"/>
+          <w14:ligatures w14:val="none"/>
+        </w:rPr>
+        <w:t>BOOKED</w:t>
+      </w:r>
+    </w:p>
+    <w:p>
+      <w:pPr>
+        <w:shd w:val="clear" w:color="auto" w:fill="23272E"/>
+        <w:bidi w:val="0"/>
+        <w:spacing w:after="0" w:line="285" w:lineRule="atLeast"/>
+        <w:rPr>
+          <w:rFonts w:eastAsia="Times New Roman" w:cs="Times New Roman"/>
+          <w:color w:val="ABB2BF"/>
+          <w:kern w:val="0"/>
+          <w:sz w:val="21"/>
+          <w:szCs w:val="21"/>
+          <w14:ligatures w14:val="none"/>
+        </w:rPr>
+      </w:pPr>
+      <w:r>
+        <w:rPr>
+          <w:rFonts w:eastAsia="Times New Roman" w:cs="Times New Roman"/>
+          <w:color w:val="ABB2BF"/>
+          <w:kern w:val="0"/>
+          <w:sz w:val="21"/>
+          <w:szCs w:val="21"/>
+          <w14:ligatures w14:val="none"/>
+        </w:rPr>
+        <w:t xml:space="preserve">        </w:t>
+      </w:r>
+      <w:r>
+        <w:rPr>
+          <w:rFonts w:eastAsia="Times New Roman" w:cs="Times New Roman"/>
+          <w:color w:val="E06C75"/>
+          <w:kern w:val="0"/>
+          <w:sz w:val="21"/>
+          <w:szCs w:val="21"/>
+          <w14:ligatures w14:val="none"/>
+        </w:rPr>
+        <w:t>trip_seat</w:t>
+      </w:r>
+      <w:r>
+        <w:rPr>
+          <w:rFonts w:eastAsia="Times New Roman" w:cs="Times New Roman"/>
+          <w:color w:val="ABB2BF"/>
+          <w:kern w:val="0"/>
+          <w:sz w:val="21"/>
+          <w:szCs w:val="21"/>
+          <w14:ligatures w14:val="none"/>
+        </w:rPr>
+        <w:t>.</w:t>
+      </w:r>
+      <w:r>
+        <w:rPr>
+          <w:rFonts w:eastAsia="Times New Roman" w:cs="Times New Roman"/>
+          <w:color w:val="61AFEF"/>
+          <w:kern w:val="0"/>
+          <w:sz w:val="21"/>
+          <w:szCs w:val="21"/>
+          <w14:ligatures w14:val="none"/>
+        </w:rPr>
+        <w:t>save</w:t>
+      </w:r>
+      <w:r>
+        <w:rPr>
+          <w:rFonts w:eastAsia="Times New Roman" w:cs="Times New Roman"/>
+          <w:color w:val="ABB2BF"/>
+          <w:kern w:val="0"/>
+          <w:sz w:val="21"/>
+          <w:szCs w:val="21"/>
+          <w14:ligatures w14:val="none"/>
+        </w:rPr>
+        <w:t>()</w:t>
+      </w:r>
+    </w:p>
+    <w:p>
+      <w:pPr>
+        <w:shd w:val="clear" w:color="auto" w:fill="23272E"/>
+        <w:bidi w:val="0"/>
+        <w:spacing w:after="240" w:line="285" w:lineRule="atLeast"/>
+        <w:rPr>
+          <w:rFonts w:eastAsia="Times New Roman" w:cs="Times New Roman"/>
+          <w:color w:val="ABB2BF"/>
+          <w:kern w:val="0"/>
+          <w:sz w:val="21"/>
+          <w:szCs w:val="21"/>
+          <w14:ligatures w14:val="none"/>
+        </w:rPr>
+      </w:pPr>
+    </w:p>
+    <w:p>
+      <w:pPr>
+        <w:shd w:val="clear" w:color="auto" w:fill="23272E"/>
+        <w:bidi w:val="0"/>
+        <w:spacing w:after="0" w:line="285" w:lineRule="atLeast"/>
+        <w:rPr>
+          <w:rFonts w:eastAsia="Times New Roman" w:cs="Times New Roman"/>
+          <w:color w:val="ABB2BF"/>
+          <w:kern w:val="0"/>
+          <w:sz w:val="21"/>
+          <w:szCs w:val="21"/>
+          <w14:ligatures w14:val="none"/>
+        </w:rPr>
+      </w:pPr>
+      <w:r>
+        <w:rPr>
+          <w:rFonts w:eastAsia="Times New Roman" w:cs="Times New Roman"/>
+          <w:color w:val="ABB2BF"/>
+          <w:kern w:val="0"/>
+          <w:sz w:val="21"/>
+          <w:szCs w:val="21"/>
+          <w14:ligatures w14:val="none"/>
+        </w:rPr>
+        <w:t xml:space="preserve">    </w:t>
+      </w:r>
+      <w:r>
+        <w:rPr>
+          <w:rFonts w:eastAsia="Times New Roman" w:cs="Times New Roman"/>
+          <w:color w:val="C678DD"/>
+          <w:kern w:val="0"/>
+          <w:sz w:val="21"/>
+          <w:szCs w:val="21"/>
+          <w14:ligatures w14:val="none"/>
+        </w:rPr>
+        <w:t>return</w:t>
+      </w:r>
+      <w:r>
+        <w:rPr>
+          <w:rFonts w:eastAsia="Times New Roman" w:cs="Times New Roman"/>
+          <w:color w:val="ABB2BF"/>
+          <w:kern w:val="0"/>
+          <w:sz w:val="21"/>
+          <w:szCs w:val="21"/>
+          <w14:ligatures w14:val="none"/>
+        </w:rPr>
+        <w:t xml:space="preserve"> </w:t>
+      </w:r>
+      <w:r>
+        <w:rPr>
+          <w:rFonts w:eastAsia="Times New Roman" w:cs="Times New Roman"/>
+          <w:color w:val="E06C75"/>
+          <w:kern w:val="0"/>
+          <w:sz w:val="21"/>
+          <w:szCs w:val="21"/>
+          <w14:ligatures w14:val="none"/>
+        </w:rPr>
+        <w:t>order</w:t>
+      </w:r>
+    </w:p>
+    <w:p>
+      <w:pPr>
+        <w:rPr>
+          <w:lang w:bidi="fa-IR"/>
+        </w:rPr>
+      </w:pPr>
+      <w:r>
+        <w:rPr>
+          <w:rFonts w:hint="cs"/>
+          <w:rtl/>
+          <w:lang w:bidi="fa-IR"/>
+        </w:rPr>
+        <w:t xml:space="preserve">که ساخت </w:t>
+      </w:r>
+      <w:r>
+        <w:rPr>
+          <w:lang w:bidi="fa-IR"/>
+        </w:rPr>
+        <w:t>order</w:t>
+      </w:r>
+      <w:r>
+        <w:rPr>
+          <w:rFonts w:hint="cs"/>
+          <w:rtl/>
+          <w:lang w:bidi="fa-IR"/>
+        </w:rPr>
+        <w:t xml:space="preserve"> یا </w:t>
+      </w:r>
+      <w:r>
+        <w:rPr>
+          <w:lang w:bidi="fa-IR"/>
+        </w:rPr>
+        <w:t>ticket</w:t>
+      </w:r>
+      <w:r>
+        <w:rPr>
+          <w:rFonts w:hint="cs"/>
+          <w:rtl/>
+          <w:lang w:bidi="fa-IR"/>
+        </w:rPr>
+        <w:t xml:space="preserve"> باهم انجام میشه یا انجام نمیشه هیچ کدوم</w:t>
+      </w:r>
+    </w:p>
+    <w:p>
+      <w:pPr>
+        <w:rPr>
+          <w:lang w:bidi="fa-IR"/>
+        </w:rPr>
+      </w:pPr>
+    </w:p>
+    <w:p>
+      <w:pPr>
+        <w:rPr>
+          <w:rtl/>
+          <w:lang w:bidi="fa-IR"/>
+        </w:rPr>
+      </w:pPr>
+      <w:r>
+        <w:rPr>
+          <w:rFonts w:hint="cs"/>
+          <w:rtl/>
+          <w:lang w:bidi="fa-IR"/>
+        </w:rPr>
+        <w:t xml:space="preserve">حالا </w:t>
+      </w:r>
+      <w:r>
+        <w:rPr>
+          <w:lang w:bidi="fa-IR"/>
+        </w:rPr>
+        <w:t>select_update_for</w:t>
+      </w:r>
+      <w:r>
+        <w:rPr>
+          <w:rFonts w:hint="cs"/>
+          <w:rtl/>
+          <w:lang w:bidi="fa-IR"/>
+        </w:rPr>
+        <w:t xml:space="preserve"> چیه و کجا استفاده میشه؟</w:t>
+      </w:r>
+    </w:p>
+    <w:p>
+      <w:pPr>
+        <w:rPr>
+          <w:lang w:bidi="fa-IR"/>
+        </w:rPr>
+      </w:pPr>
+      <w:r>
+        <w:rPr>
+          <w:rFonts w:hint="cs"/>
+          <w:rtl/>
+          <w:lang w:bidi="fa-IR"/>
+        </w:rPr>
+        <w:t xml:space="preserve">این دقیقا وقتی توی </w:t>
+      </w:r>
+      <w:r>
+        <w:rPr>
+          <w:lang w:bidi="fa-IR"/>
+        </w:rPr>
+        <w:t>transaction.atomic</w:t>
+      </w:r>
+      <w:r>
+        <w:rPr>
+          <w:rFonts w:hint="cs"/>
+          <w:rtl/>
+          <w:lang w:bidi="fa-IR"/>
+        </w:rPr>
+        <w:t xml:space="preserve"> استفاده بشه باعث میشه دیتابیس روی لون رکورد ها قفل بشه تا کار نهایی بشه</w:t>
+      </w:r>
+    </w:p>
+    <w:p>
+      <w:pPr>
+        <w:rPr>
+          <w:rtl/>
+          <w:lang w:bidi="fa-IR"/>
+        </w:rPr>
+      </w:pPr>
+      <w:r>
+        <w:rPr>
+          <w:rFonts w:hint="cs"/>
+          <w:rtl/>
+          <w:lang w:bidi="fa-IR"/>
+        </w:rPr>
+        <w:t>برای مثال به این صورت استفاده میشه</w:t>
+      </w:r>
+    </w:p>
+    <w:p>
+      <w:pPr>
+        <w:shd w:val="clear" w:color="auto" w:fill="23272E"/>
+        <w:bidi w:val="0"/>
+        <w:spacing w:after="0" w:line="285" w:lineRule="atLeast"/>
+        <w:rPr>
+          <w:rFonts w:eastAsia="Times New Roman" w:cs="Times New Roman"/>
+          <w:color w:val="ABB2BF"/>
+          <w:kern w:val="0"/>
+          <w:sz w:val="21"/>
+          <w:szCs w:val="21"/>
+          <w14:ligatures w14:val="none"/>
+        </w:rPr>
+      </w:pPr>
+      <w:r>
+        <w:rPr>
+          <w:rFonts w:eastAsia="Times New Roman" w:cs="Times New Roman"/>
+          <w:color w:val="ABB2BF"/>
+          <w:kern w:val="0"/>
+          <w:sz w:val="21"/>
+          <w:szCs w:val="21"/>
+          <w14:ligatures w14:val="none"/>
+        </w:rPr>
+        <w:t xml:space="preserve">    </w:t>
+      </w:r>
+      <w:r>
+        <w:rPr>
+          <w:rFonts w:eastAsia="Times New Roman" w:cs="Times New Roman"/>
+          <w:color w:val="E06C75"/>
+          <w:kern w:val="0"/>
+          <w:sz w:val="21"/>
+          <w:szCs w:val="21"/>
+          <w14:ligatures w14:val="none"/>
+        </w:rPr>
+        <w:t>locked_tripseats</w:t>
+      </w:r>
+      <w:r>
+        <w:rPr>
+          <w:rFonts w:eastAsia="Times New Roman" w:cs="Times New Roman"/>
+          <w:color w:val="ABB2BF"/>
+          <w:kern w:val="0"/>
+          <w:sz w:val="21"/>
+          <w:szCs w:val="21"/>
+          <w14:ligatures w14:val="none"/>
+        </w:rPr>
+        <w:t xml:space="preserve"> </w:t>
+      </w:r>
+      <w:r>
+        <w:rPr>
+          <w:rFonts w:eastAsia="Times New Roman" w:cs="Times New Roman"/>
+          <w:color w:val="56B6C2"/>
+          <w:kern w:val="0"/>
+          <w:sz w:val="21"/>
+          <w:szCs w:val="21"/>
+          <w14:ligatures w14:val="none"/>
+        </w:rPr>
+        <w:t>=</w:t>
+      </w:r>
+      <w:r>
+        <w:rPr>
+          <w:rFonts w:eastAsia="Times New Roman" w:cs="Times New Roman"/>
+          <w:color w:val="ABB2BF"/>
+          <w:kern w:val="0"/>
+          <w:sz w:val="21"/>
+          <w:szCs w:val="21"/>
+          <w14:ligatures w14:val="none"/>
+        </w:rPr>
+        <w:t xml:space="preserve"> (</w:t>
+      </w:r>
+      <w:r>
+        <w:rPr>
+          <w:rFonts w:eastAsia="Times New Roman" w:cs="Times New Roman"/>
+          <w:color w:val="E5C07B"/>
+          <w:kern w:val="0"/>
+          <w:sz w:val="21"/>
+          <w:szCs w:val="21"/>
+          <w14:ligatures w14:val="none"/>
+        </w:rPr>
+        <w:t>TripSeatModel</w:t>
+      </w:r>
+      <w:r>
+        <w:rPr>
+          <w:rFonts w:eastAsia="Times New Roman" w:cs="Times New Roman"/>
+          <w:color w:val="ABB2BF"/>
+          <w:kern w:val="0"/>
+          <w:sz w:val="21"/>
+          <w:szCs w:val="21"/>
+          <w14:ligatures w14:val="none"/>
+        </w:rPr>
+        <w:t>.</w:t>
+      </w:r>
+      <w:r>
+        <w:rPr>
+          <w:rFonts w:eastAsia="Times New Roman" w:cs="Times New Roman"/>
+          <w:color w:val="E06C75"/>
+          <w:kern w:val="0"/>
+          <w:sz w:val="21"/>
+          <w:szCs w:val="21"/>
+          <w14:ligatures w14:val="none"/>
+        </w:rPr>
+        <w:t>objects</w:t>
+      </w:r>
+    </w:p>
+    <w:p>
+      <w:pPr>
+        <w:shd w:val="clear" w:color="auto" w:fill="23272E"/>
+        <w:bidi w:val="0"/>
+        <w:spacing w:after="0" w:line="285" w:lineRule="atLeast"/>
+        <w:rPr>
+          <w:rFonts w:eastAsia="Times New Roman" w:cs="Times New Roman"/>
+          <w:color w:val="ABB2BF"/>
+          <w:kern w:val="0"/>
+          <w:sz w:val="21"/>
+          <w:szCs w:val="21"/>
+          <w14:ligatures w14:val="none"/>
+        </w:rPr>
+      </w:pPr>
+      <w:r>
+        <w:rPr>
+          <w:rFonts w:eastAsia="Times New Roman" w:cs="Times New Roman"/>
+          <w:color w:val="ABB2BF"/>
+          <w:kern w:val="0"/>
+          <w:sz w:val="21"/>
+          <w:szCs w:val="21"/>
+          <w14:ligatures w14:val="none"/>
+        </w:rPr>
+        <w:t>                        .</w:t>
+      </w:r>
+      <w:r>
+        <w:rPr>
+          <w:rFonts w:eastAsia="Times New Roman" w:cs="Times New Roman"/>
+          <w:color w:val="61AFEF"/>
+          <w:kern w:val="0"/>
+          <w:sz w:val="21"/>
+          <w:szCs w:val="21"/>
+          <w14:ligatures w14:val="none"/>
+        </w:rPr>
+        <w:t>select_for_update</w:t>
+      </w:r>
+      <w:r>
+        <w:rPr>
+          <w:rFonts w:eastAsia="Times New Roman" w:cs="Times New Roman"/>
+          <w:color w:val="ABB2BF"/>
+          <w:kern w:val="0"/>
+          <w:sz w:val="21"/>
+          <w:szCs w:val="21"/>
+          <w14:ligatures w14:val="none"/>
+        </w:rPr>
+        <w:t>()</w:t>
+      </w:r>
+    </w:p>
+    <w:p>
+      <w:pPr>
+        <w:shd w:val="clear" w:color="auto" w:fill="23272E"/>
+        <w:bidi w:val="0"/>
+        <w:spacing w:after="0" w:line="285" w:lineRule="atLeast"/>
+        <w:rPr>
+          <w:rFonts w:eastAsia="Times New Roman" w:cs="Times New Roman"/>
+          <w:color w:val="ABB2BF"/>
+          <w:kern w:val="0"/>
+          <w:sz w:val="21"/>
+          <w:szCs w:val="21"/>
+          <w14:ligatures w14:val="none"/>
+        </w:rPr>
+      </w:pPr>
+      <w:r>
+        <w:rPr>
+          <w:rFonts w:eastAsia="Times New Roman" w:cs="Times New Roman"/>
+          <w:color w:val="ABB2BF"/>
+          <w:kern w:val="0"/>
+          <w:sz w:val="21"/>
+          <w:szCs w:val="21"/>
+          <w14:ligatures w14:val="none"/>
+        </w:rPr>
+        <w:t>                        .</w:t>
+      </w:r>
+      <w:r>
+        <w:rPr>
+          <w:rFonts w:eastAsia="Times New Roman" w:cs="Times New Roman"/>
+          <w:color w:val="61AFEF"/>
+          <w:kern w:val="0"/>
+          <w:sz w:val="21"/>
+          <w:szCs w:val="21"/>
+          <w14:ligatures w14:val="none"/>
+        </w:rPr>
+        <w:t>filter</w:t>
+      </w:r>
+      <w:r>
+        <w:rPr>
+          <w:rFonts w:eastAsia="Times New Roman" w:cs="Times New Roman"/>
+          <w:color w:val="ABB2BF"/>
+          <w:kern w:val="0"/>
+          <w:sz w:val="21"/>
+          <w:szCs w:val="21"/>
+          <w14:ligatures w14:val="none"/>
+        </w:rPr>
+        <w:t>(</w:t>
+      </w:r>
+      <w:r>
+        <w:rPr>
+          <w:rFonts w:eastAsia="Times New Roman" w:cs="Times New Roman"/>
+          <w:color w:val="E06C75"/>
+          <w:kern w:val="0"/>
+          <w:sz w:val="21"/>
+          <w:szCs w:val="21"/>
+          <w14:ligatures w14:val="none"/>
+        </w:rPr>
+        <w:t>id__in</w:t>
+      </w:r>
+      <w:r>
+        <w:rPr>
+          <w:rFonts w:eastAsia="Times New Roman" w:cs="Times New Roman"/>
+          <w:color w:val="56B6C2"/>
+          <w:kern w:val="0"/>
+          <w:sz w:val="21"/>
+          <w:szCs w:val="21"/>
+          <w14:ligatures w14:val="none"/>
+        </w:rPr>
+        <w:t>=</w:t>
+      </w:r>
+      <w:r>
+        <w:rPr>
+          <w:rFonts w:eastAsia="Times New Roman" w:cs="Times New Roman"/>
+          <w:color w:val="ABB2BF"/>
+          <w:kern w:val="0"/>
+          <w:sz w:val="21"/>
+          <w:szCs w:val="21"/>
+          <w14:ligatures w14:val="none"/>
+        </w:rPr>
+        <w:t>[</w:t>
+      </w:r>
+      <w:r>
+        <w:rPr>
+          <w:rFonts w:eastAsia="Times New Roman" w:cs="Times New Roman"/>
+          <w:color w:val="E06C75"/>
+          <w:kern w:val="0"/>
+          <w:sz w:val="21"/>
+          <w:szCs w:val="21"/>
+          <w14:ligatures w14:val="none"/>
+        </w:rPr>
+        <w:t>seat</w:t>
+      </w:r>
+      <w:r>
+        <w:rPr>
+          <w:rFonts w:eastAsia="Times New Roman" w:cs="Times New Roman"/>
+          <w:color w:val="ABB2BF"/>
+          <w:kern w:val="0"/>
+          <w:sz w:val="21"/>
+          <w:szCs w:val="21"/>
+          <w14:ligatures w14:val="none"/>
+        </w:rPr>
+        <w:t xml:space="preserve">.id </w:t>
+      </w:r>
+      <w:r>
+        <w:rPr>
+          <w:rFonts w:eastAsia="Times New Roman" w:cs="Times New Roman"/>
+          <w:color w:val="C678DD"/>
+          <w:kern w:val="0"/>
+          <w:sz w:val="21"/>
+          <w:szCs w:val="21"/>
+          <w14:ligatures w14:val="none"/>
+        </w:rPr>
+        <w:t>for</w:t>
+      </w:r>
+      <w:r>
+        <w:rPr>
+          <w:rFonts w:eastAsia="Times New Roman" w:cs="Times New Roman"/>
+          <w:color w:val="ABB2BF"/>
+          <w:kern w:val="0"/>
+          <w:sz w:val="21"/>
+          <w:szCs w:val="21"/>
+          <w14:ligatures w14:val="none"/>
+        </w:rPr>
+        <w:t xml:space="preserve"> </w:t>
+      </w:r>
+      <w:r>
+        <w:rPr>
+          <w:rFonts w:eastAsia="Times New Roman" w:cs="Times New Roman"/>
+          <w:color w:val="E06C75"/>
+          <w:kern w:val="0"/>
+          <w:sz w:val="21"/>
+          <w:szCs w:val="21"/>
+          <w14:ligatures w14:val="none"/>
+        </w:rPr>
+        <w:t>seat</w:t>
+      </w:r>
+      <w:r>
+        <w:rPr>
+          <w:rFonts w:eastAsia="Times New Roman" w:cs="Times New Roman"/>
+          <w:color w:val="ABB2BF"/>
+          <w:kern w:val="0"/>
+          <w:sz w:val="21"/>
+          <w:szCs w:val="21"/>
+          <w14:ligatures w14:val="none"/>
+        </w:rPr>
+        <w:t xml:space="preserve"> </w:t>
+      </w:r>
+      <w:r>
+        <w:rPr>
+          <w:rFonts w:eastAsia="Times New Roman" w:cs="Times New Roman"/>
+          <w:color w:val="C678DD"/>
+          <w:kern w:val="0"/>
+          <w:sz w:val="21"/>
+          <w:szCs w:val="21"/>
+          <w14:ligatures w14:val="none"/>
+        </w:rPr>
+        <w:t>in</w:t>
+      </w:r>
+      <w:r>
+        <w:rPr>
+          <w:rFonts w:eastAsia="Times New Roman" w:cs="Times New Roman"/>
+          <w:color w:val="ABB2BF"/>
+          <w:kern w:val="0"/>
+          <w:sz w:val="21"/>
+          <w:szCs w:val="21"/>
+          <w14:ligatures w14:val="none"/>
+        </w:rPr>
+        <w:t xml:space="preserve"> </w:t>
+      </w:r>
+      <w:r>
+        <w:rPr>
+          <w:rFonts w:eastAsia="Times New Roman" w:cs="Times New Roman"/>
+          <w:color w:val="E06C75"/>
+          <w:kern w:val="0"/>
+          <w:sz w:val="21"/>
+          <w:szCs w:val="21"/>
+          <w14:ligatures w14:val="none"/>
+        </w:rPr>
+        <w:t>trip_seats</w:t>
+      </w:r>
+      <w:r>
+        <w:rPr>
+          <w:rFonts w:eastAsia="Times New Roman" w:cs="Times New Roman"/>
+          <w:color w:val="ABB2BF"/>
+          <w:kern w:val="0"/>
+          <w:sz w:val="21"/>
+          <w:szCs w:val="21"/>
+          <w14:ligatures w14:val="none"/>
+        </w:rPr>
+        <w:t>])</w:t>
+      </w:r>
+    </w:p>
+    <w:p>
+      <w:pPr>
+        <w:shd w:val="clear" w:color="auto" w:fill="23272E"/>
+        <w:bidi w:val="0"/>
+        <w:spacing w:after="0" w:line="285" w:lineRule="atLeast"/>
+        <w:rPr>
+          <w:rFonts w:eastAsia="Times New Roman" w:cs="Times New Roman"/>
+          <w:color w:val="ABB2BF"/>
+          <w:kern w:val="0"/>
+          <w:sz w:val="21"/>
+          <w:szCs w:val="21"/>
+          <w14:ligatures w14:val="none"/>
+        </w:rPr>
+      </w:pPr>
+      <w:r>
+        <w:rPr>
+          <w:rFonts w:eastAsia="Times New Roman" w:cs="Times New Roman"/>
+          <w:color w:val="ABB2BF"/>
+          <w:kern w:val="0"/>
+          <w:sz w:val="21"/>
+          <w:szCs w:val="21"/>
+          <w14:ligatures w14:val="none"/>
+        </w:rPr>
+        <w:t>                        )</w:t>
+      </w:r>
+    </w:p>
+    <w:p>
+      <w:pPr>
+        <w:shd w:val="clear" w:color="auto" w:fill="23272E"/>
+        <w:bidi w:val="0"/>
+        <w:spacing w:after="0" w:line="285" w:lineRule="atLeast"/>
+        <w:rPr>
+          <w:rFonts w:eastAsia="Times New Roman" w:cs="Times New Roman"/>
+          <w:color w:val="ABB2BF"/>
+          <w:kern w:val="0"/>
+          <w:sz w:val="21"/>
+          <w:szCs w:val="21"/>
+          <w14:ligatures w14:val="none"/>
+        </w:rPr>
+      </w:pPr>
+    </w:p>
+    <w:p>
+      <w:pPr>
+        <w:shd w:val="clear" w:color="auto" w:fill="23272E"/>
+        <w:bidi w:val="0"/>
+        <w:spacing w:after="0" w:line="285" w:lineRule="atLeast"/>
+        <w:rPr>
+          <w:rFonts w:eastAsia="Times New Roman" w:cs="Times New Roman"/>
+          <w:color w:val="ABB2BF"/>
+          <w:kern w:val="0"/>
+          <w:sz w:val="21"/>
+          <w:szCs w:val="21"/>
+          <w14:ligatures w14:val="none"/>
+        </w:rPr>
+      </w:pPr>
+      <w:r>
+        <w:rPr>
+          <w:rFonts w:eastAsia="Times New Roman" w:cs="Times New Roman"/>
+          <w:color w:val="ABB2BF"/>
+          <w:kern w:val="0"/>
+          <w:sz w:val="21"/>
+          <w:szCs w:val="21"/>
+          <w14:ligatures w14:val="none"/>
+        </w:rPr>
+        <w:t xml:space="preserve">    </w:t>
+      </w:r>
+      <w:r>
+        <w:rPr>
+          <w:rFonts w:eastAsia="Times New Roman" w:cs="Times New Roman"/>
+          <w:color w:val="C678DD"/>
+          <w:kern w:val="0"/>
+          <w:sz w:val="21"/>
+          <w:szCs w:val="21"/>
+          <w14:ligatures w14:val="none"/>
+        </w:rPr>
+        <w:t>for</w:t>
+      </w:r>
+      <w:r>
+        <w:rPr>
+          <w:rFonts w:eastAsia="Times New Roman" w:cs="Times New Roman"/>
+          <w:color w:val="ABB2BF"/>
+          <w:kern w:val="0"/>
+          <w:sz w:val="21"/>
+          <w:szCs w:val="21"/>
+          <w14:ligatures w14:val="none"/>
+        </w:rPr>
+        <w:t xml:space="preserve"> </w:t>
+      </w:r>
+      <w:r>
+        <w:rPr>
+          <w:rFonts w:eastAsia="Times New Roman" w:cs="Times New Roman"/>
+          <w:color w:val="E06C75"/>
+          <w:kern w:val="0"/>
+          <w:sz w:val="21"/>
+          <w:szCs w:val="21"/>
+          <w14:ligatures w14:val="none"/>
+        </w:rPr>
+        <w:t>seat</w:t>
+      </w:r>
+      <w:r>
+        <w:rPr>
+          <w:rFonts w:eastAsia="Times New Roman" w:cs="Times New Roman"/>
+          <w:color w:val="ABB2BF"/>
+          <w:kern w:val="0"/>
+          <w:sz w:val="21"/>
+          <w:szCs w:val="21"/>
+          <w14:ligatures w14:val="none"/>
+        </w:rPr>
+        <w:t xml:space="preserve"> </w:t>
+      </w:r>
+      <w:r>
+        <w:rPr>
+          <w:rFonts w:eastAsia="Times New Roman" w:cs="Times New Roman"/>
+          <w:color w:val="56B6C2"/>
+          <w:kern w:val="0"/>
+          <w:sz w:val="21"/>
+          <w:szCs w:val="21"/>
+          <w14:ligatures w14:val="none"/>
+        </w:rPr>
+        <w:t>in</w:t>
+      </w:r>
+      <w:r>
+        <w:rPr>
+          <w:rFonts w:eastAsia="Times New Roman" w:cs="Times New Roman"/>
+          <w:color w:val="ABB2BF"/>
+          <w:kern w:val="0"/>
+          <w:sz w:val="21"/>
+          <w:szCs w:val="21"/>
+          <w14:ligatures w14:val="none"/>
+        </w:rPr>
+        <w:t xml:space="preserve"> </w:t>
+      </w:r>
+      <w:r>
+        <w:rPr>
+          <w:rFonts w:eastAsia="Times New Roman" w:cs="Times New Roman"/>
+          <w:color w:val="E06C75"/>
+          <w:kern w:val="0"/>
+          <w:sz w:val="21"/>
+          <w:szCs w:val="21"/>
+          <w14:ligatures w14:val="none"/>
+        </w:rPr>
+        <w:t>locked_tripseats</w:t>
+      </w:r>
+      <w:r>
+        <w:rPr>
+          <w:rFonts w:eastAsia="Times New Roman" w:cs="Times New Roman"/>
+          <w:color w:val="ABB2BF"/>
+          <w:kern w:val="0"/>
+          <w:sz w:val="21"/>
+          <w:szCs w:val="21"/>
+          <w14:ligatures w14:val="none"/>
+        </w:rPr>
+        <w:t>:</w:t>
+      </w:r>
+    </w:p>
+    <w:p>
+      <w:pPr>
+        <w:shd w:val="clear" w:color="auto" w:fill="23272E"/>
+        <w:bidi w:val="0"/>
+        <w:spacing w:after="0" w:line="285" w:lineRule="atLeast"/>
+        <w:rPr>
+          <w:rFonts w:eastAsia="Times New Roman" w:cs="Times New Roman"/>
+          <w:color w:val="ABB2BF"/>
+          <w:kern w:val="0"/>
+          <w:sz w:val="21"/>
+          <w:szCs w:val="21"/>
+          <w14:ligatures w14:val="none"/>
+        </w:rPr>
+      </w:pPr>
+      <w:r>
+        <w:rPr>
+          <w:rFonts w:eastAsia="Times New Roman" w:cs="Times New Roman"/>
+          <w:color w:val="ABB2BF"/>
+          <w:kern w:val="0"/>
+          <w:sz w:val="21"/>
+          <w:szCs w:val="21"/>
+          <w14:ligatures w14:val="none"/>
+        </w:rPr>
+        <w:t xml:space="preserve">        </w:t>
+      </w:r>
+      <w:r>
+        <w:rPr>
+          <w:rFonts w:eastAsia="Times New Roman" w:cs="Times New Roman"/>
+          <w:color w:val="C678DD"/>
+          <w:kern w:val="0"/>
+          <w:sz w:val="21"/>
+          <w:szCs w:val="21"/>
+          <w14:ligatures w14:val="none"/>
+        </w:rPr>
+        <w:t>if</w:t>
+      </w:r>
+      <w:r>
+        <w:rPr>
+          <w:rFonts w:eastAsia="Times New Roman" w:cs="Times New Roman"/>
+          <w:color w:val="ABB2BF"/>
+          <w:kern w:val="0"/>
+          <w:sz w:val="21"/>
+          <w:szCs w:val="21"/>
+          <w14:ligatures w14:val="none"/>
+        </w:rPr>
+        <w:t xml:space="preserve"> </w:t>
+      </w:r>
+      <w:r>
+        <w:rPr>
+          <w:rFonts w:eastAsia="Times New Roman" w:cs="Times New Roman"/>
+          <w:color w:val="E06C75"/>
+          <w:kern w:val="0"/>
+          <w:sz w:val="21"/>
+          <w:szCs w:val="21"/>
+          <w14:ligatures w14:val="none"/>
+        </w:rPr>
+        <w:t>seat</w:t>
+      </w:r>
+      <w:r>
+        <w:rPr>
+          <w:rFonts w:eastAsia="Times New Roman" w:cs="Times New Roman"/>
+          <w:color w:val="ABB2BF"/>
+          <w:kern w:val="0"/>
+          <w:sz w:val="21"/>
+          <w:szCs w:val="21"/>
+          <w14:ligatures w14:val="none"/>
+        </w:rPr>
+        <w:t>.</w:t>
+      </w:r>
+      <w:r>
+        <w:rPr>
+          <w:rFonts w:eastAsia="Times New Roman" w:cs="Times New Roman"/>
+          <w:color w:val="E06C75"/>
+          <w:kern w:val="0"/>
+          <w:sz w:val="21"/>
+          <w:szCs w:val="21"/>
+          <w14:ligatures w14:val="none"/>
+        </w:rPr>
+        <w:t>status</w:t>
+      </w:r>
+      <w:r>
+        <w:rPr>
+          <w:rFonts w:eastAsia="Times New Roman" w:cs="Times New Roman"/>
+          <w:color w:val="ABB2BF"/>
+          <w:kern w:val="0"/>
+          <w:sz w:val="21"/>
+          <w:szCs w:val="21"/>
+          <w14:ligatures w14:val="none"/>
+        </w:rPr>
+        <w:t xml:space="preserve"> </w:t>
+      </w:r>
+      <w:r>
+        <w:rPr>
+          <w:rFonts w:eastAsia="Times New Roman" w:cs="Times New Roman"/>
+          <w:color w:val="56B6C2"/>
+          <w:kern w:val="0"/>
+          <w:sz w:val="21"/>
+          <w:szCs w:val="21"/>
+          <w14:ligatures w14:val="none"/>
+        </w:rPr>
+        <w:t>!=</w:t>
+      </w:r>
+      <w:r>
+        <w:rPr>
+          <w:rFonts w:eastAsia="Times New Roman" w:cs="Times New Roman"/>
+          <w:color w:val="ABB2BF"/>
+          <w:kern w:val="0"/>
+          <w:sz w:val="21"/>
+          <w:szCs w:val="21"/>
+          <w14:ligatures w14:val="none"/>
+        </w:rPr>
+        <w:t xml:space="preserve"> </w:t>
+      </w:r>
+      <w:r>
+        <w:rPr>
+          <w:rFonts w:eastAsia="Times New Roman" w:cs="Times New Roman"/>
+          <w:color w:val="E5C07B"/>
+          <w:kern w:val="0"/>
+          <w:sz w:val="21"/>
+          <w:szCs w:val="21"/>
+          <w14:ligatures w14:val="none"/>
+        </w:rPr>
+        <w:t>TripSeatModel</w:t>
+      </w:r>
+      <w:r>
+        <w:rPr>
+          <w:rFonts w:eastAsia="Times New Roman" w:cs="Times New Roman"/>
+          <w:color w:val="ABB2BF"/>
+          <w:kern w:val="0"/>
+          <w:sz w:val="21"/>
+          <w:szCs w:val="21"/>
+          <w14:ligatures w14:val="none"/>
+        </w:rPr>
+        <w:t>.</w:t>
+      </w:r>
+      <w:r>
+        <w:rPr>
+          <w:rFonts w:eastAsia="Times New Roman" w:cs="Times New Roman"/>
+          <w:color w:val="E5C07B"/>
+          <w:kern w:val="0"/>
+          <w:sz w:val="21"/>
+          <w:szCs w:val="21"/>
+          <w14:ligatures w14:val="none"/>
+        </w:rPr>
+        <w:t>TripSeatStatus</w:t>
+      </w:r>
+      <w:r>
+        <w:rPr>
+          <w:rFonts w:eastAsia="Times New Roman" w:cs="Times New Roman"/>
+          <w:color w:val="ABB2BF"/>
+          <w:kern w:val="0"/>
+          <w:sz w:val="21"/>
+          <w:szCs w:val="21"/>
+          <w14:ligatures w14:val="none"/>
+        </w:rPr>
+        <w:t>.</w:t>
+      </w:r>
+      <w:r>
+        <w:rPr>
+          <w:rFonts w:eastAsia="Times New Roman" w:cs="Times New Roman"/>
+          <w:color w:val="56B6C2"/>
+          <w:kern w:val="0"/>
+          <w:sz w:val="21"/>
+          <w:szCs w:val="21"/>
+          <w14:ligatures w14:val="none"/>
+        </w:rPr>
+        <w:t>AVAILABLE</w:t>
+      </w:r>
+      <w:r>
+        <w:rPr>
+          <w:rFonts w:eastAsia="Times New Roman" w:cs="Times New Roman"/>
+          <w:color w:val="ABB2BF"/>
+          <w:kern w:val="0"/>
+          <w:sz w:val="21"/>
+          <w:szCs w:val="21"/>
+          <w14:ligatures w14:val="none"/>
+        </w:rPr>
+        <w:t>:</w:t>
+      </w:r>
+    </w:p>
+    <w:p>
+      <w:pPr>
+        <w:shd w:val="clear" w:color="auto" w:fill="23272E"/>
+        <w:bidi w:val="0"/>
+        <w:spacing w:after="0" w:line="285" w:lineRule="atLeast"/>
+        <w:rPr>
+          <w:rFonts w:eastAsia="Times New Roman" w:cs="Times New Roman"/>
+          <w:color w:val="ABB2BF"/>
+          <w:kern w:val="0"/>
+          <w:sz w:val="21"/>
+          <w:szCs w:val="21"/>
+          <w14:ligatures w14:val="none"/>
+        </w:rPr>
+      </w:pPr>
+    </w:p>
+    <w:p>
+      <w:pPr>
+        <w:shd w:val="clear" w:color="auto" w:fill="23272E"/>
+        <w:bidi w:val="0"/>
+        <w:spacing w:after="0" w:line="285" w:lineRule="atLeast"/>
+        <w:rPr>
+          <w:rFonts w:eastAsia="Times New Roman" w:cs="Times New Roman"/>
+          <w:color w:val="ABB2BF"/>
+          <w:kern w:val="0"/>
+          <w:sz w:val="21"/>
+          <w:szCs w:val="21"/>
+          <w14:ligatures w14:val="none"/>
+        </w:rPr>
+      </w:pPr>
+      <w:r>
+        <w:rPr>
+          <w:rFonts w:eastAsia="Times New Roman" w:cs="Times New Roman"/>
+          <w:color w:val="ABB2BF"/>
+          <w:kern w:val="0"/>
+          <w:sz w:val="21"/>
+          <w:szCs w:val="21"/>
+          <w14:ligatures w14:val="none"/>
+        </w:rPr>
+        <w:t xml:space="preserve">            </w:t>
+      </w:r>
+      <w:r>
+        <w:rPr>
+          <w:rFonts w:eastAsia="Times New Roman" w:cs="Times New Roman"/>
+          <w:color w:val="C678DD"/>
+          <w:kern w:val="0"/>
+          <w:sz w:val="21"/>
+          <w:szCs w:val="21"/>
+          <w14:ligatures w14:val="none"/>
+        </w:rPr>
+        <w:t>raise</w:t>
+      </w:r>
+      <w:r>
+        <w:rPr>
+          <w:rFonts w:eastAsia="Times New Roman" w:cs="Times New Roman"/>
+          <w:color w:val="ABB2BF"/>
+          <w:kern w:val="0"/>
+          <w:sz w:val="21"/>
+          <w:szCs w:val="21"/>
+          <w14:ligatures w14:val="none"/>
+        </w:rPr>
+        <w:t xml:space="preserve"> </w:t>
+      </w:r>
+      <w:r>
+        <w:rPr>
+          <w:rFonts w:eastAsia="Times New Roman" w:cs="Times New Roman"/>
+          <w:color w:val="E5C07B"/>
+          <w:kern w:val="0"/>
+          <w:sz w:val="21"/>
+          <w:szCs w:val="21"/>
+          <w14:ligatures w14:val="none"/>
+        </w:rPr>
+        <w:t>ValidationError</w:t>
+      </w:r>
+      <w:r>
+        <w:rPr>
+          <w:rFonts w:eastAsia="Times New Roman" w:cs="Times New Roman"/>
+          <w:color w:val="ABB2BF"/>
+          <w:kern w:val="0"/>
+          <w:sz w:val="21"/>
+          <w:szCs w:val="21"/>
+          <w14:ligatures w14:val="none"/>
+        </w:rPr>
+        <w:t>(</w:t>
+      </w:r>
+      <w:r>
+        <w:rPr>
+          <w:rFonts w:eastAsia="Times New Roman" w:cs="Times New Roman"/>
+          <w:color w:val="C678DD"/>
+          <w:kern w:val="0"/>
+          <w:sz w:val="21"/>
+          <w:szCs w:val="21"/>
+          <w14:ligatures w14:val="none"/>
+        </w:rPr>
+        <w:t>f</w:t>
+      </w:r>
+      <w:r>
+        <w:rPr>
+          <w:rFonts w:eastAsia="Times New Roman" w:cs="Times New Roman"/>
+          <w:color w:val="98C379"/>
+          <w:kern w:val="0"/>
+          <w:sz w:val="21"/>
+          <w:szCs w:val="21"/>
+          <w14:ligatures w14:val="none"/>
+        </w:rPr>
+        <w:t xml:space="preserve">"Seat number </w:t>
+      </w:r>
+      <w:r>
+        <w:rPr>
+          <w:rFonts w:eastAsia="Times New Roman" w:cs="Times New Roman"/>
+          <w:color w:val="D19A66"/>
+          <w:kern w:val="0"/>
+          <w:sz w:val="21"/>
+          <w:szCs w:val="21"/>
+          <w14:ligatures w14:val="none"/>
+        </w:rPr>
+        <w:t>{</w:t>
+      </w:r>
+      <w:r>
+        <w:rPr>
+          <w:rFonts w:eastAsia="Times New Roman" w:cs="Times New Roman"/>
+          <w:color w:val="E06C75"/>
+          <w:kern w:val="0"/>
+          <w:sz w:val="21"/>
+          <w:szCs w:val="21"/>
+          <w14:ligatures w14:val="none"/>
+        </w:rPr>
+        <w:t>seat</w:t>
+      </w:r>
+      <w:r>
+        <w:rPr>
+          <w:rFonts w:eastAsia="Times New Roman" w:cs="Times New Roman"/>
+          <w:color w:val="ABB2BF"/>
+          <w:kern w:val="0"/>
+          <w:sz w:val="21"/>
+          <w:szCs w:val="21"/>
+          <w14:ligatures w14:val="none"/>
+        </w:rPr>
+        <w:t>.seat_number</w:t>
+      </w:r>
+      <w:r>
+        <w:rPr>
+          <w:rFonts w:eastAsia="Times New Roman" w:cs="Times New Roman"/>
+          <w:color w:val="D19A66"/>
+          <w:kern w:val="0"/>
+          <w:sz w:val="21"/>
+          <w:szCs w:val="21"/>
+          <w14:ligatures w14:val="none"/>
+        </w:rPr>
+        <w:t>}</w:t>
+      </w:r>
+      <w:r>
+        <w:rPr>
+          <w:rFonts w:eastAsia="Times New Roman" w:cs="Times New Roman"/>
+          <w:color w:val="98C379"/>
+          <w:kern w:val="0"/>
+          <w:sz w:val="21"/>
+          <w:szCs w:val="21"/>
+          <w14:ligatures w14:val="none"/>
+        </w:rPr>
+        <w:t xml:space="preserve"> is already reserved or inactive."</w:t>
+      </w:r>
+      <w:r>
+        <w:rPr>
+          <w:rFonts w:eastAsia="Times New Roman" w:cs="Times New Roman"/>
+          <w:color w:val="ABB2BF"/>
+          <w:kern w:val="0"/>
+          <w:sz w:val="21"/>
+          <w:szCs w:val="21"/>
+          <w14:ligatures w14:val="none"/>
+        </w:rPr>
+        <w:t>)</w:t>
+      </w:r>
+    </w:p>
+    <w:p>
+      <w:pPr>
+        <w:rPr>
+          <w:rFonts w:hint="cs"/>
+          <w:rtl/>
+          <w:lang w:bidi="fa-IR"/>
+        </w:rPr>
+      </w:pPr>
+      <w:r>
+        <w:rPr>
+          <w:rFonts w:hint="cs"/>
+          <w:rtl/>
+          <w:lang w:bidi="fa-IR"/>
+        </w:rPr>
+        <w:lastRenderedPageBreak/>
+        <w:t xml:space="preserve">برای این پروژه هم درسته ما داریم داده هارو از سریالایزر میگییریم ولی بهتره که همون داده های پاس داده شده را دوباره از دیتابیس بگیریم تا این وسط </w:t>
+      </w:r>
+      <w:r>
+        <w:rPr>
+          <w:lang w:bidi="fa-IR"/>
+        </w:rPr>
+        <w:t>race condition</w:t>
+      </w:r>
+      <w:r>
+        <w:rPr>
+          <w:rFonts w:hint="cs"/>
+          <w:rtl/>
+          <w:lang w:bidi="fa-IR"/>
+        </w:rPr>
+        <w:t xml:space="preserve"> اتفاق نیوفته</w:t>
+      </w:r>
     </w:p>
     <w:sectPr>
       <w:pgSz w:w="12240" w:h="15840"/>
@@ -20398,7 +23661,7 @@
 </file>
 
 <file path=word/endnotes.xml><?xml version="1.0" encoding="utf-8"?>
-<w:endnotes xmlns:wpc="http://schemas.microsoft.com/office/word/2010/wordprocessingCanvas" xmlns:cx="http://schemas.microsoft.com/office/drawing/2014/chartex" xmlns:cx1="http://schemas.microsoft.com/office/drawing/2015/9/8/chartex" xmlns:cx2="http://schemas.microsoft.com/office/drawing/2015/10/21/chartex" xmlns:cx3="http://schemas.microsoft.com/office/drawing/2016/5/9/chartex" xmlns:cx4="http://schemas.microsoft.com/office/drawing/2016/5/10/chartex" xmlns:cx5="http://schemas.microsoft.com/office/drawing/2016/5/11/chartex" xmlns:cx6="http://schemas.microsoft.com/office/drawing/2016/5/12/chartex" xmlns:cx7="http://schemas.microsoft.com/office/drawing/2016/5/13/chartex" xmlns:cx8="http://schemas.microsoft.com/office/drawing/2016/5/14/chartex" xmlns:mc="http://schemas.openxmlformats.org/markup-compatibility/2006" xmlns:aink="http://schemas.microsoft.com/office/drawing/2016/ink" xmlns:am3d="http://schemas.microsoft.com/office/drawing/2017/model3d" xmlns:o="urn:schemas-microsoft-com:office:office" xmlns:oel="http://schemas.microsoft.com/office/2019/extlst" xmlns:r="http://schemas.openxmlformats.org/officeDocument/2006/relationships" xmlns:m="http://schemas.openxmlformats.org/officeDocument/2006/math" xmlns:v="urn:schemas-microsoft-com:vml" xmlns:wp14="http://schemas.microsoft.com/office/word/2010/wordprocessingDrawing" xmlns:wp="http://schemas.openxmlformats.org/drawingml/2006/wordprocessingDrawing" xmlns:w10="urn:schemas-microsoft-com:office:word" xmlns:w="http://schemas.openxmlformats.org/wordprocessingml/2006/main" xmlns:w14="http://schemas.microsoft.com/office/word/2010/wordml" xmlns:w15="http://schemas.microsoft.com/office/word/2012/wordml" xmlns:w16cex="http://schemas.microsoft.com/office/word/2018/wordml/cex" xmlns:w16cid="http://schemas.microsoft.com/office/word/2016/wordml/cid" xmlns:w16="http://schemas.microsoft.com/office/word/2018/wordml" xmlns:w16du="http://schemas.microsoft.com/office/word/2023/wordml/word16du" xmlns:w16sdtdh="http://schemas.microsoft.com/office/word/2020/wordml/sdtdatahash" xmlns:w16sdtfl="http://schemas.microsoft.com/office/word/2024/wordml/sdtformatlock" xmlns:w16se="http://schemas.microsoft.com/office/word/2015/wordml/symex" xmlns:wpg="http://schemas.microsoft.com/office/word/2010/wordprocessingGroup" xmlns:wpi="http://schemas.microsoft.com/office/word/2010/wordprocessingInk" xmlns:wne="http://schemas.microsoft.com/office/word/2006/wordml" xmlns:wps="http://schemas.microsoft.com/office/word/2010/wordprocessingShape" mc:Ignorable="w14 w15 w16se w16cid w16 w16cex w16sdtdh w16sdtfl w16du wp14">
+<w:endnotes xmlns:wpc="http://schemas.microsoft.com/office/word/2010/wordprocessingCanvas" xmlns:cx="http://schemas.microsoft.com/office/drawing/2014/chartex" xmlns:cx1="http://schemas.microsoft.com/office/drawing/2015/9/8/chartex" xmlns:cx2="http://schemas.microsoft.com/office/drawing/2015/10/21/chartex" xmlns:cx3="http://schemas.microsoft.com/office/drawing/2016/5/9/chartex" xmlns:cx4="http://schemas.microsoft.com/office/drawing/2016/5/10/chartex" xmlns:cx5="http://schemas.microsoft.com/office/drawing/2016/5/11/chartex" xmlns:cx6="http://schemas.microsoft.com/office/drawing/2016/5/12/chartex" xmlns:cx7="http://schemas.microsoft.com/office/drawing/2016/5/13/chartex" xmlns:cx8="http://schemas.microsoft.com/office/drawing/2016/5/14/chartex" xmlns:mc="http://schemas.openxmlformats.org/markup-compatibility/2006" xmlns:aink="http://schemas.microsoft.com/office/drawing/2016/ink" xmlns:am3d="http://schemas.microsoft.com/office/drawing/2017/model3d" xmlns:o="urn:schemas-microsoft-com:office:office" xmlns:oel="http://schemas.microsoft.com/office/2019/extlst" xmlns:r="http://schemas.openxmlformats.org/officeDocument/2006/relationships" xmlns:m="http://schemas.openxmlformats.org/officeDocument/2006/math" xmlns:v="urn:schemas-microsoft-com:vml" xmlns:wp14="http://schemas.microsoft.com/office/word/2010/wordprocessingDrawing" xmlns:wp="http://schemas.openxmlformats.org/drawingml/2006/wordprocessingDrawing" xmlns:w10="urn:schemas-microsoft-com:office:word" xmlns:w="http://schemas.openxmlformats.org/wordprocessingml/2006/main" xmlns:w14="http://schemas.microsoft.com/office/word/2010/wordml" xmlns:w15="http://schemas.microsoft.com/office/word/2012/wordml" xmlns:w16cex="http://schemas.microsoft.com/office/word/2018/wordml/cex" xmlns:w16cid="http://schemas.microsoft.com/office/word/2016/wordml/cid" xmlns:w16="http://schemas.microsoft.com/office/word/2018/wordml" xmlns:w16sdtdh="http://schemas.microsoft.com/office/word/2020/wordml/sdtdatahash" xmlns:w16se="http://schemas.microsoft.com/office/word/2015/wordml/symex" xmlns:wpg="http://schemas.microsoft.com/office/word/2010/wordprocessingGroup" xmlns:wpi="http://schemas.microsoft.com/office/word/2010/wordprocessingInk" xmlns:wne="http://schemas.microsoft.com/office/word/2006/wordml" xmlns:wps="http://schemas.microsoft.com/office/word/2010/wordprocessingShape" mc:Ignorable="w14 w15 w16se w16cid w16 w16cex w16sdtdh wp14">
   <w:endnote w:type="separator" w:id="-1">
     <w:p>
       <w:pPr>
@@ -20423,7 +23686,7 @@
 </file>
 
 <file path=word/footnotes.xml><?xml version="1.0" encoding="utf-8"?>
-<w:footnotes xmlns:wpc="http://schemas.microsoft.com/office/word/2010/wordprocessingCanvas" xmlns:cx="http://schemas.microsoft.com/office/drawing/2014/chartex" xmlns:cx1="http://schemas.microsoft.com/office/drawing/2015/9/8/chartex" xmlns:cx2="http://schemas.microsoft.com/office/drawing/2015/10/21/chartex" xmlns:cx3="http://schemas.microsoft.com/office/drawing/2016/5/9/chartex" xmlns:cx4="http://schemas.microsoft.com/office/drawing/2016/5/10/chartex" xmlns:cx5="http://schemas.microsoft.com/office/drawing/2016/5/11/chartex" xmlns:cx6="http://schemas.microsoft.com/office/drawing/2016/5/12/chartex" xmlns:cx7="http://schemas.microsoft.com/office/drawing/2016/5/13/chartex" xmlns:cx8="http://schemas.microsoft.com/office/drawing/2016/5/14/chartex" xmlns:mc="http://schemas.openxmlformats.org/markup-compatibility/2006" xmlns:aink="http://schemas.microsoft.com/office/drawing/2016/ink" xmlns:am3d="http://schemas.microsoft.com/office/drawing/2017/model3d" xmlns:o="urn:schemas-microsoft-com:office:office" xmlns:oel="http://schemas.microsoft.com/office/2019/extlst" xmlns:r="http://schemas.openxmlformats.org/officeDocument/2006/relationships" xmlns:m="http://schemas.openxmlformats.org/officeDocument/2006/math" xmlns:v="urn:schemas-microsoft-com:vml" xmlns:wp14="http://schemas.microsoft.com/office/word/2010/wordprocessingDrawing" xmlns:wp="http://schemas.openxmlformats.org/drawingml/2006/wordprocessingDrawing" xmlns:w10="urn:schemas-microsoft-com:office:word" xmlns:w="http://schemas.openxmlformats.org/wordprocessingml/2006/main" xmlns:w14="http://schemas.microsoft.com/office/word/2010/wordml" xmlns:w15="http://schemas.microsoft.com/office/word/2012/wordml" xmlns:w16cex="http://schemas.microsoft.com/office/word/2018/wordml/cex" xmlns:w16cid="http://schemas.microsoft.com/office/word/2016/wordml/cid" xmlns:w16="http://schemas.microsoft.com/office/word/2018/wordml" xmlns:w16du="http://schemas.microsoft.com/office/word/2023/wordml/word16du" xmlns:w16sdtdh="http://schemas.microsoft.com/office/word/2020/wordml/sdtdatahash" xmlns:w16sdtfl="http://schemas.microsoft.com/office/word/2024/wordml/sdtformatlock" xmlns:w16se="http://schemas.microsoft.com/office/word/2015/wordml/symex" xmlns:wpg="http://schemas.microsoft.com/office/word/2010/wordprocessingGroup" xmlns:wpi="http://schemas.microsoft.com/office/word/2010/wordprocessingInk" xmlns:wne="http://schemas.microsoft.com/office/word/2006/wordml" xmlns:wps="http://schemas.microsoft.com/office/word/2010/wordprocessingShape" mc:Ignorable="w14 w15 w16se w16cid w16 w16cex w16sdtdh w16sdtfl w16du wp14">
+<w:footnotes xmlns:wpc="http://schemas.microsoft.com/office/word/2010/wordprocessingCanvas" xmlns:cx="http://schemas.microsoft.com/office/drawing/2014/chartex" xmlns:cx1="http://schemas.microsoft.com/office/drawing/2015/9/8/chartex" xmlns:cx2="http://schemas.microsoft.com/office/drawing/2015/10/21/chartex" xmlns:cx3="http://schemas.microsoft.com/office/drawing/2016/5/9/chartex" xmlns:cx4="http://schemas.microsoft.com/office/drawing/2016/5/10/chartex" xmlns:cx5="http://schemas.microsoft.com/office/drawing/2016/5/11/chartex" xmlns:cx6="http://schemas.microsoft.com/office/drawing/2016/5/12/chartex" xmlns:cx7="http://schemas.microsoft.com/office/drawing/2016/5/13/chartex" xmlns:cx8="http://schemas.microsoft.com/office/drawing/2016/5/14/chartex" xmlns:mc="http://schemas.openxmlformats.org/markup-compatibility/2006" xmlns:aink="http://schemas.microsoft.com/office/drawing/2016/ink" xmlns:am3d="http://schemas.microsoft.com/office/drawing/2017/model3d" xmlns:o="urn:schemas-microsoft-com:office:office" xmlns:oel="http://schemas.microsoft.com/office/2019/extlst" xmlns:r="http://schemas.openxmlformats.org/officeDocument/2006/relationships" xmlns:m="http://schemas.openxmlformats.org/officeDocument/2006/math" xmlns:v="urn:schemas-microsoft-com:vml" xmlns:wp14="http://schemas.microsoft.com/office/word/2010/wordprocessingDrawing" xmlns:wp="http://schemas.openxmlformats.org/drawingml/2006/wordprocessingDrawing" xmlns:w10="urn:schemas-microsoft-com:office:word" xmlns:w="http://schemas.openxmlformats.org/wordprocessingml/2006/main" xmlns:w14="http://schemas.microsoft.com/office/word/2010/wordml" xmlns:w15="http://schemas.microsoft.com/office/word/2012/wordml" xmlns:w16cex="http://schemas.microsoft.com/office/word/2018/wordml/cex" xmlns:w16cid="http://schemas.microsoft.com/office/word/2016/wordml/cid" xmlns:w16="http://schemas.microsoft.com/office/word/2018/wordml" xmlns:w16sdtdh="http://schemas.microsoft.com/office/word/2020/wordml/sdtdatahash" xmlns:w16se="http://schemas.microsoft.com/office/word/2015/wordml/symex" xmlns:wpg="http://schemas.microsoft.com/office/word/2010/wordprocessingGroup" xmlns:wpi="http://schemas.microsoft.com/office/word/2010/wordprocessingInk" xmlns:wne="http://schemas.microsoft.com/office/word/2006/wordml" xmlns:wps="http://schemas.microsoft.com/office/word/2010/wordprocessingShape" mc:Ignorable="w14 w15 w16se w16cid w16 w16cex w16sdtdh wp14">
   <w:footnote w:type="separator" w:id="-1">
     <w:p>
       <w:pPr>
@@ -20448,7 +23711,7 @@
 </file>
 
 <file path=word/styles.xml><?xml version="1.0" encoding="utf-8"?>
-<w:styles xmlns:mc="http://schemas.openxmlformats.org/markup-compatibility/2006" xmlns:r="http://schemas.openxmlformats.org/officeDocument/2006/relationships" xmlns:w="http://schemas.openxmlformats.org/wordprocessingml/2006/main" xmlns:w14="http://schemas.microsoft.com/office/word/2010/wordml" xmlns:w15="http://schemas.microsoft.com/office/word/2012/wordml" xmlns:w16cex="http://schemas.microsoft.com/office/word/2018/wordml/cex" xmlns:w16cid="http://schemas.microsoft.com/office/word/2016/wordml/cid" xmlns:w16="http://schemas.microsoft.com/office/word/2018/wordml" xmlns:w16du="http://schemas.microsoft.com/office/word/2023/wordml/word16du" xmlns:w16sdtdh="http://schemas.microsoft.com/office/word/2020/wordml/sdtdatahash" xmlns:w16sdtfl="http://schemas.microsoft.com/office/word/2024/wordml/sdtformatlock" xmlns:w16se="http://schemas.microsoft.com/office/word/2015/wordml/symex" mc:Ignorable="w14 w15 w16se w16cid w16 w16cex w16sdtdh w16sdtfl w16du">
+<w:styles xmlns:mc="http://schemas.openxmlformats.org/markup-compatibility/2006" xmlns:r="http://schemas.openxmlformats.org/officeDocument/2006/relationships" xmlns:w="http://schemas.openxmlformats.org/wordprocessingml/2006/main" xmlns:w14="http://schemas.microsoft.com/office/word/2010/wordml" xmlns:w15="http://schemas.microsoft.com/office/word/2012/wordml" xmlns:w16cex="http://schemas.microsoft.com/office/word/2018/wordml/cex" xmlns:w16cid="http://schemas.microsoft.com/office/word/2016/wordml/cid" xmlns:w16="http://schemas.microsoft.com/office/word/2018/wordml" xmlns:w16sdtdh="http://schemas.microsoft.com/office/word/2020/wordml/sdtdatahash" xmlns:w16se="http://schemas.microsoft.com/office/word/2015/wordml/symex" mc:Ignorable="w14 w15 w16se w16cid w16 w16cex w16sdtdh">
   <w:docDefaults>
     <w:rPrDefault>
       <w:rPr>

</xml_diff>